<commit_message>
Docs: neutral-tone wording pass across lab manuals and env guides (drop colloquial/subjective phrasing); rebuild deliverable docx
</commit_message>
<xml_diff>
--- a/Reference/manual/数字电路实验参考手册.docx
+++ b/Reference/manual/数字电路实验参考手册.docx
@@ -3452,7 +3452,7 @@
           <w:i w:val="0"/>
           <w:sz w:val="21"/>
         </w:rPr>
-        <w:t>解读</w:t>
+        <w:t>结果分析</w:t>
       </w:r>
       <w:r>
         <w:rPr>
@@ -3461,7 +3461,7 @@
           <w:i w:val="0"/>
           <w:sz w:val="21"/>
         </w:rPr>
-        <w:t>（报告可直接展开）：</w:t>
+        <w:t>：</w:t>
       </w:r>
     </w:p>
     <w:p>
@@ -4127,7 +4127,7 @@
           <w:i w:val="0"/>
           <w:sz w:val="21"/>
         </w:rPr>
-        <w:t>实现 Sklansky 或 Brent–Kung，三方 PPA 对比（报告加分素材）</w:t>
+        <w:t>实现 Sklansky 或 Brent–Kung，与 Kogge–Stone 做三方 PPA 对比（可作为报告拓展内容）</w:t>
       </w:r>
     </w:p>
     <w:p>
@@ -4142,7 +4142,7 @@
           <w:i w:val="0"/>
           <w:sz w:val="21"/>
         </w:rPr>
-        <w:t>本 ADDER 将在实验二做 Wallace 树最终求和级、实验三做 PE 累加器——做扎实即为后续铺路</w:t>
+        <w:t>本 ADDER 将在实验二作为 Wallace 树最终求和级、在实验三作为 PE 累加器直接复用</w:t>
       </w:r>
     </w:p>
     <w:p>
@@ -5294,7 +5294,7 @@
           <w:i w:val="0"/>
           <w:sz w:val="21"/>
         </w:rPr>
-        <w:t>最易错的三点</w:t>
+        <w:t>实现要点与常见错误</w:t>
       </w:r>
       <w:r>
         <w:rPr>
@@ -5337,7 +5337,7 @@
           <w:i w:val="0"/>
           <w:sz w:val="21"/>
         </w:rPr>
-        <w:t xml:space="preserve"> 必须左移 1 位才有效（经典错误：忘记左移导致结果差一倍）</w:t>
+        <w:t xml:space="preserve"> 必须左移 1 位才有效（漏左移将导致结果错误）</w:t>
       </w:r>
     </w:p>
     <w:p>
@@ -10088,7 +10088,7 @@
                 <w:i w:val="0"/>
                 <w:sz w:val="19"/>
               </w:rPr>
-              <w:t>Y=X0 肉眼可核对，验证基本数据流</w:t>
+              <w:t>Y=X0 便于直接核对，验证基本数据流</w:t>
             </w:r>
           </w:p>
         </w:tc>
@@ -11059,7 +11059,7 @@
           <w:i w:val="0"/>
           <w:sz w:val="21"/>
         </w:rPr>
-        <w:t>3. 吞吐率：II=4、16 MAC/拍；换权重代价：load 清流水 + 重新灌注约 10 拍，能定量说明有效吞吐下降即为加分</w:t>
+        <w:t>3. 吞吐率：II=4、16 MAC/拍；换权重代价：load 清流水 + 重新灌注约 10 拍，宜定量说明对有效吞吐的影响</w:t>
       </w:r>
     </w:p>
     <w:p>
@@ -11837,7 +11837,7 @@
           <w:i w:val="0"/>
           <w:sz w:val="20"/>
         </w:rPr>
-        <w:t>建议学生独立完成设计后再比对；若接口约定与本手册 3.3 节不同但自洽，同样 acceptable。</w:t>
+        <w:t>建议学生独立完成设计后再比对；若接口约定与本手册 3.3 节不同但自洽，同样可接受。</w:t>
       </w:r>
     </w:p>
     <w:p>
@@ -14962,7 +14962,7 @@
           <w:i w:val="0"/>
           <w:sz w:val="18"/>
         </w:rPr>
-        <w:t xml:space="preserve">            x_out  &lt;= 8'd0;               // 同时清空流水（关键！）</w:t>
+        <w:t xml:space="preserve">            x_out  &lt;= 8'd0;               // 同时清空流水（必须）</w:t>
       </w:r>
     </w:p>
     <w:p>
@@ -16108,7 +16108,7 @@
           <w:i w:val="0"/>
           <w:sz w:val="20"/>
         </w:rPr>
-        <w:t>注：顶层完整代码（含 y_ij 在列底按 j 错拍抽取的细节）以参考实现仓库为准；附录给出全部关键机制，足以复现。</w:t>
+        <w:t>注：顶层完整代码（含 y_ij 在列底按 j 错拍抽取的细节）从略；顶层其余部分为常规例化连线，按上述机制与 3.4 节时序推导即可完整复现。</w:t>
       </w:r>
     </w:p>
     <w:p>

</xml_diff>

<commit_message>
Add expected-result baselines to all manuals: real tb outputs, lab1/lab2 waveform figures, synthesis excerpts; add course overview + env chapters to complete manual; document conda/ABC DLL conflict; rebuild docx
</commit_message>
<xml_diff>
--- a/Reference/manual/数字电路实验参考手册.docx
+++ b/Reference/manual/数字电路实验参考手册.docx
@@ -800,7 +800,779 @@
           <w:i w:val="0"/>
           <w:sz w:val="21"/>
         </w:rPr>
-        <w:t>通用工作流程（各实验相同）：</w:t>
+        <w:t>详细安装步骤与验证方法见</w:t>
+      </w:r>
+      <w:r>
+        <w:rPr>
+          <w:rFonts w:ascii="Times New Roman" w:hAnsi="Times New Roman" w:eastAsia="宋体"/>
+          <w:b/>
+          <w:i w:val="0"/>
+          <w:sz w:val="21"/>
+        </w:rPr>
+        <w:t>第二部分</w:t>
+      </w:r>
+      <w:r>
+        <w:rPr>
+          <w:rFonts w:ascii="Times New Roman" w:hAnsi="Times New Roman" w:eastAsia="宋体"/>
+          <w:b w:val="0"/>
+          <w:i w:val="0"/>
+          <w:sz w:val="21"/>
+        </w:rPr>
+        <w:t>；各实验的通用工作流程见</w:t>
+      </w:r>
+      <w:r>
+        <w:rPr>
+          <w:rFonts w:ascii="Times New Roman" w:hAnsi="Times New Roman" w:eastAsia="宋体"/>
+          <w:b/>
+          <w:i w:val="0"/>
+          <w:sz w:val="21"/>
+        </w:rPr>
+        <w:t>第一部分第 4 节</w:t>
+      </w:r>
+      <w:r>
+        <w:rPr>
+          <w:rFonts w:ascii="Times New Roman" w:hAnsi="Times New Roman" w:eastAsia="宋体"/>
+          <w:b w:val="0"/>
+          <w:i w:val="0"/>
+          <w:sz w:val="21"/>
+        </w:rPr>
+        <w:t>。</w:t>
+      </w:r>
+    </w:p>
+    <w:p>
+      <w:r>
+        <w:br w:type="page"/>
+      </w:r>
+    </w:p>
+    <w:p>
+      <w:pPr>
+        <w:pStyle w:val="Heading1"/>
+        <w:spacing w:before="120" w:after="360"/>
+        <w:jc w:val="center"/>
+      </w:pPr>
+      <w:r>
+        <w:rPr>
+          <w:rFonts w:ascii="Times New Roman" w:hAnsi="Times New Roman" w:eastAsia="黑体"/>
+          <w:b/>
+          <w:i w:val="0"/>
+          <w:color w:val="000000"/>
+          <w:sz w:val="32"/>
+        </w:rPr>
+        <w:t>第一部分 实验课程概述</w:t>
+      </w:r>
+    </w:p>
+    <w:p>
+      <w:pPr>
+        <w:pStyle w:val="Heading2"/>
+        <w:spacing w:before="280" w:after="120"/>
+      </w:pPr>
+      <w:r>
+        <w:rPr>
+          <w:rFonts w:ascii="Times New Roman" w:hAnsi="Times New Roman" w:eastAsia="黑体"/>
+          <w:b/>
+          <w:i w:val="0"/>
+          <w:color w:val="000000"/>
+          <w:sz w:val="28"/>
+        </w:rPr>
+        <w:t>1. 实验任务总览</w:t>
+      </w:r>
+    </w:p>
+    <w:tbl>
+      <w:tblPr>
+        <w:tblStyle w:val="TableGrid"/>
+        <w:tblW w:type="auto" w:w="0"/>
+        <w:jc w:val="center"/>
+        <w:tblLook w:firstColumn="1" w:firstRow="1" w:lastColumn="0" w:lastRow="0" w:noHBand="0" w:noVBand="1" w:val="04A0"/>
+      </w:tblPr>
+      <w:tblGrid>
+        <w:gridCol w:w="1662"/>
+        <w:gridCol w:w="1662"/>
+        <w:gridCol w:w="1662"/>
+        <w:gridCol w:w="1662"/>
+        <w:gridCol w:w="1662"/>
+      </w:tblGrid>
+      <w:tr>
+        <w:tc>
+          <w:tcPr>
+            <w:tcW w:type="dxa" w:w="1662"/>
+            <w:shd w:val="clear" w:fill="DCE6F1"/>
+          </w:tcPr>
+          <w:p>
+            <w:pPr>
+              <w:spacing w:before="20" w:after="20"/>
+            </w:pPr>
+            <w:r>
+              <w:rPr>
+                <w:b/>
+              </w:rPr>
+            </w:r>
+            <w:r>
+              <w:rPr>
+                <w:rFonts w:ascii="Times New Roman" w:hAnsi="Times New Roman" w:eastAsia="宋体"/>
+                <w:b/>
+                <w:i w:val="0"/>
+                <w:sz w:val="19"/>
+              </w:rPr>
+              <w:t>实验</w:t>
+            </w:r>
+          </w:p>
+        </w:tc>
+        <w:tc>
+          <w:tcPr>
+            <w:tcW w:type="dxa" w:w="1662"/>
+            <w:shd w:val="clear" w:fill="DCE6F1"/>
+          </w:tcPr>
+          <w:p>
+            <w:pPr>
+              <w:spacing w:before="20" w:after="20"/>
+            </w:pPr>
+            <w:r>
+              <w:rPr>
+                <w:b/>
+              </w:rPr>
+            </w:r>
+            <w:r>
+              <w:rPr>
+                <w:rFonts w:ascii="Times New Roman" w:hAnsi="Times New Roman" w:eastAsia="宋体"/>
+                <w:b/>
+                <w:i w:val="0"/>
+                <w:sz w:val="19"/>
+              </w:rPr>
+              <w:t>任务</w:t>
+            </w:r>
+          </w:p>
+        </w:tc>
+        <w:tc>
+          <w:tcPr>
+            <w:tcW w:type="dxa" w:w="1662"/>
+            <w:shd w:val="clear" w:fill="DCE6F1"/>
+          </w:tcPr>
+          <w:p>
+            <w:pPr>
+              <w:spacing w:before="20" w:after="20"/>
+            </w:pPr>
+            <w:r>
+              <w:rPr>
+                <w:b/>
+              </w:rPr>
+            </w:r>
+            <w:r>
+              <w:rPr>
+                <w:rFonts w:ascii="Times New Roman" w:hAnsi="Times New Roman" w:eastAsia="宋体"/>
+                <w:b/>
+                <w:i w:val="0"/>
+                <w:sz w:val="19"/>
+              </w:rPr>
+              <w:t>顶层模块</w:t>
+            </w:r>
+          </w:p>
+        </w:tc>
+        <w:tc>
+          <w:tcPr>
+            <w:tcW w:type="dxa" w:w="1662"/>
+            <w:shd w:val="clear" w:fill="DCE6F1"/>
+          </w:tcPr>
+          <w:p>
+            <w:pPr>
+              <w:spacing w:before="20" w:after="20"/>
+            </w:pPr>
+            <w:r>
+              <w:rPr>
+                <w:b/>
+              </w:rPr>
+            </w:r>
+            <w:r>
+              <w:rPr>
+                <w:rFonts w:ascii="Times New Roman" w:hAnsi="Times New Roman" w:eastAsia="宋体"/>
+                <w:b/>
+                <w:i w:val="0"/>
+                <w:sz w:val="19"/>
+              </w:rPr>
+              <w:t>接口</w:t>
+            </w:r>
+          </w:p>
+        </w:tc>
+        <w:tc>
+          <w:tcPr>
+            <w:tcW w:type="dxa" w:w="1662"/>
+            <w:shd w:val="clear" w:fill="DCE6F1"/>
+          </w:tcPr>
+          <w:p>
+            <w:pPr>
+              <w:spacing w:before="20" w:after="20"/>
+            </w:pPr>
+            <w:r>
+              <w:rPr>
+                <w:b/>
+              </w:rPr>
+            </w:r>
+            <w:r>
+              <w:rPr>
+                <w:rFonts w:ascii="Times New Roman" w:hAnsi="Times New Roman" w:eastAsia="宋体"/>
+                <w:b/>
+                <w:i w:val="0"/>
+                <w:sz w:val="19"/>
+              </w:rPr>
+              <w:t>交付物</w:t>
+            </w:r>
+          </w:p>
+        </w:tc>
+      </w:tr>
+      <w:tr>
+        <w:tc>
+          <w:tcPr>
+            <w:tcW w:type="dxa" w:w="1662"/>
+          </w:tcPr>
+          <w:p>
+            <w:pPr>
+              <w:spacing w:before="20" w:after="20"/>
+            </w:pPr>
+            <w:r/>
+            <w:r>
+              <w:rPr>
+                <w:rFonts w:ascii="Times New Roman" w:hAnsi="Times New Roman" w:eastAsia="宋体"/>
+                <w:b w:val="0"/>
+                <w:i w:val="0"/>
+                <w:sz w:val="19"/>
+              </w:rPr>
+              <w:t>实验一</w:t>
+            </w:r>
+          </w:p>
+        </w:tc>
+        <w:tc>
+          <w:tcPr>
+            <w:tcW w:type="dxa" w:w="1662"/>
+          </w:tcPr>
+          <w:p>
+            <w:pPr>
+              <w:spacing w:before="20" w:after="20"/>
+            </w:pPr>
+            <w:r/>
+            <w:r>
+              <w:rPr>
+                <w:rFonts w:ascii="Times New Roman" w:hAnsi="Times New Roman" w:eastAsia="宋体"/>
+                <w:b w:val="0"/>
+                <w:i w:val="0"/>
+                <w:sz w:val="19"/>
+              </w:rPr>
+              <w:t>19 位并行前缀进位加法器（组合逻辑）</w:t>
+            </w:r>
+          </w:p>
+        </w:tc>
+        <w:tc>
+          <w:tcPr>
+            <w:tcW w:type="dxa" w:w="1662"/>
+          </w:tcPr>
+          <w:p>
+            <w:pPr>
+              <w:spacing w:before="20" w:after="20"/>
+            </w:pPr>
+            <w:r/>
+            <w:r>
+              <w:rPr>
+                <w:rFonts w:ascii="Consolas" w:hAnsi="Consolas" w:eastAsia="宋体"/>
+                <w:b w:val="0"/>
+                <w:i w:val="0"/>
+                <w:color w:val="B03030"/>
+                <w:sz w:val="17"/>
+              </w:rPr>
+              <w:t>ADDER</w:t>
+            </w:r>
+          </w:p>
+        </w:tc>
+        <w:tc>
+          <w:tcPr>
+            <w:tcW w:type="dxa" w:w="1662"/>
+          </w:tcPr>
+          <w:p>
+            <w:pPr>
+              <w:spacing w:before="20" w:after="20"/>
+            </w:pPr>
+            <w:r/>
+            <w:r>
+              <w:rPr>
+                <w:rFonts w:ascii="Consolas" w:hAnsi="Consolas" w:eastAsia="宋体"/>
+                <w:b w:val="0"/>
+                <w:i w:val="0"/>
+                <w:color w:val="B03030"/>
+                <w:sz w:val="17"/>
+              </w:rPr>
+              <w:t>in1[18:0]</w:t>
+            </w:r>
+            <w:r>
+              <w:rPr>
+                <w:rFonts w:ascii="Times New Roman" w:hAnsi="Times New Roman" w:eastAsia="宋体"/>
+                <w:b w:val="0"/>
+                <w:i w:val="0"/>
+                <w:sz w:val="19"/>
+              </w:rPr>
+              <w:t>、</w:t>
+            </w:r>
+            <w:r>
+              <w:rPr>
+                <w:rFonts w:ascii="Consolas" w:hAnsi="Consolas" w:eastAsia="宋体"/>
+                <w:b w:val="0"/>
+                <w:i w:val="0"/>
+                <w:color w:val="B03030"/>
+                <w:sz w:val="17"/>
+              </w:rPr>
+              <w:t>in2[18:0]</w:t>
+            </w:r>
+            <w:r>
+              <w:rPr>
+                <w:rFonts w:ascii="Times New Roman" w:hAnsi="Times New Roman" w:eastAsia="宋体"/>
+                <w:b w:val="0"/>
+                <w:i w:val="0"/>
+                <w:sz w:val="19"/>
+              </w:rPr>
+              <w:t>、</w:t>
+            </w:r>
+            <w:r>
+              <w:rPr>
+                <w:rFonts w:ascii="Consolas" w:hAnsi="Consolas" w:eastAsia="宋体"/>
+                <w:b w:val="0"/>
+                <w:i w:val="0"/>
+                <w:color w:val="B03030"/>
+                <w:sz w:val="17"/>
+              </w:rPr>
+              <w:t>cin</w:t>
+            </w:r>
+            <w:r>
+              <w:rPr>
+                <w:rFonts w:ascii="Times New Roman" w:hAnsi="Times New Roman" w:eastAsia="宋体"/>
+                <w:b w:val="0"/>
+                <w:i w:val="0"/>
+                <w:sz w:val="19"/>
+              </w:rPr>
+              <w:t xml:space="preserve"> → </w:t>
+            </w:r>
+            <w:r>
+              <w:rPr>
+                <w:rFonts w:ascii="Consolas" w:hAnsi="Consolas" w:eastAsia="宋体"/>
+                <w:b w:val="0"/>
+                <w:i w:val="0"/>
+                <w:color w:val="B03030"/>
+                <w:sz w:val="17"/>
+              </w:rPr>
+              <w:t>sum[18:0]</w:t>
+            </w:r>
+            <w:r>
+              <w:rPr>
+                <w:rFonts w:ascii="Times New Roman" w:hAnsi="Times New Roman" w:eastAsia="宋体"/>
+                <w:b w:val="0"/>
+                <w:i w:val="0"/>
+                <w:sz w:val="19"/>
+              </w:rPr>
+              <w:t>、</w:t>
+            </w:r>
+            <w:r>
+              <w:rPr>
+                <w:rFonts w:ascii="Consolas" w:hAnsi="Consolas" w:eastAsia="宋体"/>
+                <w:b w:val="0"/>
+                <w:i w:val="0"/>
+                <w:color w:val="B03030"/>
+                <w:sz w:val="17"/>
+              </w:rPr>
+              <w:t>cout</w:t>
+            </w:r>
+          </w:p>
+        </w:tc>
+        <w:tc>
+          <w:tcPr>
+            <w:tcW w:type="dxa" w:w="1662"/>
+          </w:tcPr>
+          <w:p>
+            <w:pPr>
+              <w:spacing w:before="20" w:after="20"/>
+            </w:pPr>
+            <w:r/>
+            <w:r>
+              <w:rPr>
+                <w:rFonts w:ascii="Times New Roman" w:hAnsi="Times New Roman" w:eastAsia="宋体"/>
+                <w:b w:val="0"/>
+                <w:i w:val="0"/>
+                <w:sz w:val="19"/>
+              </w:rPr>
+              <w:t>设计代码 + 实验报告</w:t>
+            </w:r>
+          </w:p>
+        </w:tc>
+      </w:tr>
+      <w:tr>
+        <w:tc>
+          <w:tcPr>
+            <w:tcW w:type="dxa" w:w="1662"/>
+          </w:tcPr>
+          <w:p>
+            <w:pPr>
+              <w:spacing w:before="20" w:after="20"/>
+            </w:pPr>
+            <w:r/>
+            <w:r>
+              <w:rPr>
+                <w:rFonts w:ascii="Times New Roman" w:hAnsi="Times New Roman" w:eastAsia="宋体"/>
+                <w:b w:val="0"/>
+                <w:i w:val="0"/>
+                <w:sz w:val="19"/>
+              </w:rPr>
+              <w:t>实验二</w:t>
+            </w:r>
+          </w:p>
+        </w:tc>
+        <w:tc>
+          <w:tcPr>
+            <w:tcW w:type="dxa" w:w="1662"/>
+          </w:tcPr>
+          <w:p>
+            <w:pPr>
+              <w:spacing w:before="20" w:after="20"/>
+            </w:pPr>
+            <w:r/>
+            <w:r>
+              <w:rPr>
+                <w:rFonts w:ascii="Times New Roman" w:hAnsi="Times New Roman" w:eastAsia="宋体"/>
+                <w:b w:val="0"/>
+                <w:i w:val="0"/>
+                <w:sz w:val="19"/>
+              </w:rPr>
+              <w:t>8 位移位相加乘法器：部分积用 Wallace 树压缩、最终求和用实验一前缀加法器</w:t>
+            </w:r>
+          </w:p>
+        </w:tc>
+        <w:tc>
+          <w:tcPr>
+            <w:tcW w:type="dxa" w:w="1662"/>
+          </w:tcPr>
+          <w:p>
+            <w:pPr>
+              <w:spacing w:before="20" w:after="20"/>
+            </w:pPr>
+            <w:r/>
+            <w:r>
+              <w:rPr>
+                <w:rFonts w:ascii="Consolas" w:hAnsi="Consolas" w:eastAsia="宋体"/>
+                <w:b w:val="0"/>
+                <w:i w:val="0"/>
+                <w:color w:val="B03030"/>
+                <w:sz w:val="17"/>
+              </w:rPr>
+              <w:t>MULT</w:t>
+            </w:r>
+          </w:p>
+        </w:tc>
+        <w:tc>
+          <w:tcPr>
+            <w:tcW w:type="dxa" w:w="1662"/>
+          </w:tcPr>
+          <w:p>
+            <w:pPr>
+              <w:spacing w:before="20" w:after="20"/>
+            </w:pPr>
+            <w:r/>
+            <w:r>
+              <w:rPr>
+                <w:rFonts w:ascii="Consolas" w:hAnsi="Consolas" w:eastAsia="宋体"/>
+                <w:b w:val="0"/>
+                <w:i w:val="0"/>
+                <w:color w:val="B03030"/>
+                <w:sz w:val="17"/>
+              </w:rPr>
+              <w:t>in1[7:0]</w:t>
+            </w:r>
+            <w:r>
+              <w:rPr>
+                <w:rFonts w:ascii="Times New Roman" w:hAnsi="Times New Roman" w:eastAsia="宋体"/>
+                <w:b w:val="0"/>
+                <w:i w:val="0"/>
+                <w:sz w:val="19"/>
+              </w:rPr>
+              <w:t>、</w:t>
+            </w:r>
+            <w:r>
+              <w:rPr>
+                <w:rFonts w:ascii="Consolas" w:hAnsi="Consolas" w:eastAsia="宋体"/>
+                <w:b w:val="0"/>
+                <w:i w:val="0"/>
+                <w:color w:val="B03030"/>
+                <w:sz w:val="17"/>
+              </w:rPr>
+              <w:t>in2[7:0]</w:t>
+            </w:r>
+            <w:r>
+              <w:rPr>
+                <w:rFonts w:ascii="Times New Roman" w:hAnsi="Times New Roman" w:eastAsia="宋体"/>
+                <w:b w:val="0"/>
+                <w:i w:val="0"/>
+                <w:sz w:val="19"/>
+              </w:rPr>
+              <w:t xml:space="preserve"> → </w:t>
+            </w:r>
+            <w:r>
+              <w:rPr>
+                <w:rFonts w:ascii="Consolas" w:hAnsi="Consolas" w:eastAsia="宋体"/>
+                <w:b w:val="0"/>
+                <w:i w:val="0"/>
+                <w:color w:val="B03030"/>
+                <w:sz w:val="17"/>
+              </w:rPr>
+              <w:t>res[15:0]</w:t>
+            </w:r>
+          </w:p>
+        </w:tc>
+        <w:tc>
+          <w:tcPr>
+            <w:tcW w:type="dxa" w:w="1662"/>
+          </w:tcPr>
+          <w:p>
+            <w:pPr>
+              <w:spacing w:before="20" w:after="20"/>
+            </w:pPr>
+            <w:r/>
+            <w:r>
+              <w:rPr>
+                <w:rFonts w:ascii="Times New Roman" w:hAnsi="Times New Roman" w:eastAsia="宋体"/>
+                <w:b w:val="0"/>
+                <w:i w:val="0"/>
+                <w:sz w:val="19"/>
+              </w:rPr>
+              <w:t>设计代码 + 实验报告</w:t>
+            </w:r>
+          </w:p>
+        </w:tc>
+      </w:tr>
+      <w:tr>
+        <w:tc>
+          <w:tcPr>
+            <w:tcW w:type="dxa" w:w="1662"/>
+          </w:tcPr>
+          <w:p>
+            <w:pPr>
+              <w:spacing w:before="20" w:after="20"/>
+            </w:pPr>
+            <w:r/>
+            <w:r>
+              <w:rPr>
+                <w:rFonts w:ascii="Times New Roman" w:hAnsi="Times New Roman" w:eastAsia="宋体"/>
+                <w:b w:val="0"/>
+                <w:i w:val="0"/>
+                <w:sz w:val="19"/>
+              </w:rPr>
+              <w:t>实验三</w:t>
+            </w:r>
+          </w:p>
+        </w:tc>
+        <w:tc>
+          <w:tcPr>
+            <w:tcW w:type="dxa" w:w="1662"/>
+          </w:tcPr>
+          <w:p>
+            <w:pPr>
+              <w:spacing w:before="20" w:after="20"/>
+            </w:pPr>
+            <w:r/>
+            <w:r>
+              <w:rPr>
+                <w:rFonts w:ascii="Times New Roman" w:hAnsi="Times New Roman" w:eastAsia="宋体"/>
+                <w:b w:val="0"/>
+                <w:i w:val="0"/>
+                <w:sz w:val="19"/>
+              </w:rPr>
+              <w:t>4×4 固定权重全流水脉动阵列矩阵乘法器</w:t>
+            </w:r>
+          </w:p>
+        </w:tc>
+        <w:tc>
+          <w:tcPr>
+            <w:tcW w:type="dxa" w:w="1662"/>
+          </w:tcPr>
+          <w:p>
+            <w:pPr>
+              <w:spacing w:before="20" w:after="20"/>
+            </w:pPr>
+            <w:r/>
+            <w:r>
+              <w:rPr>
+                <w:rFonts w:ascii="Consolas" w:hAnsi="Consolas" w:eastAsia="宋体"/>
+                <w:b w:val="0"/>
+                <w:i w:val="0"/>
+                <w:color w:val="B03030"/>
+                <w:sz w:val="17"/>
+              </w:rPr>
+              <w:t>MULT</w:t>
+            </w:r>
+          </w:p>
+        </w:tc>
+        <w:tc>
+          <w:tcPr>
+            <w:tcW w:type="dxa" w:w="1662"/>
+          </w:tcPr>
+          <w:p>
+            <w:pPr>
+              <w:spacing w:before="20" w:after="20"/>
+            </w:pPr>
+            <w:r/>
+            <w:r>
+              <w:rPr>
+                <w:rFonts w:ascii="Consolas" w:hAnsi="Consolas" w:eastAsia="宋体"/>
+                <w:b w:val="0"/>
+                <w:i w:val="0"/>
+                <w:color w:val="B03030"/>
+                <w:sz w:val="17"/>
+              </w:rPr>
+              <w:t>clk</w:t>
+            </w:r>
+            <w:r>
+              <w:rPr>
+                <w:rFonts w:ascii="Times New Roman" w:hAnsi="Times New Roman" w:eastAsia="宋体"/>
+                <w:b w:val="0"/>
+                <w:i w:val="0"/>
+                <w:sz w:val="19"/>
+              </w:rPr>
+              <w:t>、</w:t>
+            </w:r>
+            <w:r>
+              <w:rPr>
+                <w:rFonts w:ascii="Consolas" w:hAnsi="Consolas" w:eastAsia="宋体"/>
+                <w:b w:val="0"/>
+                <w:i w:val="0"/>
+                <w:color w:val="B03030"/>
+                <w:sz w:val="17"/>
+              </w:rPr>
+              <w:t>rst_n</w:t>
+            </w:r>
+            <w:r>
+              <w:rPr>
+                <w:rFonts w:ascii="Times New Roman" w:hAnsi="Times New Roman" w:eastAsia="宋体"/>
+                <w:b w:val="0"/>
+                <w:i w:val="0"/>
+                <w:sz w:val="19"/>
+              </w:rPr>
+              <w:t>、</w:t>
+            </w:r>
+            <w:r>
+              <w:rPr>
+                <w:rFonts w:ascii="Consolas" w:hAnsi="Consolas" w:eastAsia="宋体"/>
+                <w:b w:val="0"/>
+                <w:i w:val="0"/>
+                <w:color w:val="B03030"/>
+                <w:sz w:val="17"/>
+              </w:rPr>
+              <w:t>load[3:0]</w:t>
+            </w:r>
+            <w:r>
+              <w:rPr>
+                <w:rFonts w:ascii="Times New Roman" w:hAnsi="Times New Roman" w:eastAsia="宋体"/>
+                <w:b w:val="0"/>
+                <w:i w:val="0"/>
+                <w:sz w:val="19"/>
+              </w:rPr>
+              <w:t>、</w:t>
+            </w:r>
+            <w:r>
+              <w:rPr>
+                <w:rFonts w:ascii="Consolas" w:hAnsi="Consolas" w:eastAsia="宋体"/>
+                <w:b w:val="0"/>
+                <w:i w:val="0"/>
+                <w:color w:val="B03030"/>
+                <w:sz w:val="17"/>
+              </w:rPr>
+              <w:t>input_data[7:0]</w:t>
+            </w:r>
+            <w:r>
+              <w:rPr>
+                <w:rFonts w:ascii="Times New Roman" w:hAnsi="Times New Roman" w:eastAsia="宋体"/>
+                <w:b w:val="0"/>
+                <w:i w:val="0"/>
+                <w:sz w:val="19"/>
+              </w:rPr>
+              <w:t xml:space="preserve"> → </w:t>
+            </w:r>
+            <w:r>
+              <w:rPr>
+                <w:rFonts w:ascii="Consolas" w:hAnsi="Consolas" w:eastAsia="宋体"/>
+                <w:b w:val="0"/>
+                <w:i w:val="0"/>
+                <w:color w:val="B03030"/>
+                <w:sz w:val="17"/>
+              </w:rPr>
+              <w:t>res[255:0]</w:t>
+            </w:r>
+          </w:p>
+        </w:tc>
+        <w:tc>
+          <w:tcPr>
+            <w:tcW w:type="dxa" w:w="1662"/>
+          </w:tcPr>
+          <w:p>
+            <w:pPr>
+              <w:spacing w:before="20" w:after="20"/>
+            </w:pPr>
+            <w:r/>
+            <w:r>
+              <w:rPr>
+                <w:rFonts w:ascii="Times New Roman" w:hAnsi="Times New Roman" w:eastAsia="宋体"/>
+                <w:b w:val="0"/>
+                <w:i w:val="0"/>
+                <w:sz w:val="19"/>
+              </w:rPr>
+              <w:t>设计代码 + 实验报告 + 现场演示</w:t>
+            </w:r>
+          </w:p>
+        </w:tc>
+      </w:tr>
+    </w:tbl>
+    <w:p>
+      <w:pPr>
+        <w:spacing w:after="0"/>
+      </w:pPr>
+    </w:p>
+    <w:p>
+      <w:pPr>
+        <w:pStyle w:val="Heading2"/>
+        <w:spacing w:before="280" w:after="120"/>
+      </w:pPr>
+      <w:r>
+        <w:rPr>
+          <w:rFonts w:ascii="Times New Roman" w:hAnsi="Times New Roman" w:eastAsia="黑体"/>
+          <w:b/>
+          <w:i w:val="0"/>
+          <w:color w:val="000000"/>
+          <w:sz w:val="28"/>
+        </w:rPr>
+        <w:t>2. 设计递进路径</w:t>
+      </w:r>
+    </w:p>
+    <w:p>
+      <w:pPr>
+        <w:spacing w:line="360" w:lineRule="auto" w:after="60"/>
+        <w:ind w:firstLine="420"/>
+      </w:pPr>
+      <w:r>
+        <w:rPr>
+          <w:rFonts w:ascii="Times New Roman" w:hAnsi="Times New Roman" w:eastAsia="宋体"/>
+          <w:b w:val="0"/>
+          <w:i w:val="0"/>
+          <w:sz w:val="21"/>
+        </w:rPr>
+        <w:t>三个实验构成一条完整的计算结构演进路线，</w:t>
+      </w:r>
+      <w:r>
+        <w:rPr>
+          <w:rFonts w:ascii="Times New Roman" w:hAnsi="Times New Roman" w:eastAsia="宋体"/>
+          <w:b/>
+          <w:i w:val="0"/>
+          <w:sz w:val="21"/>
+        </w:rPr>
+        <w:t>后序实验直接复用前序成果</w:t>
+      </w:r>
+      <w:r>
+        <w:rPr>
+          <w:rFonts w:ascii="Times New Roman" w:hAnsi="Times New Roman" w:eastAsia="宋体"/>
+          <w:b w:val="0"/>
+          <w:i w:val="0"/>
+          <w:sz w:val="21"/>
+        </w:rPr>
+        <w:t>：</w:t>
       </w:r>
     </w:p>
     <w:p>
@@ -816,7 +1588,7 @@
           <w:i w:val="0"/>
           <w:sz w:val="18"/>
         </w:rPr>
-        <w:t>iverilog -g2005 -o simv &lt;RTL文件...&gt; &lt;testbench文件&gt;   # 编译，-g2005 必须显式指定</w:t>
+        <w:t>实验一  ADDER（前缀加法器）──┐</w:t>
       </w:r>
     </w:p>
     <w:p>
@@ -832,7 +1604,7 @@
           <w:i w:val="0"/>
           <w:sz w:val="18"/>
         </w:rPr>
-        <w:t>vvp simv                                                # 仿真，终端输出 PASS/FAIL</w:t>
+        <w:t xml:space="preserve">                             ├──&gt; 实验二  MULT（Wallace 压缩 + 前缀加法求和）──┐</w:t>
       </w:r>
     </w:p>
     <w:p>
@@ -848,7 +1620,7 @@
           <w:i w:val="0"/>
           <w:sz w:val="18"/>
         </w:rPr>
-        <w:t>gtkwave wave.vcd                                        # 查看波形（testbench 需 $dumpfile/$dumpvars）</w:t>
+        <w:t>实验二  CSA（3:2 压缩）─────┘                                                ├──&gt; 实验三  4×4 脉动阵列（16 个 PE）</w:t>
       </w:r>
     </w:p>
     <w:p>
@@ -864,52 +1636,254 @@
           <w:i w:val="0"/>
           <w:sz w:val="18"/>
         </w:rPr>
-        <w:t>yosys synth.ys                                          # 综合，产出资源统计与最长路径报告</w:t>
-      </w:r>
-    </w:p>
-    <w:p>
-      <w:pPr>
-        <w:spacing w:before="80" w:after="80"/>
-        <w:ind w:left="425"/>
-        <w:pBdr>
-          <w:left w:val="single" w:sz="18" w:space="4" w:color="2E74B5"/>
-        </w:pBdr>
-      </w:pPr>
+        <w:t xml:space="preserve">                                                                              实验一 ADDER 复用为 PE 累加器</w:t>
+      </w:r>
+    </w:p>
+    <w:p>
+      <w:pPr>
+        <w:spacing w:line="360" w:lineRule="auto" w:after="60"/>
+        <w:ind w:firstLine="420"/>
+      </w:pPr>
+      <w:r>
+        <w:rPr>
+          <w:rFonts w:ascii="Times New Roman" w:hAnsi="Times New Roman" w:eastAsia="宋体"/>
+          <w:b w:val="0"/>
+          <w:i w:val="0"/>
+          <w:sz w:val="21"/>
+        </w:rPr>
+        <w:t>请在实验一中就把接口规范、验证习惯与工程目录结构建立好，后续实验将直接受益。</w:t>
+      </w:r>
+    </w:p>
+    <w:p>
+      <w:pPr>
+        <w:pStyle w:val="Heading2"/>
+        <w:spacing w:before="280" w:after="120"/>
+      </w:pPr>
+      <w:r>
+        <w:rPr>
+          <w:rFonts w:ascii="Times New Roman" w:hAnsi="Times New Roman" w:eastAsia="黑体"/>
+          <w:b/>
+          <w:i w:val="0"/>
+          <w:color w:val="000000"/>
+          <w:sz w:val="28"/>
+        </w:rPr>
+        <w:t>3. 评估与报告通用要求</w:t>
+      </w:r>
+    </w:p>
+    <w:p>
+      <w:pPr>
+        <w:pStyle w:val="ListBullet"/>
+        <w:spacing w:after="40"/>
+      </w:pPr>
+      <w:r>
+        <w:rPr>
+          <w:rFonts w:ascii="Times New Roman" w:hAnsi="Times New Roman" w:eastAsia="宋体"/>
+          <w:b w:val="0"/>
+          <w:i w:val="0"/>
+          <w:sz w:val="21"/>
+        </w:rPr>
+        <w:t>每个实验均需提交实验报告，内容覆盖：原理阐述、模块结构与关键代码、验证方法与结果、结果分析（含面积/关键路径对比表）、对课程手册提出问题的回答</w:t>
+      </w:r>
+    </w:p>
+    <w:p>
+      <w:pPr>
+        <w:pStyle w:val="ListBullet"/>
+        <w:spacing w:after="40"/>
+      </w:pPr>
+      <w:r>
+        <w:rPr>
+          <w:rFonts w:ascii="Times New Roman" w:hAnsi="Times New Roman" w:eastAsia="宋体"/>
+          <w:b w:val="0"/>
+          <w:i w:val="0"/>
+          <w:sz w:val="21"/>
+        </w:rPr>
+        <w:t>实验三另需</w:t>
+      </w:r>
       <w:r>
         <w:rPr>
           <w:rFonts w:ascii="Times New Roman" w:hAnsi="Times New Roman" w:eastAsia="宋体"/>
           <w:b/>
           <w:i w:val="0"/>
-          <w:sz w:val="20"/>
-        </w:rPr>
-        <w:t>GTKWave 提示</w:t>
+          <w:sz w:val="21"/>
+        </w:rPr>
+        <w:t>现场演示</w:t>
       </w:r>
       <w:r>
         <w:rPr>
           <w:rFonts w:ascii="Times New Roman" w:hAnsi="Times New Roman" w:eastAsia="宋体"/>
           <w:b w:val="0"/>
           <w:i w:val="0"/>
-          <w:sz w:val="20"/>
-        </w:rPr>
-        <w:t>：打开 vcd 后默认</w:t>
+          <w:sz w:val="21"/>
+        </w:rPr>
+        <w:t>（约 10 分钟讲解 + 回答约 5 个问题），评分依据：功能正确性、对数据流/时序的理解深度、表达清晰度</w:t>
+      </w:r>
+    </w:p>
+    <w:p>
+      <w:pPr>
+        <w:pStyle w:val="ListBullet"/>
+        <w:spacing w:after="40"/>
+      </w:pPr>
+      <w:r>
+        <w:rPr>
+          <w:rFonts w:ascii="Times New Roman" w:hAnsi="Times New Roman" w:eastAsia="宋体"/>
+          <w:b w:val="0"/>
+          <w:i w:val="0"/>
+          <w:sz w:val="21"/>
+        </w:rPr>
+        <w:t>报告中的仿真与综合数据必须来自本人实际运行，截图/文本需可复现；建议时间分配：实验一、二各约 1 周，实验三约 2 周</w:t>
+      </w:r>
+    </w:p>
+    <w:p>
+      <w:pPr>
+        <w:pStyle w:val="Heading2"/>
+        <w:spacing w:before="280" w:after="120"/>
+      </w:pPr>
+      <w:r>
+        <w:rPr>
+          <w:rFonts w:ascii="Times New Roman" w:hAnsi="Times New Roman" w:eastAsia="黑体"/>
+          <w:b/>
+          <w:i w:val="0"/>
+          <w:color w:val="000000"/>
+          <w:sz w:val="28"/>
+        </w:rPr>
+        <w:t>4. 通用工作流程</w:t>
+      </w:r>
+    </w:p>
+    <w:p>
+      <w:pPr>
+        <w:spacing w:line="360" w:lineRule="auto" w:after="60"/>
+        <w:ind w:firstLine="420"/>
+      </w:pPr>
+      <w:r>
+        <w:rPr>
+          <w:rFonts w:ascii="Times New Roman" w:hAnsi="Times New Roman" w:eastAsia="宋体"/>
+          <w:b w:val="0"/>
+          <w:i w:val="0"/>
+          <w:sz w:val="21"/>
+        </w:rPr>
+        <w:t>各实验的仿真与综合流程完全一致：</w:t>
+      </w:r>
+    </w:p>
+    <w:p>
+      <w:pPr>
+        <w:spacing w:before="120" w:after="0" w:line="240" w:lineRule="auto"/>
+        <w:ind w:left="227"/>
+        <w:shd w:val="clear" w:fill="F2F2F2"/>
+      </w:pPr>
+      <w:r>
+        <w:rPr>
+          <w:rFonts w:ascii="Consolas" w:hAnsi="Consolas" w:eastAsia="宋体"/>
+          <w:b w:val="0"/>
+          <w:i w:val="0"/>
+          <w:sz w:val="18"/>
+        </w:rPr>
+        <w:t>iverilog -g2005 -o simv &lt;RTL文件...&gt; &lt;testbench文件&gt;   # 编译，-g2005 必须显式指定</w:t>
+      </w:r>
+    </w:p>
+    <w:p>
+      <w:pPr>
+        <w:spacing w:before="0" w:after="0" w:line="240" w:lineRule="auto"/>
+        <w:ind w:left="227"/>
+        <w:shd w:val="clear" w:fill="F2F2F2"/>
+      </w:pPr>
+      <w:r>
+        <w:rPr>
+          <w:rFonts w:ascii="Consolas" w:hAnsi="Consolas" w:eastAsia="宋体"/>
+          <w:b w:val="0"/>
+          <w:i w:val="0"/>
+          <w:sz w:val="18"/>
+        </w:rPr>
+        <w:t>vvp simv                                                # 仿真，终端输出 PASS/FAIL</w:t>
+      </w:r>
+    </w:p>
+    <w:p>
+      <w:pPr>
+        <w:spacing w:before="0" w:after="0" w:line="240" w:lineRule="auto"/>
+        <w:ind w:left="227"/>
+        <w:shd w:val="clear" w:fill="F2F2F2"/>
+      </w:pPr>
+      <w:r>
+        <w:rPr>
+          <w:rFonts w:ascii="Consolas" w:hAnsi="Consolas" w:eastAsia="宋体"/>
+          <w:b w:val="0"/>
+          <w:i w:val="0"/>
+          <w:sz w:val="18"/>
+        </w:rPr>
+        <w:t>gtkwave wave.vcd                                        # 查看波形（testbench 需 $dumpfile/$dumpvars）</w:t>
+      </w:r>
+    </w:p>
+    <w:p>
+      <w:pPr>
+        <w:spacing w:before="0" w:after="120" w:line="240" w:lineRule="auto"/>
+        <w:ind w:left="227"/>
+        <w:shd w:val="clear" w:fill="F2F2F2"/>
+      </w:pPr>
+      <w:r>
+        <w:rPr>
+          <w:rFonts w:ascii="Consolas" w:hAnsi="Consolas" w:eastAsia="宋体"/>
+          <w:b w:val="0"/>
+          <w:i w:val="0"/>
+          <w:sz w:val="18"/>
+        </w:rPr>
+        <w:t>yosys synth.ys                                          # 综合，产出资源统计与最长路径报告</w:t>
+      </w:r>
+    </w:p>
+    <w:p>
+      <w:pPr>
+        <w:pStyle w:val="ListBullet"/>
+        <w:spacing w:after="40"/>
+      </w:pPr>
+      <w:r>
+        <w:rPr>
+          <w:rFonts w:ascii="Times New Roman" w:hAnsi="Times New Roman" w:eastAsia="宋体"/>
+          <w:b w:val="0"/>
+          <w:i w:val="0"/>
+          <w:sz w:val="21"/>
+        </w:rPr>
+        <w:t>编译成功</w:t>
       </w:r>
       <w:r>
         <w:rPr>
           <w:rFonts w:ascii="Times New Roman" w:hAnsi="Times New Roman" w:eastAsia="宋体"/>
           <w:b/>
           <w:i w:val="0"/>
-          <w:sz w:val="20"/>
-        </w:rPr>
-        <w:t>不加载任何信号</w:t>
+          <w:sz w:val="21"/>
+        </w:rPr>
+        <w:t>无任何输出</w:t>
       </w:r>
       <w:r>
         <w:rPr>
           <w:rFonts w:ascii="Times New Roman" w:hAnsi="Times New Roman" w:eastAsia="宋体"/>
           <w:b w:val="0"/>
           <w:i w:val="0"/>
-          <w:sz w:val="20"/>
-        </w:rPr>
-        <w:t>（空白为正常现象）。在左侧 SST 面板展开模块树，选中信号拖入波形区即可；建议选中总线后右键 Data Format → Decimal 按十进制查看。</w:t>
+          <w:sz w:val="21"/>
+        </w:rPr>
+        <w:t xml:space="preserve">，属正常现象；仿真成功的标志是终端打印 </w:t>
+      </w:r>
+      <w:r>
+        <w:rPr>
+          <w:rFonts w:ascii="Consolas" w:hAnsi="Consolas" w:eastAsia="宋体"/>
+          <w:b w:val="0"/>
+          <w:i w:val="0"/>
+          <w:color w:val="B03030"/>
+          <w:sz w:val="19"/>
+        </w:rPr>
+        <w:t>RESULT: PASS</w:t>
+      </w:r>
+    </w:p>
+    <w:p>
+      <w:pPr>
+        <w:pStyle w:val="ListBullet"/>
+        <w:spacing w:after="40"/>
+      </w:pPr>
+      <w:r>
+        <w:rPr>
+          <w:rFonts w:ascii="Times New Roman" w:hAnsi="Times New Roman" w:eastAsia="宋体"/>
+          <w:b w:val="0"/>
+          <w:i w:val="0"/>
+          <w:sz w:val="21"/>
+        </w:rPr>
+        <w:t>各实验的预期终端输出、预期波形与综合参考数据，见对应章节「预期结果对照」小节，请逐项核对</w:t>
       </w:r>
     </w:p>
     <w:p>
@@ -931,7 +1905,1588 @@
           <w:color w:val="000000"/>
           <w:sz w:val="32"/>
         </w:rPr>
-        <w:t>实验一 19 位并行前缀进位加法器</w:t>
+        <w:t>第二部分 实验环境配置与验证</w:t>
+      </w:r>
+    </w:p>
+    <w:p>
+      <w:pPr>
+        <w:pStyle w:val="Heading2"/>
+        <w:spacing w:before="280" w:after="120"/>
+      </w:pPr>
+      <w:r>
+        <w:rPr>
+          <w:rFonts w:ascii="Times New Roman" w:hAnsi="Times New Roman" w:eastAsia="黑体"/>
+          <w:b/>
+          <w:i w:val="0"/>
+          <w:color w:val="000000"/>
+          <w:sz w:val="28"/>
+        </w:rPr>
+        <w:t>1. 工具链与安装</w:t>
+      </w:r>
+    </w:p>
+    <w:p>
+      <w:pPr>
+        <w:spacing w:line="360" w:lineRule="auto" w:after="60"/>
+        <w:ind w:firstLine="420"/>
+      </w:pPr>
+      <w:r>
+        <w:rPr>
+          <w:rFonts w:ascii="Times New Roman" w:hAnsi="Times New Roman" w:eastAsia="宋体"/>
+          <w:b w:val="0"/>
+          <w:i w:val="0"/>
+          <w:sz w:val="21"/>
+        </w:rPr>
+        <w:t>VSCode + 开源 EDA 工具链可完整覆盖本课程三个实验的编码、仿真、波形、综合需求，无需 Quartus/Vivado。</w:t>
+      </w:r>
+    </w:p>
+    <w:p>
+      <w:pPr>
+        <w:spacing w:line="360" w:lineRule="auto" w:after="60"/>
+        <w:ind w:firstLine="420"/>
+      </w:pPr>
+      <w:r>
+        <w:rPr>
+          <w:rFonts w:ascii="Times New Roman" w:hAnsi="Times New Roman" w:eastAsia="宋体"/>
+          <w:b/>
+          <w:i w:val="0"/>
+          <w:sz w:val="21"/>
+        </w:rPr>
+        <w:t>Windows（推荐）</w:t>
+      </w:r>
+      <w:r>
+        <w:rPr>
+          <w:rFonts w:ascii="Times New Roman" w:hAnsi="Times New Roman" w:eastAsia="宋体"/>
+          <w:b w:val="0"/>
+          <w:i w:val="0"/>
+          <w:sz w:val="21"/>
+        </w:rPr>
+        <w:t xml:space="preserve">：下载 OSS CAD Suite（GitHub: </w:t>
+      </w:r>
+      <w:r>
+        <w:rPr>
+          <w:rFonts w:ascii="Consolas" w:hAnsi="Consolas" w:eastAsia="宋体"/>
+          <w:b w:val="0"/>
+          <w:i w:val="0"/>
+          <w:color w:val="B03030"/>
+          <w:sz w:val="19"/>
+        </w:rPr>
+        <w:t>YosysHQ/oss-cad-suite-build</w:t>
+      </w:r>
+      <w:r>
+        <w:rPr>
+          <w:rFonts w:ascii="Times New Roman" w:hAnsi="Times New Roman" w:eastAsia="宋体"/>
+          <w:b w:val="0"/>
+          <w:i w:val="0"/>
+          <w:sz w:val="21"/>
+        </w:rPr>
+        <w:t xml:space="preserve"> Releases，约 575 MB），解压到</w:t>
+      </w:r>
+      <w:r>
+        <w:rPr>
+          <w:rFonts w:ascii="Times New Roman" w:hAnsi="Times New Roman" w:eastAsia="宋体"/>
+          <w:b/>
+          <w:i w:val="0"/>
+          <w:sz w:val="21"/>
+        </w:rPr>
+        <w:t>纯英文无空格</w:t>
+      </w:r>
+      <w:r>
+        <w:rPr>
+          <w:rFonts w:ascii="Times New Roman" w:hAnsi="Times New Roman" w:eastAsia="宋体"/>
+          <w:b w:val="0"/>
+          <w:i w:val="0"/>
+          <w:sz w:val="21"/>
+        </w:rPr>
+        <w:t xml:space="preserve">路径（如 </w:t>
+      </w:r>
+      <w:r>
+        <w:rPr>
+          <w:rFonts w:ascii="Consolas" w:hAnsi="Consolas" w:eastAsia="宋体"/>
+          <w:b w:val="0"/>
+          <w:i w:val="0"/>
+          <w:color w:val="B03030"/>
+          <w:sz w:val="19"/>
+        </w:rPr>
+        <w:t>D:\Tools\oss-cad-suite</w:t>
+      </w:r>
+      <w:r>
+        <w:rPr>
+          <w:rFonts w:ascii="Times New Roman" w:hAnsi="Times New Roman" w:eastAsia="宋体"/>
+          <w:b w:val="0"/>
+          <w:i w:val="0"/>
+          <w:sz w:val="21"/>
+        </w:rPr>
+        <w:t xml:space="preserve">），将 </w:t>
+      </w:r>
+      <w:r>
+        <w:rPr>
+          <w:rFonts w:ascii="Consolas" w:hAnsi="Consolas" w:eastAsia="宋体"/>
+          <w:b w:val="0"/>
+          <w:i w:val="0"/>
+          <w:color w:val="B03030"/>
+          <w:sz w:val="19"/>
+        </w:rPr>
+        <w:t>bin</w:t>
+      </w:r>
+      <w:r>
+        <w:rPr>
+          <w:rFonts w:ascii="Times New Roman" w:hAnsi="Times New Roman" w:eastAsia="宋体"/>
+          <w:b w:val="0"/>
+          <w:i w:val="0"/>
+          <w:sz w:val="21"/>
+        </w:rPr>
+        <w:t xml:space="preserve"> 与 </w:t>
+      </w:r>
+      <w:r>
+        <w:rPr>
+          <w:rFonts w:ascii="Consolas" w:hAnsi="Consolas" w:eastAsia="宋体"/>
+          <w:b w:val="0"/>
+          <w:i w:val="0"/>
+          <w:color w:val="B03030"/>
+          <w:sz w:val="19"/>
+        </w:rPr>
+        <w:t>lib</w:t>
+      </w:r>
+      <w:r>
+        <w:rPr>
+          <w:rFonts w:ascii="Times New Roman" w:hAnsi="Times New Roman" w:eastAsia="宋体"/>
+          <w:b w:val="0"/>
+          <w:i w:val="0"/>
+          <w:sz w:val="21"/>
+        </w:rPr>
+        <w:t xml:space="preserve"> </w:t>
+      </w:r>
+      <w:r>
+        <w:rPr>
+          <w:rFonts w:ascii="Times New Roman" w:hAnsi="Times New Roman" w:eastAsia="宋体"/>
+          <w:b/>
+          <w:i w:val="0"/>
+          <w:sz w:val="21"/>
+        </w:rPr>
+        <w:t>两个目录都</w:t>
+      </w:r>
+      <w:r>
+        <w:rPr>
+          <w:rFonts w:ascii="Times New Roman" w:hAnsi="Times New Roman" w:eastAsia="宋体"/>
+          <w:b w:val="0"/>
+          <w:i w:val="0"/>
+          <w:sz w:val="21"/>
+        </w:rPr>
+        <w:t xml:space="preserve">加入用户环境变量 PATH（仅加 </w:t>
+      </w:r>
+      <w:r>
+        <w:rPr>
+          <w:rFonts w:ascii="Consolas" w:hAnsi="Consolas" w:eastAsia="宋体"/>
+          <w:b w:val="0"/>
+          <w:i w:val="0"/>
+          <w:color w:val="B03030"/>
+          <w:sz w:val="19"/>
+        </w:rPr>
+        <w:t>bin</w:t>
+      </w:r>
+      <w:r>
+        <w:rPr>
+          <w:rFonts w:ascii="Times New Roman" w:hAnsi="Times New Roman" w:eastAsia="宋体"/>
+          <w:b w:val="0"/>
+          <w:i w:val="0"/>
+          <w:sz w:val="21"/>
+        </w:rPr>
+        <w:t xml:space="preserve"> 会导致 GTKWave 缺 DLL 闪退，退出码 </w:t>
+      </w:r>
+      <w:r>
+        <w:rPr>
+          <w:rFonts w:ascii="Consolas" w:hAnsi="Consolas" w:eastAsia="宋体"/>
+          <w:b w:val="0"/>
+          <w:i w:val="0"/>
+          <w:color w:val="B03030"/>
+          <w:sz w:val="19"/>
+        </w:rPr>
+        <w:t>0xC0000135</w:t>
+      </w:r>
+      <w:r>
+        <w:rPr>
+          <w:rFonts w:ascii="Times New Roman" w:hAnsi="Times New Roman" w:eastAsia="宋体"/>
+          <w:b w:val="0"/>
+          <w:i w:val="0"/>
+          <w:sz w:val="21"/>
+        </w:rPr>
+        <w:t>），然后</w:t>
+      </w:r>
+      <w:r>
+        <w:rPr>
+          <w:rFonts w:ascii="Times New Roman" w:hAnsi="Times New Roman" w:eastAsia="宋体"/>
+          <w:b/>
+          <w:i w:val="0"/>
+          <w:sz w:val="21"/>
+        </w:rPr>
+        <w:t>关闭并重开终端</w:t>
+      </w:r>
+      <w:r>
+        <w:rPr>
+          <w:rFonts w:ascii="Times New Roman" w:hAnsi="Times New Roman" w:eastAsia="宋体"/>
+          <w:b w:val="0"/>
+          <w:i w:val="0"/>
+          <w:sz w:val="21"/>
+        </w:rPr>
+        <w:t>。</w:t>
+      </w:r>
+    </w:p>
+    <w:p>
+      <w:pPr>
+        <w:spacing w:line="360" w:lineRule="auto" w:after="60"/>
+        <w:ind w:firstLine="420"/>
+      </w:pPr>
+      <w:r>
+        <w:rPr>
+          <w:rFonts w:ascii="Times New Roman" w:hAnsi="Times New Roman" w:eastAsia="宋体"/>
+          <w:b/>
+          <w:i w:val="0"/>
+          <w:sz w:val="21"/>
+        </w:rPr>
+        <w:t>Linux（Debian/Ubuntu）</w:t>
+      </w:r>
+      <w:r>
+        <w:rPr>
+          <w:rFonts w:ascii="Times New Roman" w:hAnsi="Times New Roman" w:eastAsia="宋体"/>
+          <w:b w:val="0"/>
+          <w:i w:val="0"/>
+          <w:sz w:val="21"/>
+        </w:rPr>
+        <w:t>：</w:t>
+      </w:r>
+      <w:r>
+        <w:rPr>
+          <w:rFonts w:ascii="Consolas" w:hAnsi="Consolas" w:eastAsia="宋体"/>
+          <w:b w:val="0"/>
+          <w:i w:val="0"/>
+          <w:color w:val="B03030"/>
+          <w:sz w:val="19"/>
+        </w:rPr>
+        <w:t>sudo apt install iverilog gtkwave yosys -y</w:t>
+      </w:r>
+    </w:p>
+    <w:p>
+      <w:pPr>
+        <w:spacing w:line="360" w:lineRule="auto" w:after="60"/>
+        <w:ind w:firstLine="420"/>
+      </w:pPr>
+      <w:r>
+        <w:rPr>
+          <w:rFonts w:ascii="Times New Roman" w:hAnsi="Times New Roman" w:eastAsia="宋体"/>
+          <w:b/>
+          <w:i w:val="0"/>
+          <w:sz w:val="21"/>
+        </w:rPr>
+        <w:t>macOS</w:t>
+      </w:r>
+      <w:r>
+        <w:rPr>
+          <w:rFonts w:ascii="Times New Roman" w:hAnsi="Times New Roman" w:eastAsia="宋体"/>
+          <w:b w:val="0"/>
+          <w:i w:val="0"/>
+          <w:sz w:val="21"/>
+        </w:rPr>
+        <w:t>：</w:t>
+      </w:r>
+      <w:r>
+        <w:rPr>
+          <w:rFonts w:ascii="Consolas" w:hAnsi="Consolas" w:eastAsia="宋体"/>
+          <w:b w:val="0"/>
+          <w:i w:val="0"/>
+          <w:color w:val="B03030"/>
+          <w:sz w:val="19"/>
+        </w:rPr>
+        <w:t>brew install icarus-verilog gtkwave yosys</w:t>
+      </w:r>
+    </w:p>
+    <w:p>
+      <w:pPr>
+        <w:spacing w:line="360" w:lineRule="auto" w:after="60"/>
+        <w:ind w:firstLine="420"/>
+      </w:pPr>
+      <w:r>
+        <w:rPr>
+          <w:rFonts w:ascii="Times New Roman" w:hAnsi="Times New Roman" w:eastAsia="宋体"/>
+          <w:b/>
+          <w:i w:val="0"/>
+          <w:sz w:val="21"/>
+        </w:rPr>
+        <w:t>VSCode 插件（3 个）</w:t>
+      </w:r>
+      <w:r>
+        <w:rPr>
+          <w:rFonts w:ascii="Times New Roman" w:hAnsi="Times New Roman" w:eastAsia="宋体"/>
+          <w:b w:val="0"/>
+          <w:i w:val="0"/>
+          <w:sz w:val="21"/>
+        </w:rPr>
+        <w:t>：</w:t>
+      </w:r>
+    </w:p>
+    <w:p>
+      <w:pPr>
+        <w:spacing w:before="120" w:after="0" w:line="240" w:lineRule="auto"/>
+        <w:ind w:left="227"/>
+        <w:shd w:val="clear" w:fill="F2F2F2"/>
+      </w:pPr>
+      <w:r>
+        <w:rPr>
+          <w:rFonts w:ascii="Consolas" w:hAnsi="Consolas" w:eastAsia="宋体"/>
+          <w:b w:val="0"/>
+          <w:i w:val="0"/>
+          <w:sz w:val="18"/>
+        </w:rPr>
+        <w:t>code --install-extension mshr-h.VerilogHDL        # 语法高亮/lint</w:t>
+      </w:r>
+    </w:p>
+    <w:p>
+      <w:pPr>
+        <w:spacing w:before="0" w:after="0" w:line="240" w:lineRule="auto"/>
+        <w:ind w:left="227"/>
+        <w:shd w:val="clear" w:fill="F2F2F2"/>
+      </w:pPr>
+      <w:r>
+        <w:rPr>
+          <w:rFonts w:ascii="Consolas" w:hAnsi="Consolas" w:eastAsia="宋体"/>
+          <w:b w:val="0"/>
+          <w:i w:val="0"/>
+          <w:sz w:val="18"/>
+        </w:rPr>
+        <w:t>code --install-extension chipsalliance.verible    # 自动格式化</w:t>
+      </w:r>
+    </w:p>
+    <w:p>
+      <w:pPr>
+        <w:spacing w:before="0" w:after="120" w:line="240" w:lineRule="auto"/>
+        <w:ind w:left="227"/>
+        <w:shd w:val="clear" w:fill="F2F2F2"/>
+      </w:pPr>
+      <w:r>
+        <w:rPr>
+          <w:rFonts w:ascii="Consolas" w:hAnsi="Consolas" w:eastAsia="宋体"/>
+          <w:b w:val="0"/>
+          <w:i w:val="0"/>
+          <w:sz w:val="18"/>
+        </w:rPr>
+        <w:t>code --install-extension usernamehw.errorlens     # 行内错误显示</w:t>
+      </w:r>
+    </w:p>
+    <w:p>
+      <w:pPr>
+        <w:pStyle w:val="Heading2"/>
+        <w:spacing w:before="280" w:after="120"/>
+      </w:pPr>
+      <w:r>
+        <w:rPr>
+          <w:rFonts w:ascii="Times New Roman" w:hAnsi="Times New Roman" w:eastAsia="黑体"/>
+          <w:b/>
+          <w:i w:val="0"/>
+          <w:color w:val="000000"/>
+          <w:sz w:val="28"/>
+        </w:rPr>
+        <w:t>2. 安装验证（预期输出）</w:t>
+      </w:r>
+    </w:p>
+    <w:p>
+      <w:pPr>
+        <w:spacing w:line="360" w:lineRule="auto" w:after="60"/>
+        <w:ind w:firstLine="420"/>
+      </w:pPr>
+      <w:r>
+        <w:rPr>
+          <w:rFonts w:ascii="Times New Roman" w:hAnsi="Times New Roman" w:eastAsia="宋体"/>
+          <w:b w:val="0"/>
+          <w:i w:val="0"/>
+          <w:sz w:val="21"/>
+        </w:rPr>
+        <w:t>新开终端依次执行，</w:t>
+      </w:r>
+      <w:r>
+        <w:rPr>
+          <w:rFonts w:ascii="Times New Roman" w:hAnsi="Times New Roman" w:eastAsia="宋体"/>
+          <w:b/>
+          <w:i w:val="0"/>
+          <w:sz w:val="21"/>
+        </w:rPr>
+        <w:t>能打印出版本行即正常</w:t>
+      </w:r>
+      <w:r>
+        <w:rPr>
+          <w:rFonts w:ascii="Times New Roman" w:hAnsi="Times New Roman" w:eastAsia="宋体"/>
+          <w:b w:val="0"/>
+          <w:i w:val="0"/>
+          <w:sz w:val="21"/>
+        </w:rPr>
+        <w:t>（版本号随套件更新略有差异）：</w:t>
+      </w:r>
+    </w:p>
+    <w:p>
+      <w:pPr>
+        <w:spacing w:before="120" w:after="0" w:line="240" w:lineRule="auto"/>
+        <w:ind w:left="227"/>
+        <w:shd w:val="clear" w:fill="F2F2F2"/>
+      </w:pPr>
+      <w:r>
+        <w:rPr>
+          <w:rFonts w:ascii="Consolas" w:hAnsi="Consolas" w:eastAsia="宋体"/>
+          <w:b w:val="0"/>
+          <w:i w:val="0"/>
+          <w:sz w:val="18"/>
+        </w:rPr>
+        <w:t>$ iverilog -v</w:t>
+      </w:r>
+    </w:p>
+    <w:p>
+      <w:pPr>
+        <w:spacing w:before="0" w:after="0" w:line="240" w:lineRule="auto"/>
+        <w:ind w:left="227"/>
+        <w:shd w:val="clear" w:fill="F2F2F2"/>
+      </w:pPr>
+      <w:r>
+        <w:rPr>
+          <w:rFonts w:ascii="Consolas" w:hAnsi="Consolas" w:eastAsia="宋体"/>
+          <w:b w:val="0"/>
+          <w:i w:val="0"/>
+          <w:sz w:val="18"/>
+        </w:rPr>
+        <w:t>Icarus Verilog version 14.0 (devel) (s20260301-542-g04cc49350-dirty)</w:t>
+      </w:r>
+    </w:p>
+    <w:p>
+      <w:pPr>
+        <w:spacing w:before="0" w:after="0" w:line="240" w:lineRule="auto"/>
+        <w:ind w:left="227"/>
+        <w:shd w:val="clear" w:fill="F2F2F2"/>
+      </w:pPr>
+      <w:r>
+        <w:rPr>
+          <w:rFonts w:ascii="Consolas" w:hAnsi="Consolas" w:eastAsia="宋体"/>
+          <w:b w:val="0"/>
+          <w:i w:val="0"/>
+          <w:sz w:val="18"/>
+        </w:rPr>
+        <w:t>$ yosys -V</w:t>
+      </w:r>
+    </w:p>
+    <w:p>
+      <w:pPr>
+        <w:spacing w:before="0" w:after="120" w:line="240" w:lineRule="auto"/>
+        <w:ind w:left="227"/>
+        <w:shd w:val="clear" w:fill="F2F2F2"/>
+      </w:pPr>
+      <w:r>
+        <w:rPr>
+          <w:rFonts w:ascii="Consolas" w:hAnsi="Consolas" w:eastAsia="宋体"/>
+          <w:b w:val="0"/>
+          <w:i w:val="0"/>
+          <w:sz w:val="18"/>
+        </w:rPr>
+        <w:t>Yosys 0.69+274 (git sha1 7513f8df8 Release GNU /usr/bin/x86_64-w64-mingw32-g++ 15.2.1)</w:t>
+      </w:r>
+    </w:p>
+    <w:p>
+      <w:pPr>
+        <w:spacing w:line="360" w:lineRule="auto" w:after="60"/>
+        <w:ind w:firstLine="420"/>
+      </w:pPr>
+      <w:r>
+        <w:rPr>
+          <w:rFonts w:ascii="Times New Roman" w:hAnsi="Times New Roman" w:eastAsia="宋体"/>
+          <w:b w:val="0"/>
+          <w:i w:val="0"/>
+          <w:sz w:val="21"/>
+        </w:rPr>
+        <w:t>提示"不是内部或外部命令"→ PATH 未生效：检查环境变量写入、路径是否含中文/空格、是否重开终端。</w:t>
+      </w:r>
+    </w:p>
+    <w:p>
+      <w:pPr>
+        <w:pStyle w:val="Heading2"/>
+        <w:spacing w:before="280" w:after="120"/>
+      </w:pPr>
+      <w:r>
+        <w:rPr>
+          <w:rFonts w:ascii="Times New Roman" w:hAnsi="Times New Roman" w:eastAsia="黑体"/>
+          <w:b/>
+          <w:i w:val="0"/>
+          <w:color w:val="000000"/>
+          <w:sz w:val="28"/>
+        </w:rPr>
+        <w:t>3. 全链路自检（4 位加法器示例）</w:t>
+      </w:r>
+    </w:p>
+    <w:p>
+      <w:pPr>
+        <w:spacing w:line="360" w:lineRule="auto" w:after="60"/>
+        <w:ind w:firstLine="420"/>
+      </w:pPr>
+      <w:r>
+        <w:rPr>
+          <w:rFonts w:ascii="Times New Roman" w:hAnsi="Times New Roman" w:eastAsia="宋体"/>
+          <w:b w:val="0"/>
+          <w:i w:val="0"/>
+          <w:sz w:val="21"/>
+        </w:rPr>
+        <w:t xml:space="preserve">用最小例子验证「编译 → 仿真 → 波形 → 综合」全链路。新建 </w:t>
+      </w:r>
+      <w:r>
+        <w:rPr>
+          <w:rFonts w:ascii="Consolas" w:hAnsi="Consolas" w:eastAsia="宋体"/>
+          <w:b w:val="0"/>
+          <w:i w:val="0"/>
+          <w:color w:val="B03030"/>
+          <w:sz w:val="19"/>
+        </w:rPr>
+        <w:t>adder4.v</w:t>
+      </w:r>
+      <w:r>
+        <w:rPr>
+          <w:rFonts w:ascii="Times New Roman" w:hAnsi="Times New Roman" w:eastAsia="宋体"/>
+          <w:b w:val="0"/>
+          <w:i w:val="0"/>
+          <w:sz w:val="21"/>
+        </w:rPr>
+        <w:t xml:space="preserve">（4 位加法器）与 </w:t>
+      </w:r>
+      <w:r>
+        <w:rPr>
+          <w:rFonts w:ascii="Consolas" w:hAnsi="Consolas" w:eastAsia="宋体"/>
+          <w:b w:val="0"/>
+          <w:i w:val="0"/>
+          <w:color w:val="B03030"/>
+          <w:sz w:val="19"/>
+        </w:rPr>
+        <w:t>tb_adder4.v</w:t>
+      </w:r>
+      <w:r>
+        <w:rPr>
+          <w:rFonts w:ascii="Times New Roman" w:hAnsi="Times New Roman" w:eastAsia="宋体"/>
+          <w:b w:val="0"/>
+          <w:i w:val="0"/>
+          <w:sz w:val="21"/>
+        </w:rPr>
+        <w:t xml:space="preserve">（激励 + </w:t>
+      </w:r>
+      <w:r>
+        <w:rPr>
+          <w:rFonts w:ascii="Consolas" w:hAnsi="Consolas" w:eastAsia="宋体"/>
+          <w:b w:val="0"/>
+          <w:i w:val="0"/>
+          <w:color w:val="B03030"/>
+          <w:sz w:val="19"/>
+        </w:rPr>
+        <w:t>$dumpfile</w:t>
+      </w:r>
+      <w:r>
+        <w:rPr>
+          <w:rFonts w:ascii="Times New Roman" w:hAnsi="Times New Roman" w:eastAsia="宋体"/>
+          <w:b w:val="0"/>
+          <w:i w:val="0"/>
+          <w:sz w:val="21"/>
+        </w:rPr>
+        <w:t>），在工程目录执行：</w:t>
+      </w:r>
+    </w:p>
+    <w:p>
+      <w:pPr>
+        <w:spacing w:before="120" w:after="0" w:line="240" w:lineRule="auto"/>
+        <w:ind w:left="227"/>
+        <w:shd w:val="clear" w:fill="F2F2F2"/>
+      </w:pPr>
+      <w:r>
+        <w:rPr>
+          <w:rFonts w:ascii="Consolas" w:hAnsi="Consolas" w:eastAsia="宋体"/>
+          <w:b w:val="0"/>
+          <w:i w:val="0"/>
+          <w:sz w:val="18"/>
+        </w:rPr>
+        <w:t>iverilog -g2005 -o simv rtl/adder4.v tb/tb_adder4.v    # 第 1 步：编译</w:t>
+      </w:r>
+    </w:p>
+    <w:p>
+      <w:pPr>
+        <w:spacing w:before="0" w:after="0" w:line="240" w:lineRule="auto"/>
+        <w:ind w:left="227"/>
+        <w:shd w:val="clear" w:fill="F2F2F2"/>
+      </w:pPr>
+      <w:r>
+        <w:rPr>
+          <w:rFonts w:ascii="Consolas" w:hAnsi="Consolas" w:eastAsia="宋体"/>
+          <w:b w:val="0"/>
+          <w:i w:val="0"/>
+          <w:sz w:val="18"/>
+        </w:rPr>
+        <w:t>vvp simv                                                # 第 2 步：仿真</w:t>
+      </w:r>
+    </w:p>
+    <w:p>
+      <w:pPr>
+        <w:spacing w:before="0" w:after="0" w:line="240" w:lineRule="auto"/>
+        <w:ind w:left="227"/>
+        <w:shd w:val="clear" w:fill="F2F2F2"/>
+      </w:pPr>
+      <w:r>
+        <w:rPr>
+          <w:rFonts w:ascii="Consolas" w:hAnsi="Consolas" w:eastAsia="宋体"/>
+          <w:b w:val="0"/>
+          <w:i w:val="0"/>
+          <w:sz w:val="18"/>
+        </w:rPr>
+        <w:t>gtkwave wave.vcd                                        # 第 3 步：波形</w:t>
+      </w:r>
+    </w:p>
+    <w:p>
+      <w:pPr>
+        <w:spacing w:before="0" w:after="120" w:line="240" w:lineRule="auto"/>
+        <w:ind w:left="227"/>
+        <w:shd w:val="clear" w:fill="F2F2F2"/>
+      </w:pPr>
+      <w:r>
+        <w:rPr>
+          <w:rFonts w:ascii="Consolas" w:hAnsi="Consolas" w:eastAsia="宋体"/>
+          <w:b w:val="0"/>
+          <w:i w:val="0"/>
+          <w:sz w:val="18"/>
+        </w:rPr>
+        <w:t>yosys -p "read_verilog rtl/adder4.v; synth; stat"       # 第 4 步：综合</w:t>
+      </w:r>
+    </w:p>
+    <w:p>
+      <w:pPr>
+        <w:spacing w:line="360" w:lineRule="auto" w:after="60"/>
+        <w:ind w:firstLine="420"/>
+      </w:pPr>
+      <w:r>
+        <w:rPr>
+          <w:rFonts w:ascii="Times New Roman" w:hAnsi="Times New Roman" w:eastAsia="宋体"/>
+          <w:b/>
+          <w:i w:val="0"/>
+          <w:sz w:val="21"/>
+        </w:rPr>
+        <w:t>各步预期结果</w:t>
+      </w:r>
+      <w:r>
+        <w:rPr>
+          <w:rFonts w:ascii="Times New Roman" w:hAnsi="Times New Roman" w:eastAsia="宋体"/>
+          <w:b w:val="0"/>
+          <w:i w:val="0"/>
+          <w:sz w:val="21"/>
+        </w:rPr>
+        <w:t>：</w:t>
+      </w:r>
+    </w:p>
+    <w:p>
+      <w:pPr>
+        <w:pStyle w:val="ListBullet"/>
+        <w:spacing w:after="40"/>
+      </w:pPr>
+      <w:r>
+        <w:rPr>
+          <w:rFonts w:ascii="Times New Roman" w:hAnsi="Times New Roman" w:eastAsia="宋体"/>
+          <w:b w:val="0"/>
+          <w:i w:val="0"/>
+          <w:sz w:val="21"/>
+        </w:rPr>
+        <w:t>第 1 步：无任何输出（静默通过）</w:t>
+      </w:r>
+    </w:p>
+    <w:p>
+      <w:pPr>
+        <w:pStyle w:val="ListBullet"/>
+        <w:spacing w:after="40"/>
+      </w:pPr>
+      <w:r>
+        <w:rPr>
+          <w:rFonts w:ascii="Times New Roman" w:hAnsi="Times New Roman" w:eastAsia="宋体"/>
+          <w:b w:val="0"/>
+          <w:i w:val="0"/>
+          <w:sz w:val="21"/>
+        </w:rPr>
+        <w:t>第 2 步终端输出（逐字对照）：</w:t>
+      </w:r>
+    </w:p>
+    <w:p>
+      <w:pPr>
+        <w:spacing w:before="120" w:after="0" w:line="240" w:lineRule="auto"/>
+        <w:ind w:left="227"/>
+        <w:shd w:val="clear" w:fill="F2F2F2"/>
+      </w:pPr>
+      <w:r>
+        <w:rPr>
+          <w:rFonts w:ascii="Consolas" w:hAnsi="Consolas" w:eastAsia="宋体"/>
+          <w:b w:val="0"/>
+          <w:i w:val="0"/>
+          <w:sz w:val="18"/>
+        </w:rPr>
+        <w:t>VCD info: dumpfile wave.vcd opened for output.</w:t>
+      </w:r>
+    </w:p>
+    <w:p>
+      <w:pPr>
+        <w:spacing w:before="0" w:after="0" w:line="240" w:lineRule="auto"/>
+        <w:ind w:left="227"/>
+        <w:shd w:val="clear" w:fill="F2F2F2"/>
+      </w:pPr>
+      <w:r>
+        <w:rPr>
+          <w:rFonts w:ascii="Consolas" w:hAnsi="Consolas" w:eastAsia="宋体"/>
+          <w:b w:val="0"/>
+          <w:i w:val="0"/>
+          <w:sz w:val="18"/>
+        </w:rPr>
+        <w:t>Simulation finished check waveform.</w:t>
+      </w:r>
+    </w:p>
+    <w:p>
+      <w:pPr>
+        <w:spacing w:before="0" w:after="120" w:line="240" w:lineRule="auto"/>
+        <w:ind w:left="227"/>
+        <w:shd w:val="clear" w:fill="F2F2F2"/>
+      </w:pPr>
+      <w:r>
+        <w:rPr>
+          <w:rFonts w:ascii="Consolas" w:hAnsi="Consolas" w:eastAsia="宋体"/>
+          <w:b w:val="0"/>
+          <w:i w:val="0"/>
+          <w:sz w:val="18"/>
+        </w:rPr>
+        <w:t>tb/tb_adder4.v:37: $finish called at 40000 (1ps)</w:t>
+      </w:r>
+    </w:p>
+    <w:p>
+      <w:pPr>
+        <w:pStyle w:val="ListBullet"/>
+        <w:spacing w:after="40"/>
+      </w:pPr>
+      <w:r>
+        <w:rPr>
+          <w:rFonts w:ascii="Times New Roman" w:hAnsi="Times New Roman" w:eastAsia="宋体"/>
+          <w:b w:val="0"/>
+          <w:i w:val="0"/>
+          <w:sz w:val="21"/>
+        </w:rPr>
+        <w:t xml:space="preserve">第 3 步：弹出 GTKWave 窗口（标题栏含 </w:t>
+      </w:r>
+      <w:r>
+        <w:rPr>
+          <w:rFonts w:ascii="Consolas" w:hAnsi="Consolas" w:eastAsia="宋体"/>
+          <w:b w:val="0"/>
+          <w:i w:val="0"/>
+          <w:color w:val="B03030"/>
+          <w:sz w:val="19"/>
+        </w:rPr>
+        <w:t>wave.vcd</w:t>
+      </w:r>
+      <w:r>
+        <w:rPr>
+          <w:rFonts w:ascii="Times New Roman" w:hAnsi="Times New Roman" w:eastAsia="宋体"/>
+          <w:b w:val="0"/>
+          <w:i w:val="0"/>
+          <w:sz w:val="21"/>
+        </w:rPr>
+        <w:t>），左侧信号树可展开；波形数值应与 tb 激励一致（如 15+1=0 且 cout=1）</w:t>
+      </w:r>
+    </w:p>
+    <w:p>
+      <w:pPr>
+        <w:pStyle w:val="ListBullet"/>
+        <w:spacing w:after="40"/>
+      </w:pPr>
+      <w:r>
+        <w:rPr>
+          <w:rFonts w:ascii="Times New Roman" w:hAnsi="Times New Roman" w:eastAsia="宋体"/>
+          <w:b w:val="0"/>
+          <w:i w:val="0"/>
+          <w:sz w:val="21"/>
+        </w:rPr>
+        <w:t>第 4 步统计段输出（逐字对照）：</w:t>
+      </w:r>
+    </w:p>
+    <w:p>
+      <w:pPr>
+        <w:spacing w:before="120" w:after="0" w:line="240" w:lineRule="auto"/>
+        <w:ind w:left="227"/>
+        <w:shd w:val="clear" w:fill="F2F2F2"/>
+      </w:pPr>
+      <w:r>
+        <w:rPr>
+          <w:rFonts w:ascii="Consolas" w:hAnsi="Consolas" w:eastAsia="宋体"/>
+          <w:b w:val="0"/>
+          <w:i w:val="0"/>
+          <w:sz w:val="18"/>
+        </w:rPr>
+        <w:t>3. Printing statistics.</w:t>
+      </w:r>
+    </w:p>
+    <w:p>
+      <w:pPr>
+        <w:spacing w:before="0" w:after="0" w:line="240" w:lineRule="auto"/>
+        <w:ind w:left="227"/>
+        <w:shd w:val="clear" w:fill="F2F2F2"/>
+      </w:pPr>
+      <w:r>
+        <w:rPr>
+          <w:rFonts w:ascii="Consolas" w:hAnsi="Consolas" w:eastAsia="宋体"/>
+          <w:b w:val="0"/>
+          <w:i w:val="0"/>
+          <w:sz w:val="18"/>
+        </w:rPr>
+        <w:t>=== adder4 ===</w:t>
+      </w:r>
+    </w:p>
+    <w:p>
+      <w:pPr>
+        <w:spacing w:before="0" w:after="0" w:line="240" w:lineRule="auto"/>
+        <w:ind w:left="227"/>
+        <w:shd w:val="clear" w:fill="F2F2F2"/>
+      </w:pPr>
+      <w:r>
+        <w:rPr>
+          <w:rFonts w:ascii="Consolas" w:hAnsi="Consolas" w:eastAsia="宋体"/>
+          <w:b w:val="0"/>
+          <w:i w:val="0"/>
+          <w:sz w:val="18"/>
+        </w:rPr>
+        <w:t xml:space="preserve">       20 wires</w:t>
+      </w:r>
+    </w:p>
+    <w:p>
+      <w:pPr>
+        <w:spacing w:before="0" w:after="0" w:line="240" w:lineRule="auto"/>
+        <w:ind w:left="227"/>
+        <w:shd w:val="clear" w:fill="F2F2F2"/>
+      </w:pPr>
+      <w:r>
+        <w:rPr>
+          <w:rFonts w:ascii="Consolas" w:hAnsi="Consolas" w:eastAsia="宋体"/>
+          <w:b w:val="0"/>
+          <w:i w:val="0"/>
+          <w:sz w:val="18"/>
+        </w:rPr>
+        <w:t xml:space="preserve">       20 cells</w:t>
+      </w:r>
+    </w:p>
+    <w:p>
+      <w:pPr>
+        <w:spacing w:before="0" w:after="0" w:line="240" w:lineRule="auto"/>
+        <w:ind w:left="227"/>
+        <w:shd w:val="clear" w:fill="F2F2F2"/>
+      </w:pPr>
+      <w:r>
+        <w:rPr>
+          <w:rFonts w:ascii="Consolas" w:hAnsi="Consolas" w:eastAsia="宋体"/>
+          <w:b w:val="0"/>
+          <w:i w:val="0"/>
+          <w:sz w:val="18"/>
+        </w:rPr>
+        <w:t xml:space="preserve">       12   $_NAND_</w:t>
+      </w:r>
+    </w:p>
+    <w:p>
+      <w:pPr>
+        <w:spacing w:before="0" w:after="120" w:line="240" w:lineRule="auto"/>
+        <w:ind w:left="227"/>
+        <w:shd w:val="clear" w:fill="F2F2F2"/>
+      </w:pPr>
+      <w:r>
+        <w:rPr>
+          <w:rFonts w:ascii="Consolas" w:hAnsi="Consolas" w:eastAsia="宋体"/>
+          <w:b w:val="0"/>
+          <w:i w:val="0"/>
+          <w:sz w:val="18"/>
+        </w:rPr>
+        <w:t xml:space="preserve">        8   $_XOR_</w:t>
+      </w:r>
+    </w:p>
+    <w:p>
+      <w:pPr>
+        <w:spacing w:line="360" w:lineRule="auto" w:after="60"/>
+        <w:ind w:firstLine="420"/>
+      </w:pPr>
+      <w:r>
+        <w:rPr>
+          <w:rFonts w:ascii="Times New Roman" w:hAnsi="Times New Roman" w:eastAsia="宋体"/>
+          <w:b w:val="0"/>
+          <w:i w:val="0"/>
+          <w:sz w:val="21"/>
+        </w:rPr>
+        <w:t>四步全部通过即环境完全可用。</w:t>
+      </w:r>
+    </w:p>
+    <w:p>
+      <w:pPr>
+        <w:pStyle w:val="Heading2"/>
+        <w:spacing w:before="280" w:after="120"/>
+      </w:pPr>
+      <w:r>
+        <w:rPr>
+          <w:rFonts w:ascii="Times New Roman" w:hAnsi="Times New Roman" w:eastAsia="黑体"/>
+          <w:b/>
+          <w:i w:val="0"/>
+          <w:color w:val="000000"/>
+          <w:sz w:val="28"/>
+        </w:rPr>
+        <w:t>4. GTKWave 使用要点</w:t>
+      </w:r>
+    </w:p>
+    <w:p>
+      <w:pPr>
+        <w:pStyle w:val="ListBullet"/>
+        <w:spacing w:after="40"/>
+      </w:pPr>
+      <w:r>
+        <w:rPr>
+          <w:rFonts w:ascii="Times New Roman" w:hAnsi="Times New Roman" w:eastAsia="宋体"/>
+          <w:b w:val="0"/>
+          <w:i w:val="0"/>
+          <w:sz w:val="21"/>
+        </w:rPr>
+        <w:t>打开 vcd 后</w:t>
+      </w:r>
+      <w:r>
+        <w:rPr>
+          <w:rFonts w:ascii="Times New Roman" w:hAnsi="Times New Roman" w:eastAsia="宋体"/>
+          <w:b/>
+          <w:i w:val="0"/>
+          <w:sz w:val="21"/>
+        </w:rPr>
+        <w:t>默认不加载任何信号</w:t>
+      </w:r>
+      <w:r>
+        <w:rPr>
+          <w:rFonts w:ascii="Times New Roman" w:hAnsi="Times New Roman" w:eastAsia="宋体"/>
+          <w:b w:val="0"/>
+          <w:i w:val="0"/>
+          <w:sz w:val="21"/>
+        </w:rPr>
+        <w:t xml:space="preserve">（空白属正常）：左侧 SST 面板展开模块树，选中信号拖入波形区（或点 Insert）；可用 </w:t>
+      </w:r>
+      <w:r>
+        <w:rPr>
+          <w:rFonts w:ascii="Times New Roman" w:hAnsi="Times New Roman" w:eastAsia="宋体"/>
+          <w:b/>
+          <w:i w:val="0"/>
+          <w:sz w:val="21"/>
+        </w:rPr>
+        <w:t>File → Write/Read Save File</w:t>
+      </w:r>
+      <w:r>
+        <w:rPr>
+          <w:rFonts w:ascii="Times New Roman" w:hAnsi="Times New Roman" w:eastAsia="宋体"/>
+          <w:b w:val="0"/>
+          <w:i w:val="0"/>
+          <w:sz w:val="21"/>
+        </w:rPr>
+        <w:t xml:space="preserve"> 保存与恢复视图</w:t>
+      </w:r>
+    </w:p>
+    <w:p>
+      <w:pPr>
+        <w:pStyle w:val="ListBullet"/>
+        <w:spacing w:after="40"/>
+      </w:pPr>
+      <w:r>
+        <w:rPr>
+          <w:rFonts w:ascii="Times New Roman" w:hAnsi="Times New Roman" w:eastAsia="宋体"/>
+          <w:b w:val="0"/>
+          <w:i w:val="0"/>
+          <w:sz w:val="21"/>
+        </w:rPr>
+        <w:t>常用操作：</w:t>
+      </w:r>
+      <w:r>
+        <w:rPr>
+          <w:rFonts w:ascii="Consolas" w:hAnsi="Consolas" w:eastAsia="宋体"/>
+          <w:b w:val="0"/>
+          <w:i w:val="0"/>
+          <w:color w:val="B03030"/>
+          <w:sz w:val="19"/>
+        </w:rPr>
+        <w:t>Zoom Fit</w:t>
+      </w:r>
+      <w:r>
+        <w:rPr>
+          <w:rFonts w:ascii="Times New Roman" w:hAnsi="Times New Roman" w:eastAsia="宋体"/>
+          <w:b w:val="0"/>
+          <w:i w:val="0"/>
+          <w:sz w:val="21"/>
+        </w:rPr>
+        <w:t xml:space="preserve">（快捷键 F）看全程；总线右键 </w:t>
+      </w:r>
+      <w:r>
+        <w:rPr>
+          <w:rFonts w:ascii="Times New Roman" w:hAnsi="Times New Roman" w:eastAsia="宋体"/>
+          <w:b/>
+          <w:i w:val="0"/>
+          <w:sz w:val="21"/>
+        </w:rPr>
+        <w:t>Data Format → Decimal</w:t>
+      </w:r>
+      <w:r>
+        <w:rPr>
+          <w:rFonts w:ascii="Times New Roman" w:hAnsi="Times New Roman" w:eastAsia="宋体"/>
+          <w:b w:val="0"/>
+          <w:i w:val="0"/>
+          <w:sz w:val="21"/>
+        </w:rPr>
+        <w:t xml:space="preserve"> 改十进制；左键/中键放标记测时间差</w:t>
+      </w:r>
+    </w:p>
+    <w:p>
+      <w:pPr>
+        <w:pStyle w:val="ListBullet"/>
+        <w:spacing w:after="40"/>
+      </w:pPr>
+      <w:r>
+        <w:rPr>
+          <w:rFonts w:ascii="Times New Roman" w:hAnsi="Times New Roman" w:eastAsia="宋体"/>
+          <w:b w:val="0"/>
+          <w:i w:val="0"/>
+          <w:sz w:val="21"/>
+        </w:rPr>
+        <w:t xml:space="preserve">启动时终端打印 </w:t>
+      </w:r>
+      <w:r>
+        <w:rPr>
+          <w:rFonts w:ascii="Consolas" w:hAnsi="Consolas" w:eastAsia="宋体"/>
+          <w:b w:val="0"/>
+          <w:i w:val="0"/>
+          <w:color w:val="B03030"/>
+          <w:sz w:val="19"/>
+        </w:rPr>
+        <w:t>GLib-GIO-WARNING: win32 session dbus binary not found</w:t>
+      </w:r>
+      <w:r>
+        <w:rPr>
+          <w:rFonts w:ascii="Times New Roman" w:hAnsi="Times New Roman" w:eastAsia="宋体"/>
+          <w:b w:val="0"/>
+          <w:i w:val="0"/>
+          <w:sz w:val="21"/>
+        </w:rPr>
+        <w:t xml:space="preserve"> 属无害警告</w:t>
+      </w:r>
+    </w:p>
+    <w:p>
+      <w:pPr>
+        <w:pStyle w:val="Heading2"/>
+        <w:spacing w:before="280" w:after="120"/>
+      </w:pPr>
+      <w:r>
+        <w:rPr>
+          <w:rFonts w:ascii="Times New Roman" w:hAnsi="Times New Roman" w:eastAsia="黑体"/>
+          <w:b/>
+          <w:i w:val="0"/>
+          <w:color w:val="000000"/>
+          <w:sz w:val="28"/>
+        </w:rPr>
+        <w:t>5. 环境常见问题（高发）</w:t>
+      </w:r>
+    </w:p>
+    <w:tbl>
+      <w:tblPr>
+        <w:tblStyle w:val="TableGrid"/>
+        <w:tblW w:type="auto" w:w="0"/>
+        <w:jc w:val="center"/>
+        <w:tblLook w:firstColumn="1" w:firstRow="1" w:lastColumn="0" w:lastRow="0" w:noHBand="0" w:noVBand="1" w:val="04A0"/>
+      </w:tblPr>
+      <w:tblGrid>
+        <w:gridCol w:w="4156"/>
+        <w:gridCol w:w="4156"/>
+      </w:tblGrid>
+      <w:tr>
+        <w:tc>
+          <w:tcPr>
+            <w:tcW w:type="dxa" w:w="4156"/>
+            <w:shd w:val="clear" w:fill="DCE6F1"/>
+          </w:tcPr>
+          <w:p>
+            <w:pPr>
+              <w:spacing w:before="20" w:after="20"/>
+            </w:pPr>
+            <w:r>
+              <w:rPr>
+                <w:b/>
+              </w:rPr>
+            </w:r>
+            <w:r>
+              <w:rPr>
+                <w:rFonts w:ascii="Times New Roman" w:hAnsi="Times New Roman" w:eastAsia="宋体"/>
+                <w:b/>
+                <w:i w:val="0"/>
+                <w:sz w:val="19"/>
+              </w:rPr>
+              <w:t>现象</w:t>
+            </w:r>
+          </w:p>
+        </w:tc>
+        <w:tc>
+          <w:tcPr>
+            <w:tcW w:type="dxa" w:w="4156"/>
+            <w:shd w:val="clear" w:fill="DCE6F1"/>
+          </w:tcPr>
+          <w:p>
+            <w:pPr>
+              <w:spacing w:before="20" w:after="20"/>
+            </w:pPr>
+            <w:r>
+              <w:rPr>
+                <w:b/>
+              </w:rPr>
+            </w:r>
+            <w:r>
+              <w:rPr>
+                <w:rFonts w:ascii="Times New Roman" w:hAnsi="Times New Roman" w:eastAsia="宋体"/>
+                <w:b/>
+                <w:i w:val="0"/>
+                <w:sz w:val="19"/>
+              </w:rPr>
+              <w:t>原因与解决</w:t>
+            </w:r>
+          </w:p>
+        </w:tc>
+      </w:tr>
+      <w:tr>
+        <w:tc>
+          <w:tcPr>
+            <w:tcW w:type="dxa" w:w="4156"/>
+          </w:tcPr>
+          <w:p>
+            <w:pPr>
+              <w:spacing w:before="20" w:after="20"/>
+            </w:pPr>
+            <w:r/>
+            <w:r>
+              <w:rPr>
+                <w:rFonts w:ascii="Times New Roman" w:hAnsi="Times New Roman" w:eastAsia="宋体"/>
+                <w:b w:val="0"/>
+                <w:i w:val="0"/>
+                <w:sz w:val="19"/>
+              </w:rPr>
+              <w:t>GTKWave 启动闪退（0xC0000135）</w:t>
+            </w:r>
+          </w:p>
+        </w:tc>
+        <w:tc>
+          <w:tcPr>
+            <w:tcW w:type="dxa" w:w="4156"/>
+          </w:tcPr>
+          <w:p>
+            <w:pPr>
+              <w:spacing w:before="20" w:after="20"/>
+            </w:pPr>
+            <w:r/>
+            <w:r>
+              <w:rPr>
+                <w:rFonts w:ascii="Times New Roman" w:hAnsi="Times New Roman" w:eastAsia="宋体"/>
+                <w:b w:val="0"/>
+                <w:i w:val="0"/>
+                <w:sz w:val="19"/>
+              </w:rPr>
+              <w:t xml:space="preserve">PATH 只加了 </w:t>
+            </w:r>
+            <w:r>
+              <w:rPr>
+                <w:rFonts w:ascii="Consolas" w:hAnsi="Consolas" w:eastAsia="宋体"/>
+                <w:b w:val="0"/>
+                <w:i w:val="0"/>
+                <w:color w:val="B03030"/>
+                <w:sz w:val="17"/>
+              </w:rPr>
+              <w:t>bin</w:t>
+            </w:r>
+            <w:r>
+              <w:rPr>
+                <w:rFonts w:ascii="Times New Roman" w:hAnsi="Times New Roman" w:eastAsia="宋体"/>
+                <w:b w:val="0"/>
+                <w:i w:val="0"/>
+                <w:sz w:val="19"/>
+              </w:rPr>
+              <w:t xml:space="preserve"> 缺 </w:t>
+            </w:r>
+            <w:r>
+              <w:rPr>
+                <w:rFonts w:ascii="Consolas" w:hAnsi="Consolas" w:eastAsia="宋体"/>
+                <w:b w:val="0"/>
+                <w:i w:val="0"/>
+                <w:color w:val="B03030"/>
+                <w:sz w:val="17"/>
+              </w:rPr>
+              <w:t>lib</w:t>
+            </w:r>
+            <w:r>
+              <w:rPr>
+                <w:rFonts w:ascii="Times New Roman" w:hAnsi="Times New Roman" w:eastAsia="宋体"/>
+                <w:b w:val="0"/>
+                <w:i w:val="0"/>
+                <w:sz w:val="19"/>
+              </w:rPr>
+              <w:t>，两个都加并重开终端</w:t>
+            </w:r>
+          </w:p>
+        </w:tc>
+      </w:tr>
+      <w:tr>
+        <w:tc>
+          <w:tcPr>
+            <w:tcW w:type="dxa" w:w="4156"/>
+          </w:tcPr>
+          <w:p>
+            <w:pPr>
+              <w:spacing w:before="20" w:after="20"/>
+            </w:pPr>
+            <w:r/>
+            <w:r>
+              <w:rPr>
+                <w:rFonts w:ascii="Times New Roman" w:hAnsi="Times New Roman" w:eastAsia="宋体"/>
+                <w:b w:val="0"/>
+                <w:i w:val="0"/>
+                <w:sz w:val="19"/>
+              </w:rPr>
+              <w:t xml:space="preserve">Yosys ABC 阶段报 </w:t>
+            </w:r>
+            <w:r>
+              <w:rPr>
+                <w:rFonts w:ascii="Consolas" w:hAnsi="Consolas" w:eastAsia="宋体"/>
+                <w:b w:val="0"/>
+                <w:i w:val="0"/>
+                <w:color w:val="B03030"/>
+                <w:sz w:val="17"/>
+              </w:rPr>
+              <w:t>return code -2</w:t>
+            </w:r>
+          </w:p>
+        </w:tc>
+        <w:tc>
+          <w:tcPr>
+            <w:tcW w:type="dxa" w:w="4156"/>
+          </w:tcPr>
+          <w:p>
+            <w:pPr>
+              <w:spacing w:before="20" w:after="20"/>
+            </w:pPr>
+            <w:r/>
+            <w:r>
+              <w:rPr>
+                <w:rFonts w:ascii="Times New Roman" w:hAnsi="Times New Roman" w:eastAsia="宋体"/>
+                <w:b w:val="0"/>
+                <w:i w:val="0"/>
+                <w:sz w:val="19"/>
+              </w:rPr>
+              <w:t xml:space="preserve">终端激活了 conda </w:t>
+            </w:r>
+            <w:r>
+              <w:rPr>
+                <w:rFonts w:ascii="Consolas" w:hAnsi="Consolas" w:eastAsia="宋体"/>
+                <w:b w:val="0"/>
+                <w:i w:val="0"/>
+                <w:color w:val="B03030"/>
+                <w:sz w:val="17"/>
+              </w:rPr>
+              <w:t>(base)</w:t>
+            </w:r>
+            <w:r>
+              <w:rPr>
+                <w:rFonts w:ascii="Times New Roman" w:hAnsi="Times New Roman" w:eastAsia="宋体"/>
+                <w:b w:val="0"/>
+                <w:i w:val="0"/>
+                <w:sz w:val="19"/>
+              </w:rPr>
+              <w:t xml:space="preserve">，其 MinGW 动态库与 </w:t>
+            </w:r>
+            <w:r>
+              <w:rPr>
+                <w:rFonts w:ascii="Consolas" w:hAnsi="Consolas" w:eastAsia="宋体"/>
+                <w:b w:val="0"/>
+                <w:i w:val="0"/>
+                <w:color w:val="B03030"/>
+                <w:sz w:val="17"/>
+              </w:rPr>
+              <w:t>yosys-abc.exe</w:t>
+            </w:r>
+            <w:r>
+              <w:rPr>
+                <w:rFonts w:ascii="Times New Roman" w:hAnsi="Times New Roman" w:eastAsia="宋体"/>
+                <w:b w:val="0"/>
+                <w:i w:val="0"/>
+                <w:sz w:val="19"/>
+              </w:rPr>
+              <w:t xml:space="preserve"> 冲突；</w:t>
+            </w:r>
+            <w:r>
+              <w:rPr>
+                <w:rFonts w:ascii="Consolas" w:hAnsi="Consolas" w:eastAsia="宋体"/>
+                <w:b w:val="0"/>
+                <w:i w:val="0"/>
+                <w:color w:val="B03030"/>
+                <w:sz w:val="17"/>
+              </w:rPr>
+              <w:t>conda deactivate</w:t>
+            </w:r>
+            <w:r>
+              <w:rPr>
+                <w:rFonts w:ascii="Times New Roman" w:hAnsi="Times New Roman" w:eastAsia="宋体"/>
+                <w:b w:val="0"/>
+                <w:i w:val="0"/>
+                <w:sz w:val="19"/>
+              </w:rPr>
+              <w:t xml:space="preserve"> 后重跑</w:t>
+            </w:r>
+          </w:p>
+        </w:tc>
+      </w:tr>
+      <w:tr>
+        <w:tc>
+          <w:tcPr>
+            <w:tcW w:type="dxa" w:w="4156"/>
+          </w:tcPr>
+          <w:p>
+            <w:pPr>
+              <w:spacing w:before="20" w:after="20"/>
+            </w:pPr>
+            <w:r/>
+            <w:r>
+              <w:rPr>
+                <w:rFonts w:ascii="Times New Roman" w:hAnsi="Times New Roman" w:eastAsia="宋体"/>
+                <w:b w:val="0"/>
+                <w:i w:val="0"/>
+                <w:sz w:val="19"/>
+              </w:rPr>
+              <w:t>iverilog 报 generate 相关语法错误</w:t>
+            </w:r>
+          </w:p>
+        </w:tc>
+        <w:tc>
+          <w:tcPr>
+            <w:tcW w:type="dxa" w:w="4156"/>
+          </w:tcPr>
+          <w:p>
+            <w:pPr>
+              <w:spacing w:before="20" w:after="20"/>
+            </w:pPr>
+            <w:r/>
+            <w:r>
+              <w:rPr>
+                <w:rFonts w:ascii="Times New Roman" w:hAnsi="Times New Roman" w:eastAsia="宋体"/>
+                <w:b w:val="0"/>
+                <w:i w:val="0"/>
+                <w:sz w:val="19"/>
+              </w:rPr>
+              <w:t xml:space="preserve">漏加 </w:t>
+            </w:r>
+            <w:r>
+              <w:rPr>
+                <w:rFonts w:ascii="Consolas" w:hAnsi="Consolas" w:eastAsia="宋体"/>
+                <w:b w:val="0"/>
+                <w:i w:val="0"/>
+                <w:color w:val="B03030"/>
+                <w:sz w:val="17"/>
+              </w:rPr>
+              <w:t>-g2005</w:t>
+            </w:r>
+          </w:p>
+        </w:tc>
+      </w:tr>
+      <w:tr>
+        <w:tc>
+          <w:tcPr>
+            <w:tcW w:type="dxa" w:w="4156"/>
+          </w:tcPr>
+          <w:p>
+            <w:pPr>
+              <w:spacing w:before="20" w:after="20"/>
+            </w:pPr>
+            <w:r/>
+            <w:r>
+              <w:rPr>
+                <w:rFonts w:ascii="Consolas" w:hAnsi="Consolas" w:eastAsia="宋体"/>
+                <w:b w:val="0"/>
+                <w:i w:val="0"/>
+                <w:color w:val="B03030"/>
+                <w:sz w:val="17"/>
+              </w:rPr>
+              <w:t>input</w:t>
+            </w:r>
+            <w:r>
+              <w:rPr>
+                <w:rFonts w:ascii="Times New Roman" w:hAnsi="Times New Roman" w:eastAsia="宋体"/>
+                <w:b w:val="0"/>
+                <w:i w:val="0"/>
+                <w:sz w:val="19"/>
+              </w:rPr>
+              <w:t xml:space="preserve"> 相关编译错误</w:t>
+            </w:r>
+          </w:p>
+        </w:tc>
+        <w:tc>
+          <w:tcPr>
+            <w:tcW w:type="dxa" w:w="4156"/>
+          </w:tcPr>
+          <w:p>
+            <w:pPr>
+              <w:spacing w:before="20" w:after="20"/>
+            </w:pPr>
+            <w:r/>
+            <w:r>
+              <w:rPr>
+                <w:rFonts w:ascii="Consolas" w:hAnsi="Consolas" w:eastAsia="宋体"/>
+                <w:b w:val="0"/>
+                <w:i w:val="0"/>
+                <w:color w:val="B03030"/>
+                <w:sz w:val="17"/>
+              </w:rPr>
+              <w:t>input</w:t>
+            </w:r>
+            <w:r>
+              <w:rPr>
+                <w:rFonts w:ascii="Times New Roman" w:hAnsi="Times New Roman" w:eastAsia="宋体"/>
+                <w:b w:val="0"/>
+                <w:i w:val="0"/>
+                <w:sz w:val="19"/>
+              </w:rPr>
+              <w:t xml:space="preserve"> 是关键字，端口改名 </w:t>
+            </w:r>
+            <w:r>
+              <w:rPr>
+                <w:rFonts w:ascii="Consolas" w:hAnsi="Consolas" w:eastAsia="宋体"/>
+                <w:b w:val="0"/>
+                <w:i w:val="0"/>
+                <w:color w:val="B03030"/>
+                <w:sz w:val="17"/>
+              </w:rPr>
+              <w:t>input_data</w:t>
+            </w:r>
+          </w:p>
+        </w:tc>
+      </w:tr>
+      <w:tr>
+        <w:tc>
+          <w:tcPr>
+            <w:tcW w:type="dxa" w:w="4156"/>
+          </w:tcPr>
+          <w:p>
+            <w:pPr>
+              <w:spacing w:before="20" w:after="20"/>
+            </w:pPr>
+            <w:r/>
+            <w:r>
+              <w:rPr>
+                <w:rFonts w:ascii="Times New Roman" w:hAnsi="Times New Roman" w:eastAsia="宋体"/>
+                <w:b w:val="0"/>
+                <w:i w:val="0"/>
+                <w:sz w:val="19"/>
+              </w:rPr>
+              <w:t>仿真结果全 X</w:t>
+            </w:r>
+          </w:p>
+        </w:tc>
+        <w:tc>
+          <w:tcPr>
+            <w:tcW w:type="dxa" w:w="4156"/>
+          </w:tcPr>
+          <w:p>
+            <w:pPr>
+              <w:spacing w:before="20" w:after="20"/>
+            </w:pPr>
+            <w:r/>
+            <w:r>
+              <w:rPr>
+                <w:rFonts w:ascii="Times New Roman" w:hAnsi="Times New Roman" w:eastAsia="宋体"/>
+                <w:b w:val="0"/>
+                <w:i w:val="0"/>
+                <w:sz w:val="19"/>
+              </w:rPr>
+              <w:t>时序逻辑未复位：</w:t>
+            </w:r>
+            <w:r>
+              <w:rPr>
+                <w:rFonts w:ascii="Consolas" w:hAnsi="Consolas" w:eastAsia="宋体"/>
+                <w:b w:val="0"/>
+                <w:i w:val="0"/>
+                <w:color w:val="B03030"/>
+                <w:sz w:val="17"/>
+              </w:rPr>
+              <w:t>rst_n</w:t>
+            </w:r>
+            <w:r>
+              <w:rPr>
+                <w:rFonts w:ascii="Times New Roman" w:hAnsi="Times New Roman" w:eastAsia="宋体"/>
+                <w:b w:val="0"/>
+                <w:i w:val="0"/>
+                <w:sz w:val="19"/>
+              </w:rPr>
+              <w:t xml:space="preserve"> 先拉低若干拍再释放</w:t>
+            </w:r>
+          </w:p>
+        </w:tc>
+      </w:tr>
+      <w:tr>
+        <w:tc>
+          <w:tcPr>
+            <w:tcW w:type="dxa" w:w="4156"/>
+          </w:tcPr>
+          <w:p>
+            <w:pPr>
+              <w:spacing w:before="20" w:after="20"/>
+            </w:pPr>
+            <w:r/>
+            <w:r>
+              <w:rPr>
+                <w:rFonts w:ascii="Times New Roman" w:hAnsi="Times New Roman" w:eastAsia="宋体"/>
+                <w:b w:val="0"/>
+                <w:i w:val="0"/>
+                <w:sz w:val="19"/>
+              </w:rPr>
+              <w:t>命令不存在</w:t>
+            </w:r>
+          </w:p>
+        </w:tc>
+        <w:tc>
+          <w:tcPr>
+            <w:tcW w:type="dxa" w:w="4156"/>
+          </w:tcPr>
+          <w:p>
+            <w:pPr>
+              <w:spacing w:before="20" w:after="20"/>
+            </w:pPr>
+            <w:r/>
+            <w:r>
+              <w:rPr>
+                <w:rFonts w:ascii="Times New Roman" w:hAnsi="Times New Roman" w:eastAsia="宋体"/>
+                <w:b w:val="0"/>
+                <w:i w:val="0"/>
+                <w:sz w:val="19"/>
+              </w:rPr>
+              <w:t>PATH 未重开终端生效；路径含中文/空格</w:t>
+            </w:r>
+          </w:p>
+        </w:tc>
+      </w:tr>
+    </w:tbl>
+    <w:p>
+      <w:pPr>
+        <w:spacing w:after="0"/>
+      </w:pPr>
+    </w:p>
+    <w:p>
+      <w:r>
+        <w:br w:type="page"/>
+      </w:r>
+    </w:p>
+    <w:p>
+      <w:pPr>
+        <w:pStyle w:val="Heading1"/>
+        <w:spacing w:before="120" w:after="360"/>
+        <w:jc w:val="center"/>
+      </w:pPr>
+      <w:r>
+        <w:rPr>
+          <w:rFonts w:ascii="Times New Roman" w:hAnsi="Times New Roman" w:eastAsia="黑体"/>
+          <w:b/>
+          <w:i w:val="0"/>
+          <w:color w:val="000000"/>
+          <w:sz w:val="32"/>
+        </w:rPr>
+        <w:t>第三部分 实验一：19 位并行前缀进位加法器</w:t>
       </w:r>
     </w:p>
     <w:p>
@@ -2997,11 +5552,20 @@
       <w:r>
         <w:rPr>
           <w:rFonts w:ascii="Times New Roman" w:hAnsi="Times New Roman" w:eastAsia="宋体"/>
-          <w:b w:val="0"/>
+          <w:b/>
           <w:i w:val="0"/>
           <w:sz w:val="21"/>
         </w:rPr>
-        <w:t>参考运行结果：</w:t>
+        <w:t>预期终端输出</w:t>
+      </w:r>
+      <w:r>
+        <w:rPr>
+          <w:rFonts w:ascii="Times New Roman" w:hAnsi="Times New Roman" w:eastAsia="宋体"/>
+          <w:b w:val="0"/>
+          <w:i w:val="0"/>
+          <w:sz w:val="21"/>
+        </w:rPr>
+        <w:t>（自检基准，应逐字一致）：</w:t>
       </w:r>
     </w:p>
     <w:p>
@@ -3017,7 +5581,7 @@
           <w:i w:val="0"/>
           <w:sz w:val="18"/>
         </w:rPr>
-        <w:t>Kogge-Stone: 0 errors / 10010 vectors</w:t>
+        <w:t>VCD info: dumpfile wave.vcd opened for output.</w:t>
       </w:r>
     </w:p>
     <w:p>
@@ -3033,7 +5597,87 @@
           <w:i w:val="0"/>
           <w:sz w:val="18"/>
         </w:rPr>
-        <w:t>Ripple-Carry: 0 errors / 10010 vectors</w:t>
+        <w:t>==============================================</w:t>
+      </w:r>
+    </w:p>
+    <w:p>
+      <w:pPr>
+        <w:spacing w:before="0" w:after="0" w:line="240" w:lineRule="auto"/>
+        <w:ind w:left="227"/>
+        <w:shd w:val="clear" w:fill="F2F2F2"/>
+      </w:pPr>
+      <w:r>
+        <w:rPr>
+          <w:rFonts w:ascii="Consolas" w:hAnsi="Consolas" w:eastAsia="宋体"/>
+          <w:b w:val="0"/>
+          <w:i w:val="0"/>
+          <w:sz w:val="18"/>
+        </w:rPr>
+        <w:t>Total vectors : 10010</w:t>
+      </w:r>
+    </w:p>
+    <w:p>
+      <w:pPr>
+        <w:spacing w:before="0" w:after="0" w:line="240" w:lineRule="auto"/>
+        <w:ind w:left="227"/>
+        <w:shd w:val="clear" w:fill="F2F2F2"/>
+      </w:pPr>
+      <w:r>
+        <w:rPr>
+          <w:rFonts w:ascii="Consolas" w:hAnsi="Consolas" w:eastAsia="宋体"/>
+          <w:b w:val="0"/>
+          <w:i w:val="0"/>
+          <w:sz w:val="18"/>
+        </w:rPr>
+        <w:t>Kogge-Stone   : 0 errors</w:t>
+      </w:r>
+    </w:p>
+    <w:p>
+      <w:pPr>
+        <w:spacing w:before="0" w:after="0" w:line="240" w:lineRule="auto"/>
+        <w:ind w:left="227"/>
+        <w:shd w:val="clear" w:fill="F2F2F2"/>
+      </w:pPr>
+      <w:r>
+        <w:rPr>
+          <w:rFonts w:ascii="Consolas" w:hAnsi="Consolas" w:eastAsia="宋体"/>
+          <w:b w:val="0"/>
+          <w:i w:val="0"/>
+          <w:sz w:val="18"/>
+        </w:rPr>
+        <w:t>Ripple-Carry  : 0 errors</w:t>
+      </w:r>
+    </w:p>
+    <w:p>
+      <w:pPr>
+        <w:spacing w:before="0" w:after="0" w:line="240" w:lineRule="auto"/>
+        <w:ind w:left="227"/>
+        <w:shd w:val="clear" w:fill="F2F2F2"/>
+      </w:pPr>
+      <w:r>
+        <w:rPr>
+          <w:rFonts w:ascii="Consolas" w:hAnsi="Consolas" w:eastAsia="宋体"/>
+          <w:b w:val="0"/>
+          <w:i w:val="0"/>
+          <w:sz w:val="18"/>
+        </w:rPr>
+        <w:t>RESULT: PASS</w:t>
+      </w:r>
+    </w:p>
+    <w:p>
+      <w:pPr>
+        <w:spacing w:before="0" w:after="0" w:line="240" w:lineRule="auto"/>
+        <w:ind w:left="227"/>
+        <w:shd w:val="clear" w:fill="F2F2F2"/>
+      </w:pPr>
+      <w:r>
+        <w:rPr>
+          <w:rFonts w:ascii="Consolas" w:hAnsi="Consolas" w:eastAsia="宋体"/>
+          <w:b w:val="0"/>
+          <w:i w:val="0"/>
+          <w:sz w:val="18"/>
+        </w:rPr>
+        <w:t>==============================================</w:t>
       </w:r>
     </w:p>
     <w:p>
@@ -3049,7 +5693,272 @@
           <w:i w:val="0"/>
           <w:sz w:val="18"/>
         </w:rPr>
-        <w:t>RESULT: PASS</w:t>
+        <w:t>../tb/tb_ADDER.v:103: $finish called at 100100000 (1ps)</w:t>
+      </w:r>
+    </w:p>
+    <w:p>
+      <w:pPr>
+        <w:spacing w:line="360" w:lineRule="auto" w:after="60"/>
+        <w:ind w:firstLine="420"/>
+      </w:pPr>
+      <w:r>
+        <w:rPr>
+          <w:rFonts w:ascii="Times New Roman" w:hAnsi="Times New Roman" w:eastAsia="宋体"/>
+          <w:b/>
+          <w:i w:val="0"/>
+          <w:sz w:val="21"/>
+        </w:rPr>
+        <w:t>预期波形</w:t>
+      </w:r>
+      <w:r>
+        <w:rPr>
+          <w:rFonts w:ascii="Times New Roman" w:hAnsi="Times New Roman" w:eastAsia="宋体"/>
+          <w:b w:val="0"/>
+          <w:i w:val="0"/>
+          <w:sz w:val="21"/>
+        </w:rPr>
+        <w:t>（定向激励段 0–100 ns，每 10 ns 一组定向向量；随机段未记录波形）：</w:t>
+      </w:r>
+    </w:p>
+    <w:p>
+      <w:pPr>
+        <w:jc w:val="center"/>
+      </w:pPr>
+      <w:r>
+        <w:drawing>
+          <wp:inline xmlns:a="http://schemas.openxmlformats.org/drawingml/2006/main" xmlns:pic="http://schemas.openxmlformats.org/drawingml/2006/picture">
+            <wp:extent cx="5220000" cy="2659245"/>
+            <wp:docPr id="2" name="Picture 2"/>
+            <wp:cNvGraphicFramePr>
+              <a:graphicFrameLocks noChangeAspect="1"/>
+            </wp:cNvGraphicFramePr>
+            <a:graphic>
+              <a:graphicData uri="http://schemas.openxmlformats.org/drawingml/2006/picture">
+                <pic:pic>
+                  <pic:nvPicPr>
+                    <pic:cNvPr id="0" name="fig_lab1_waveform.png"/>
+                    <pic:cNvPicPr/>
+                  </pic:nvPicPr>
+                  <pic:blipFill>
+                    <a:blip r:embed="rId11"/>
+                    <a:stretch>
+                      <a:fillRect/>
+                    </a:stretch>
+                  </pic:blipFill>
+                  <pic:spPr>
+                    <a:xfrm>
+                      <a:off x="0" y="0"/>
+                      <a:ext cx="5220000" cy="2659245"/>
+                    </a:xfrm>
+                    <a:prstGeom prst="rect"/>
+                  </pic:spPr>
+                </pic:pic>
+              </a:graphicData>
+            </a:graphic>
+          </wp:inline>
+        </w:drawing>
+      </w:r>
+    </w:p>
+    <w:p>
+      <w:pPr>
+        <w:spacing w:after="200"/>
+        <w:jc w:val="center"/>
+      </w:pPr>
+      <w:r>
+        <w:rPr>
+          <w:rFonts w:ascii="Times New Roman" w:hAnsi="Times New Roman" w:eastAsia="宋体"/>
+          <w:b w:val="0"/>
+          <w:i w:val="0"/>
+          <w:color w:val="595959"/>
+          <w:sz w:val="18"/>
+        </w:rPr>
+        <w:t>图 1-2 实验一仿真波形（实测渲染）</w:t>
+      </w:r>
+    </w:p>
+    <w:p>
+      <w:pPr>
+        <w:spacing w:line="360" w:lineRule="auto" w:after="60"/>
+        <w:ind w:firstLine="420"/>
+      </w:pPr>
+      <w:r>
+        <w:rPr>
+          <w:rFonts w:ascii="Times New Roman" w:hAnsi="Times New Roman" w:eastAsia="宋体"/>
+          <w:b w:val="0"/>
+          <w:i w:val="0"/>
+          <w:sz w:val="21"/>
+        </w:rPr>
+        <w:t>逐项核对：</w:t>
+      </w:r>
+      <w:r>
+        <w:rPr>
+          <w:rFonts w:ascii="Consolas" w:hAnsi="Consolas" w:eastAsia="宋体"/>
+          <w:b w:val="0"/>
+          <w:i w:val="0"/>
+          <w:color w:val="B03030"/>
+          <w:sz w:val="19"/>
+        </w:rPr>
+        <w:t>7FFFF+7FFFF+cin=1</w:t>
+      </w:r>
+      <w:r>
+        <w:rPr>
+          <w:rFonts w:ascii="Times New Roman" w:hAnsi="Times New Roman" w:eastAsia="宋体"/>
+          <w:b w:val="0"/>
+          <w:i w:val="0"/>
+          <w:sz w:val="21"/>
+        </w:rPr>
+        <w:t xml:space="preserve">（40–50 ns）→ </w:t>
+      </w:r>
+      <w:r>
+        <w:rPr>
+          <w:rFonts w:ascii="Consolas" w:hAnsi="Consolas" w:eastAsia="宋体"/>
+          <w:b w:val="0"/>
+          <w:i w:val="0"/>
+          <w:color w:val="B03030"/>
+          <w:sz w:val="19"/>
+        </w:rPr>
+        <w:t>sum=7FFFF</w:t>
+      </w:r>
+      <w:r>
+        <w:rPr>
+          <w:rFonts w:ascii="Times New Roman" w:hAnsi="Times New Roman" w:eastAsia="宋体"/>
+          <w:b w:val="0"/>
+          <w:i w:val="0"/>
+          <w:sz w:val="21"/>
+        </w:rPr>
+        <w:t>、</w:t>
+      </w:r>
+      <w:r>
+        <w:rPr>
+          <w:rFonts w:ascii="Consolas" w:hAnsi="Consolas" w:eastAsia="宋体"/>
+          <w:b w:val="0"/>
+          <w:i w:val="0"/>
+          <w:color w:val="B03030"/>
+          <w:sz w:val="19"/>
+        </w:rPr>
+        <w:t>cout=1</w:t>
+      </w:r>
+      <w:r>
+        <w:rPr>
+          <w:rFonts w:ascii="Times New Roman" w:hAnsi="Times New Roman" w:eastAsia="宋体"/>
+          <w:b w:val="0"/>
+          <w:i w:val="0"/>
+          <w:sz w:val="21"/>
+        </w:rPr>
+        <w:t xml:space="preserve">；交替进位链 </w:t>
+      </w:r>
+      <w:r>
+        <w:rPr>
+          <w:rFonts w:ascii="Consolas" w:hAnsi="Consolas" w:eastAsia="宋体"/>
+          <w:b w:val="0"/>
+          <w:i w:val="0"/>
+          <w:color w:val="B03030"/>
+          <w:sz w:val="19"/>
+        </w:rPr>
+        <w:t>55555+2AAAA</w:t>
+      </w:r>
+      <w:r>
+        <w:rPr>
+          <w:rFonts w:ascii="Times New Roman" w:hAnsi="Times New Roman" w:eastAsia="宋体"/>
+          <w:b w:val="0"/>
+          <w:i w:val="0"/>
+          <w:sz w:val="21"/>
+        </w:rPr>
+        <w:t xml:space="preserve">（70–80 ns）→ </w:t>
+      </w:r>
+      <w:r>
+        <w:rPr>
+          <w:rFonts w:ascii="Consolas" w:hAnsi="Consolas" w:eastAsia="宋体"/>
+          <w:b w:val="0"/>
+          <w:i w:val="0"/>
+          <w:color w:val="B03030"/>
+          <w:sz w:val="19"/>
+        </w:rPr>
+        <w:t>sum=7FFFF</w:t>
+      </w:r>
+      <w:r>
+        <w:rPr>
+          <w:rFonts w:ascii="Times New Roman" w:hAnsi="Times New Roman" w:eastAsia="宋体"/>
+          <w:b w:val="0"/>
+          <w:i w:val="0"/>
+          <w:sz w:val="21"/>
+        </w:rPr>
+        <w:t>、</w:t>
+      </w:r>
+      <w:r>
+        <w:rPr>
+          <w:rFonts w:ascii="Consolas" w:hAnsi="Consolas" w:eastAsia="宋体"/>
+          <w:b w:val="0"/>
+          <w:i w:val="0"/>
+          <w:color w:val="B03030"/>
+          <w:sz w:val="19"/>
+        </w:rPr>
+        <w:t>cout=0</w:t>
+      </w:r>
+      <w:r>
+        <w:rPr>
+          <w:rFonts w:ascii="Times New Roman" w:hAnsi="Times New Roman" w:eastAsia="宋体"/>
+          <w:b w:val="0"/>
+          <w:i w:val="0"/>
+          <w:sz w:val="21"/>
+        </w:rPr>
+        <w:t>；</w:t>
+      </w:r>
+      <w:r>
+        <w:rPr>
+          <w:rFonts w:ascii="Consolas" w:hAnsi="Consolas" w:eastAsia="宋体"/>
+          <w:b w:val="0"/>
+          <w:i w:val="0"/>
+          <w:color w:val="B03030"/>
+          <w:sz w:val="19"/>
+        </w:rPr>
+        <w:t>2AAAA+55555+1</w:t>
+      </w:r>
+      <w:r>
+        <w:rPr>
+          <w:rFonts w:ascii="Times New Roman" w:hAnsi="Times New Roman" w:eastAsia="宋体"/>
+          <w:b w:val="0"/>
+          <w:i w:val="0"/>
+          <w:sz w:val="21"/>
+        </w:rPr>
+        <w:t xml:space="preserve">（80–90 ns）→ </w:t>
+      </w:r>
+      <w:r>
+        <w:rPr>
+          <w:rFonts w:ascii="Consolas" w:hAnsi="Consolas" w:eastAsia="宋体"/>
+          <w:b w:val="0"/>
+          <w:i w:val="0"/>
+          <w:color w:val="B03030"/>
+          <w:sz w:val="19"/>
+        </w:rPr>
+        <w:t>sum=00000</w:t>
+      </w:r>
+      <w:r>
+        <w:rPr>
+          <w:rFonts w:ascii="Times New Roman" w:hAnsi="Times New Roman" w:eastAsia="宋体"/>
+          <w:b w:val="0"/>
+          <w:i w:val="0"/>
+          <w:sz w:val="21"/>
+        </w:rPr>
+        <w:t>、</w:t>
+      </w:r>
+      <w:r>
+        <w:rPr>
+          <w:rFonts w:ascii="Consolas" w:hAnsi="Consolas" w:eastAsia="宋体"/>
+          <w:b w:val="0"/>
+          <w:i w:val="0"/>
+          <w:color w:val="B03030"/>
+          <w:sz w:val="19"/>
+        </w:rPr>
+        <w:t>cout=1</w:t>
+      </w:r>
+      <w:r>
+        <w:rPr>
+          <w:rFonts w:ascii="Times New Roman" w:hAnsi="Times New Roman" w:eastAsia="宋体"/>
+          <w:b w:val="0"/>
+          <w:i w:val="0"/>
+          <w:sz w:val="21"/>
+        </w:rPr>
+        <w:t>。波形数值应与本图逐拍一致。</w:t>
       </w:r>
     </w:p>
     <w:p>
@@ -3448,11 +6357,21 @@
       <w:r>
         <w:rPr>
           <w:rFonts w:ascii="Times New Roman" w:hAnsi="Times New Roman" w:eastAsia="宋体"/>
-          <w:b/>
+          <w:b w:val="0"/>
           <w:i w:val="0"/>
           <w:sz w:val="21"/>
         </w:rPr>
-        <w:t>结果分析</w:t>
+        <w:t>综合输出实样（</w:t>
+      </w:r>
+      <w:r>
+        <w:rPr>
+          <w:rFonts w:ascii="Consolas" w:hAnsi="Consolas" w:eastAsia="宋体"/>
+          <w:b w:val="0"/>
+          <w:i w:val="0"/>
+          <w:color w:val="B03030"/>
+          <w:sz w:val="19"/>
+        </w:rPr>
+        <w:t>ks_stat.txt</w:t>
       </w:r>
       <w:r>
         <w:rPr>
@@ -3461,14 +6380,18 @@
           <w:i w:val="0"/>
           <w:sz w:val="21"/>
         </w:rPr>
-        <w:t>：</w:t>
-      </w:r>
-    </w:p>
-    <w:p>
-      <w:pPr>
-        <w:spacing w:line="360" w:lineRule="auto" w:after="60"/>
-        <w:ind w:firstLine="420"/>
-      </w:pPr>
+        <w:t xml:space="preserve"> / </w:t>
+      </w:r>
+      <w:r>
+        <w:rPr>
+          <w:rFonts w:ascii="Consolas" w:hAnsi="Consolas" w:eastAsia="宋体"/>
+          <w:b w:val="0"/>
+          <w:i w:val="0"/>
+          <w:color w:val="B03030"/>
+          <w:sz w:val="19"/>
+        </w:rPr>
+        <w:t>ks_ltp.txt</w:t>
+      </w:r>
       <w:r>
         <w:rPr>
           <w:rFonts w:ascii="Times New Roman" w:hAnsi="Times New Roman" w:eastAsia="宋体"/>
@@ -3476,55 +6399,103 @@
           <w:i w:val="0"/>
           <w:sz w:val="21"/>
         </w:rPr>
-        <w:t>1. 理论趋势得到验证：对数深度显著优于线性深度，路径缩短 31%，代价是面积增加 55%——典型的 PPA tradeoff</w:t>
-      </w:r>
-    </w:p>
-    <w:p>
-      <w:pPr>
-        <w:spacing w:line="360" w:lineRule="auto" w:after="60"/>
-        <w:ind w:firstLine="420"/>
-      </w:pPr>
-      <w:r>
-        <w:rPr>
-          <w:rFonts w:ascii="Times New Roman" w:hAnsi="Times New Roman" w:eastAsia="宋体"/>
-          <w:b w:val="0"/>
-          <w:i w:val="0"/>
-          <w:sz w:val="21"/>
-        </w:rPr>
-        <w:t>2. 实测级数 ≠ 理论层数：ABC 综合器对逻辑做全局重构与缓冲插入，"5 级前缀"在门级网表中不逐层对应；理论给出</w:t>
-      </w:r>
-      <w:r>
-        <w:rPr>
-          <w:rFonts w:ascii="Times New Roman" w:hAnsi="Times New Roman" w:eastAsia="宋体"/>
-          <w:b/>
-          <w:i w:val="0"/>
-          <w:sz w:val="21"/>
-        </w:rPr>
-        <w:t>趋势</w:t>
-      </w:r>
-      <w:r>
-        <w:rPr>
-          <w:rFonts w:ascii="Times New Roman" w:hAnsi="Times New Roman" w:eastAsia="宋体"/>
-          <w:b w:val="0"/>
-          <w:i w:val="0"/>
-          <w:sz w:val="21"/>
-        </w:rPr>
-        <w:t>，数值必须实测</w:t>
-      </w:r>
-    </w:p>
-    <w:p>
-      <w:pPr>
-        <w:spacing w:line="360" w:lineRule="auto" w:after="60"/>
-        <w:ind w:firstLine="420"/>
-      </w:pPr>
-      <w:r>
-        <w:rPr>
-          <w:rFonts w:ascii="Times New Roman" w:hAnsi="Times New Roman" w:eastAsia="宋体"/>
-          <w:b w:val="0"/>
-          <w:i w:val="0"/>
-          <w:sz w:val="21"/>
-        </w:rPr>
-        <w:t>3. 位宽越大差距越悬殊：若扩展至 64 位，线性链约 80 级而对数结构仅约 33 级</w:t>
+        <w:t xml:space="preserve"> 节选，逐字对照）：</w:t>
+      </w:r>
+    </w:p>
+    <w:p>
+      <w:pPr>
+        <w:spacing w:before="120" w:after="0" w:line="240" w:lineRule="auto"/>
+        <w:ind w:left="227"/>
+        <w:shd w:val="clear" w:fill="F2F2F2"/>
+      </w:pPr>
+      <w:r>
+        <w:rPr>
+          <w:rFonts w:ascii="Consolas" w:hAnsi="Consolas" w:eastAsia="宋体"/>
+          <w:b w:val="0"/>
+          <w:i w:val="0"/>
+          <w:sz w:val="18"/>
+        </w:rPr>
+        <w:t>=== ADDER ===</w:t>
+      </w:r>
+    </w:p>
+    <w:p>
+      <w:pPr>
+        <w:spacing w:before="0" w:after="0" w:line="240" w:lineRule="auto"/>
+        <w:ind w:left="227"/>
+        <w:shd w:val="clear" w:fill="F2F2F2"/>
+      </w:pPr>
+      <w:r>
+        <w:rPr>
+          <w:rFonts w:ascii="Consolas" w:hAnsi="Consolas" w:eastAsia="宋体"/>
+          <w:b w:val="0"/>
+          <w:i w:val="0"/>
+          <w:sz w:val="18"/>
+        </w:rPr>
+        <w:t xml:space="preserve">      133 wires</w:t>
+      </w:r>
+    </w:p>
+    <w:p>
+      <w:pPr>
+        <w:spacing w:before="0" w:after="0" w:line="240" w:lineRule="auto"/>
+        <w:ind w:left="227"/>
+        <w:shd w:val="clear" w:fill="F2F2F2"/>
+      </w:pPr>
+      <w:r>
+        <w:rPr>
+          <w:rFonts w:ascii="Consolas" w:hAnsi="Consolas" w:eastAsia="宋体"/>
+          <w:b w:val="0"/>
+          <w:i w:val="0"/>
+          <w:sz w:val="18"/>
+        </w:rPr>
+        <w:t xml:space="preserve">      147 cells</w:t>
+      </w:r>
+    </w:p>
+    <w:p>
+      <w:pPr>
+        <w:spacing w:before="0" w:after="0" w:line="240" w:lineRule="auto"/>
+        <w:ind w:left="227"/>
+        <w:shd w:val="clear" w:fill="F2F2F2"/>
+      </w:pPr>
+      <w:r>
+        <w:rPr>
+          <w:rFonts w:ascii="Consolas" w:hAnsi="Consolas" w:eastAsia="宋体"/>
+          <w:b w:val="0"/>
+          <w:i w:val="0"/>
+          <w:sz w:val="18"/>
+        </w:rPr>
+        <w:t xml:space="preserve">       43   $_AND_</w:t>
+      </w:r>
+    </w:p>
+    <w:p>
+      <w:pPr>
+        <w:spacing w:before="0" w:after="0" w:line="240" w:lineRule="auto"/>
+        <w:ind w:left="227"/>
+        <w:shd w:val="clear" w:fill="F2F2F2"/>
+      </w:pPr>
+      <w:r>
+        <w:rPr>
+          <w:rFonts w:ascii="Consolas" w:hAnsi="Consolas" w:eastAsia="宋体"/>
+          <w:b w:val="0"/>
+          <w:i w:val="0"/>
+          <w:sz w:val="18"/>
+        </w:rPr>
+        <w:t xml:space="preserve">       60   $_NAND_</w:t>
+      </w:r>
+    </w:p>
+    <w:p>
+      <w:pPr>
+        <w:spacing w:before="0" w:after="120" w:line="240" w:lineRule="auto"/>
+        <w:ind w:left="227"/>
+        <w:shd w:val="clear" w:fill="F2F2F2"/>
+      </w:pPr>
+      <w:r>
+        <w:rPr>
+          <w:rFonts w:ascii="Consolas" w:hAnsi="Consolas" w:eastAsia="宋体"/>
+          <w:b w:val="0"/>
+          <w:i w:val="0"/>
+          <w:sz w:val="18"/>
+        </w:rPr>
+        <w:t>Longest topological path in ADDER (length=27):</w:t>
       </w:r>
     </w:p>
     <w:p>
@@ -3538,11 +6509,116 @@
       <w:r>
         <w:rPr>
           <w:rFonts w:ascii="Times New Roman" w:hAnsi="Times New Roman" w:eastAsia="宋体"/>
+          <w:b w:val="0"/>
+          <w:i w:val="0"/>
+          <w:sz w:val="20"/>
+        </w:rPr>
+        <w:t>不同版本工具链数值可能略有出入（±5% 以内可接受），但 KS「路径更短、单元更多」的相对结论必须成立。</w:t>
+      </w:r>
+    </w:p>
+    <w:p>
+      <w:pPr>
+        <w:spacing w:line="360" w:lineRule="auto" w:after="60"/>
+        <w:ind w:firstLine="420"/>
+      </w:pPr>
+      <w:r>
+        <w:rPr>
+          <w:rFonts w:ascii="Times New Roman" w:hAnsi="Times New Roman" w:eastAsia="宋体"/>
           <w:b/>
           <w:i w:val="0"/>
+          <w:sz w:val="21"/>
+        </w:rPr>
+        <w:t>结果分析</w:t>
+      </w:r>
+      <w:r>
+        <w:rPr>
+          <w:rFonts w:ascii="Times New Roman" w:hAnsi="Times New Roman" w:eastAsia="宋体"/>
+          <w:b w:val="0"/>
+          <w:i w:val="0"/>
+          <w:sz w:val="21"/>
+        </w:rPr>
+        <w:t>：</w:t>
+      </w:r>
+    </w:p>
+    <w:p>
+      <w:pPr>
+        <w:spacing w:line="360" w:lineRule="auto" w:after="60"/>
+        <w:ind w:firstLine="420"/>
+      </w:pPr>
+      <w:r>
+        <w:rPr>
+          <w:rFonts w:ascii="Times New Roman" w:hAnsi="Times New Roman" w:eastAsia="宋体"/>
+          <w:b w:val="0"/>
+          <w:i w:val="0"/>
+          <w:sz w:val="21"/>
+        </w:rPr>
+        <w:t>1. 理论趋势得到验证：对数深度显著优于线性深度，路径缩短 31%，代价是面积增加 55%——典型的 PPA tradeoff</w:t>
+      </w:r>
+    </w:p>
+    <w:p>
+      <w:pPr>
+        <w:spacing w:line="360" w:lineRule="auto" w:after="60"/>
+        <w:ind w:firstLine="420"/>
+      </w:pPr>
+      <w:r>
+        <w:rPr>
+          <w:rFonts w:ascii="Times New Roman" w:hAnsi="Times New Roman" w:eastAsia="宋体"/>
+          <w:b w:val="0"/>
+          <w:i w:val="0"/>
+          <w:sz w:val="21"/>
+        </w:rPr>
+        <w:t>2. 实测级数 ≠ 理论层数：ABC 综合器对逻辑做全局重构与缓冲插入，"5 级前缀"在门级网表中不逐层对应；理论给出</w:t>
+      </w:r>
+      <w:r>
+        <w:rPr>
+          <w:rFonts w:ascii="Times New Roman" w:hAnsi="Times New Roman" w:eastAsia="宋体"/>
+          <w:b/>
+          <w:i w:val="0"/>
+          <w:sz w:val="21"/>
+        </w:rPr>
+        <w:t>趋势</w:t>
+      </w:r>
+      <w:r>
+        <w:rPr>
+          <w:rFonts w:ascii="Times New Roman" w:hAnsi="Times New Roman" w:eastAsia="宋体"/>
+          <w:b w:val="0"/>
+          <w:i w:val="0"/>
+          <w:sz w:val="21"/>
+        </w:rPr>
+        <w:t>，数值必须实测</w:t>
+      </w:r>
+    </w:p>
+    <w:p>
+      <w:pPr>
+        <w:spacing w:line="360" w:lineRule="auto" w:after="60"/>
+        <w:ind w:firstLine="420"/>
+      </w:pPr>
+      <w:r>
+        <w:rPr>
+          <w:rFonts w:ascii="Times New Roman" w:hAnsi="Times New Roman" w:eastAsia="宋体"/>
+          <w:b w:val="0"/>
+          <w:i w:val="0"/>
+          <w:sz w:val="21"/>
+        </w:rPr>
+        <w:t>3. 位宽越大差距越悬殊：若扩展至 64 位，线性链约 80 级而对数结构仅约 33 级</w:t>
+      </w:r>
+    </w:p>
+    <w:p>
+      <w:pPr>
+        <w:spacing w:before="80" w:after="80"/>
+        <w:ind w:left="425"/>
+        <w:pBdr>
+          <w:left w:val="single" w:sz="18" w:space="4" w:color="2E74B5"/>
+        </w:pBdr>
+      </w:pPr>
+      <w:r>
+        <w:rPr>
+          <w:rFonts w:ascii="Times New Roman" w:hAnsi="Times New Roman" w:eastAsia="宋体"/>
+          <w:b/>
+          <w:i w:val="0"/>
           <w:sz w:val="20"/>
         </w:rPr>
-        <w:t>流程坑</w:t>
+        <w:t>流程注意</w:t>
       </w:r>
       <w:r>
         <w:rPr>
@@ -4164,7 +7240,7 @@
           <w:color w:val="000000"/>
           <w:sz w:val="32"/>
         </w:rPr>
-        <w:t>实验二 8 位移位相加乘法器（Wallace 树）</w:t>
+        <w:t>第四部分 实验二：8 位移位相加乘法器（Wallace 树）</w:t>
       </w:r>
     </w:p>
     <w:p>
@@ -4701,7 +7777,7 @@
         <w:drawing>
           <wp:inline xmlns:a="http://schemas.openxmlformats.org/drawingml/2006/main" xmlns:pic="http://schemas.openxmlformats.org/drawingml/2006/picture">
             <wp:extent cx="5220000" cy="1810161"/>
-            <wp:docPr id="2" name="Picture 2"/>
+            <wp:docPr id="3" name="Picture 3"/>
             <wp:cNvGraphicFramePr>
               <a:graphicFrameLocks noChangeAspect="1"/>
             </wp:cNvGraphicFramePr>
@@ -4713,7 +7789,7 @@
                     <pic:cNvPicPr/>
                   </pic:nvPicPr>
                   <pic:blipFill>
-                    <a:blip r:embed="rId11"/>
+                    <a:blip r:embed="rId12"/>
                     <a:stretch>
                       <a:fillRect/>
                     </a:stretch>
@@ -6000,11 +9076,20 @@
       <w:r>
         <w:rPr>
           <w:rFonts w:ascii="Times New Roman" w:hAnsi="Times New Roman" w:eastAsia="宋体"/>
-          <w:b w:val="0"/>
+          <w:b/>
           <w:i w:val="0"/>
           <w:sz w:val="21"/>
         </w:rPr>
-        <w:t>参考运行结果：</w:t>
+        <w:t>预期终端输出</w:t>
+      </w:r>
+      <w:r>
+        <w:rPr>
+          <w:rFonts w:ascii="Times New Roman" w:hAnsi="Times New Roman" w:eastAsia="宋体"/>
+          <w:b w:val="0"/>
+          <w:i w:val="0"/>
+          <w:sz w:val="21"/>
+        </w:rPr>
+        <w:t>（自检基准，应逐字一致；Wallace 版与朴素版两个 DUT 同时通过）：</w:t>
       </w:r>
     </w:p>
     <w:p>
@@ -6020,7 +9105,7 @@
           <w:i w:val="0"/>
           <w:sz w:val="18"/>
         </w:rPr>
-        <w:t>Directed + Exhaustive: 65536 vectors</w:t>
+        <w:t>VCD info: dumpfile wave.vcd opened for output.</w:t>
       </w:r>
     </w:p>
     <w:p>
@@ -6036,7 +9121,71 @@
           <w:i w:val="0"/>
           <w:sz w:val="18"/>
         </w:rPr>
-        <w:t>Errors: 0</w:t>
+        <w:t>==============================================</w:t>
+      </w:r>
+    </w:p>
+    <w:p>
+      <w:pPr>
+        <w:spacing w:before="0" w:after="0" w:line="240" w:lineRule="auto"/>
+        <w:ind w:left="227"/>
+        <w:shd w:val="clear" w:fill="F2F2F2"/>
+      </w:pPr>
+      <w:r>
+        <w:rPr>
+          <w:rFonts w:ascii="Consolas" w:hAnsi="Consolas" w:eastAsia="宋体"/>
+          <w:b w:val="0"/>
+          <w:i w:val="0"/>
+          <w:sz w:val="18"/>
+        </w:rPr>
+        <w:t>Total vectors : 65545</w:t>
+      </w:r>
+    </w:p>
+    <w:p>
+      <w:pPr>
+        <w:spacing w:before="0" w:after="0" w:line="240" w:lineRule="auto"/>
+        <w:ind w:left="227"/>
+        <w:shd w:val="clear" w:fill="F2F2F2"/>
+      </w:pPr>
+      <w:r>
+        <w:rPr>
+          <w:rFonts w:ascii="Consolas" w:hAnsi="Consolas" w:eastAsia="宋体"/>
+          <w:b w:val="0"/>
+          <w:i w:val="0"/>
+          <w:sz w:val="18"/>
+        </w:rPr>
+        <w:t>Errors        : 0</w:t>
+      </w:r>
+    </w:p>
+    <w:p>
+      <w:pPr>
+        <w:spacing w:before="0" w:after="0" w:line="240" w:lineRule="auto"/>
+        <w:ind w:left="227"/>
+        <w:shd w:val="clear" w:fill="F2F2F2"/>
+      </w:pPr>
+      <w:r>
+        <w:rPr>
+          <w:rFonts w:ascii="Consolas" w:hAnsi="Consolas" w:eastAsia="宋体"/>
+          <w:b w:val="0"/>
+          <w:i w:val="0"/>
+          <w:sz w:val="18"/>
+        </w:rPr>
+        <w:t>RESULT: PASS</w:t>
+      </w:r>
+    </w:p>
+    <w:p>
+      <w:pPr>
+        <w:spacing w:before="0" w:after="0" w:line="240" w:lineRule="auto"/>
+        <w:ind w:left="227"/>
+        <w:shd w:val="clear" w:fill="F2F2F2"/>
+      </w:pPr>
+      <w:r>
+        <w:rPr>
+          <w:rFonts w:ascii="Consolas" w:hAnsi="Consolas" w:eastAsia="宋体"/>
+          <w:b w:val="0"/>
+          <w:i w:val="0"/>
+          <w:sz w:val="18"/>
+        </w:rPr>
+        <w:t>==============================================</w:t>
       </w:r>
     </w:p>
     <w:p>
@@ -6052,7 +9201,7 @@
           <w:i w:val="0"/>
           <w:sz w:val="18"/>
         </w:rPr>
-        <w:t>RESULT: PASS</w:t>
+        <w:t>../tb/tb_MULT.v:72: $finish called at 65545000 (1ps)</w:t>
       </w:r>
     </w:p>
     <w:p>
@@ -6063,11 +9212,204 @@
       <w:r>
         <w:rPr>
           <w:rFonts w:ascii="Times New Roman" w:hAnsi="Times New Roman" w:eastAsia="宋体"/>
-          <w:b w:val="0"/>
+          <w:b/>
           <w:i w:val="0"/>
           <w:sz w:val="21"/>
         </w:rPr>
-        <w:t>（Wallace 版与朴素版两个 DUT 同时通过。）</w:t>
+        <w:t>预期波形</w:t>
+      </w:r>
+      <w:r>
+        <w:rPr>
+          <w:rFonts w:ascii="Times New Roman" w:hAnsi="Times New Roman" w:eastAsia="宋体"/>
+          <w:b w:val="0"/>
+          <w:i w:val="0"/>
+          <w:sz w:val="21"/>
+        </w:rPr>
+        <w:t>（定向激励段 0–10 ns，每 1 ns 一组定向向量）：</w:t>
+      </w:r>
+    </w:p>
+    <w:p>
+      <w:pPr>
+        <w:jc w:val="center"/>
+      </w:pPr>
+      <w:r>
+        <w:drawing>
+          <wp:inline xmlns:a="http://schemas.openxmlformats.org/drawingml/2006/main" xmlns:pic="http://schemas.openxmlformats.org/drawingml/2006/picture">
+            <wp:extent cx="5220000" cy="2294830"/>
+            <wp:docPr id="4" name="Picture 4"/>
+            <wp:cNvGraphicFramePr>
+              <a:graphicFrameLocks noChangeAspect="1"/>
+            </wp:cNvGraphicFramePr>
+            <a:graphic>
+              <a:graphicData uri="http://schemas.openxmlformats.org/drawingml/2006/picture">
+                <pic:pic>
+                  <pic:nvPicPr>
+                    <pic:cNvPr id="0" name="fig_lab2_waveform.png"/>
+                    <pic:cNvPicPr/>
+                  </pic:nvPicPr>
+                  <pic:blipFill>
+                    <a:blip r:embed="rId13"/>
+                    <a:stretch>
+                      <a:fillRect/>
+                    </a:stretch>
+                  </pic:blipFill>
+                  <pic:spPr>
+                    <a:xfrm>
+                      <a:off x="0" y="0"/>
+                      <a:ext cx="5220000" cy="2294830"/>
+                    </a:xfrm>
+                    <a:prstGeom prst="rect"/>
+                  </pic:spPr>
+                </pic:pic>
+              </a:graphicData>
+            </a:graphic>
+          </wp:inline>
+        </w:drawing>
+      </w:r>
+    </w:p>
+    <w:p>
+      <w:pPr>
+        <w:spacing w:after="200"/>
+        <w:jc w:val="center"/>
+      </w:pPr>
+      <w:r>
+        <w:rPr>
+          <w:rFonts w:ascii="Times New Roman" w:hAnsi="Times New Roman" w:eastAsia="宋体"/>
+          <w:b w:val="0"/>
+          <w:i w:val="0"/>
+          <w:color w:val="595959"/>
+          <w:sz w:val="18"/>
+        </w:rPr>
+        <w:t>图 2-2 实验二仿真波形（实测渲染）</w:t>
+      </w:r>
+    </w:p>
+    <w:p>
+      <w:pPr>
+        <w:spacing w:line="360" w:lineRule="auto" w:after="60"/>
+        <w:ind w:firstLine="420"/>
+      </w:pPr>
+      <w:r>
+        <w:rPr>
+          <w:rFonts w:ascii="Times New Roman" w:hAnsi="Times New Roman" w:eastAsia="宋体"/>
+          <w:b w:val="0"/>
+          <w:i w:val="0"/>
+          <w:sz w:val="21"/>
+        </w:rPr>
+        <w:t>逐项核对：</w:t>
+      </w:r>
+      <w:r>
+        <w:rPr>
+          <w:rFonts w:ascii="Consolas" w:hAnsi="Consolas" w:eastAsia="宋体"/>
+          <w:b w:val="0"/>
+          <w:i w:val="0"/>
+          <w:color w:val="B03030"/>
+          <w:sz w:val="19"/>
+        </w:rPr>
+        <w:t>FF×FF=FE01</w:t>
+      </w:r>
+      <w:r>
+        <w:rPr>
+          <w:rFonts w:ascii="Times New Roman" w:hAnsi="Times New Roman" w:eastAsia="宋体"/>
+          <w:b w:val="0"/>
+          <w:i w:val="0"/>
+          <w:sz w:val="21"/>
+        </w:rPr>
+        <w:t>（255×255=65025）、</w:t>
+      </w:r>
+      <w:r>
+        <w:rPr>
+          <w:rFonts w:ascii="Consolas" w:hAnsi="Consolas" w:eastAsia="宋体"/>
+          <w:b w:val="0"/>
+          <w:i w:val="0"/>
+          <w:color w:val="B03030"/>
+          <w:sz w:val="19"/>
+        </w:rPr>
+        <w:t>80×02=0100</w:t>
+      </w:r>
+      <w:r>
+        <w:rPr>
+          <w:rFonts w:ascii="Times New Roman" w:hAnsi="Times New Roman" w:eastAsia="宋体"/>
+          <w:b w:val="0"/>
+          <w:i w:val="0"/>
+          <w:sz w:val="21"/>
+        </w:rPr>
+        <w:t>（128×2=256，进位传播）、</w:t>
+      </w:r>
+      <w:r>
+        <w:rPr>
+          <w:rFonts w:ascii="Consolas" w:hAnsi="Consolas" w:eastAsia="宋体"/>
+          <w:b w:val="0"/>
+          <w:i w:val="0"/>
+          <w:color w:val="B03030"/>
+          <w:sz w:val="19"/>
+        </w:rPr>
+        <w:t>AA×55=3872</w:t>
+      </w:r>
+      <w:r>
+        <w:rPr>
+          <w:rFonts w:ascii="Times New Roman" w:hAnsi="Times New Roman" w:eastAsia="宋体"/>
+          <w:b w:val="0"/>
+          <w:i w:val="0"/>
+          <w:sz w:val="21"/>
+        </w:rPr>
+        <w:t>（170×85=14450）。</w:t>
+      </w:r>
+      <w:r>
+        <w:rPr>
+          <w:rFonts w:ascii="Consolas" w:hAnsi="Consolas" w:eastAsia="宋体"/>
+          <w:b w:val="0"/>
+          <w:i w:val="0"/>
+          <w:color w:val="B03030"/>
+          <w:sz w:val="19"/>
+        </w:rPr>
+        <w:t>ref</w:t>
+      </w:r>
+      <w:r>
+        <w:rPr>
+          <w:rFonts w:ascii="Times New Roman" w:hAnsi="Times New Roman" w:eastAsia="宋体"/>
+          <w:b w:val="0"/>
+          <w:i w:val="0"/>
+          <w:sz w:val="21"/>
+        </w:rPr>
+        <w:t xml:space="preserve"> 为行为级参考（比激励晚 1 ns 采样，属 tb 设计），</w:t>
+      </w:r>
+      <w:r>
+        <w:rPr>
+          <w:rFonts w:ascii="Consolas" w:hAnsi="Consolas" w:eastAsia="宋体"/>
+          <w:b w:val="0"/>
+          <w:i w:val="0"/>
+          <w:color w:val="B03030"/>
+          <w:sz w:val="19"/>
+        </w:rPr>
+        <w:t>res</w:t>
+      </w:r>
+      <w:r>
+        <w:rPr>
+          <w:rFonts w:ascii="Times New Roman" w:hAnsi="Times New Roman" w:eastAsia="宋体"/>
+          <w:b w:val="0"/>
+          <w:i w:val="0"/>
+          <w:sz w:val="21"/>
+        </w:rPr>
+        <w:t xml:space="preserve"> 与 </w:t>
+      </w:r>
+      <w:r>
+        <w:rPr>
+          <w:rFonts w:ascii="Consolas" w:hAnsi="Consolas" w:eastAsia="宋体"/>
+          <w:b w:val="0"/>
+          <w:i w:val="0"/>
+          <w:color w:val="B03030"/>
+          <w:sz w:val="19"/>
+        </w:rPr>
+        <w:t>ref</w:t>
+      </w:r>
+      <w:r>
+        <w:rPr>
+          <w:rFonts w:ascii="Times New Roman" w:hAnsi="Times New Roman" w:eastAsia="宋体"/>
+          <w:b w:val="0"/>
+          <w:i w:val="0"/>
+          <w:sz w:val="21"/>
+        </w:rPr>
+        <w:t xml:space="preserve"> 逐拍相等即正确。</w:t>
       </w:r>
     </w:p>
     <w:p>
@@ -6370,6 +9712,173 @@
       <w:pPr>
         <w:spacing w:after="0"/>
       </w:pPr>
+    </w:p>
+    <w:p>
+      <w:pPr>
+        <w:spacing w:line="360" w:lineRule="auto" w:after="60"/>
+        <w:ind w:firstLine="420"/>
+      </w:pPr>
+      <w:r>
+        <w:rPr>
+          <w:rFonts w:ascii="Times New Roman" w:hAnsi="Times New Roman" w:eastAsia="宋体"/>
+          <w:b w:val="0"/>
+          <w:i w:val="0"/>
+          <w:sz w:val="21"/>
+        </w:rPr>
+        <w:t>综合输出实样（</w:t>
+      </w:r>
+      <w:r>
+        <w:rPr>
+          <w:rFonts w:ascii="Consolas" w:hAnsi="Consolas" w:eastAsia="宋体"/>
+          <w:b w:val="0"/>
+          <w:i w:val="0"/>
+          <w:color w:val="B03030"/>
+          <w:sz w:val="19"/>
+        </w:rPr>
+        <w:t>wallace_stat.txt</w:t>
+      </w:r>
+      <w:r>
+        <w:rPr>
+          <w:rFonts w:ascii="Times New Roman" w:hAnsi="Times New Roman" w:eastAsia="宋体"/>
+          <w:b w:val="0"/>
+          <w:i w:val="0"/>
+          <w:sz w:val="21"/>
+        </w:rPr>
+        <w:t xml:space="preserve"> / </w:t>
+      </w:r>
+      <w:r>
+        <w:rPr>
+          <w:rFonts w:ascii="Consolas" w:hAnsi="Consolas" w:eastAsia="宋体"/>
+          <w:b w:val="0"/>
+          <w:i w:val="0"/>
+          <w:color w:val="B03030"/>
+          <w:sz w:val="19"/>
+        </w:rPr>
+        <w:t>wallace_ltp.txt</w:t>
+      </w:r>
+      <w:r>
+        <w:rPr>
+          <w:rFonts w:ascii="Times New Roman" w:hAnsi="Times New Roman" w:eastAsia="宋体"/>
+          <w:b w:val="0"/>
+          <w:i w:val="0"/>
+          <w:sz w:val="21"/>
+        </w:rPr>
+        <w:t xml:space="preserve"> 节选，逐字对照）：</w:t>
+      </w:r>
+    </w:p>
+    <w:p>
+      <w:pPr>
+        <w:spacing w:before="120" w:after="0" w:line="240" w:lineRule="auto"/>
+        <w:ind w:left="227"/>
+        <w:shd w:val="clear" w:fill="F2F2F2"/>
+      </w:pPr>
+      <w:r>
+        <w:rPr>
+          <w:rFonts w:ascii="Consolas" w:hAnsi="Consolas" w:eastAsia="宋体"/>
+          <w:b w:val="0"/>
+          <w:i w:val="0"/>
+          <w:sz w:val="18"/>
+        </w:rPr>
+        <w:t>=== MULT ===</w:t>
+      </w:r>
+    </w:p>
+    <w:p>
+      <w:pPr>
+        <w:spacing w:before="0" w:after="0" w:line="240" w:lineRule="auto"/>
+        <w:ind w:left="227"/>
+        <w:shd w:val="clear" w:fill="F2F2F2"/>
+      </w:pPr>
+      <w:r>
+        <w:rPr>
+          <w:rFonts w:ascii="Consolas" w:hAnsi="Consolas" w:eastAsia="宋体"/>
+          <w:b w:val="0"/>
+          <w:i w:val="0"/>
+          <w:sz w:val="18"/>
+        </w:rPr>
+        <w:t xml:space="preserve">      433 wires</w:t>
+      </w:r>
+    </w:p>
+    <w:p>
+      <w:pPr>
+        <w:spacing w:before="0" w:after="0" w:line="240" w:lineRule="auto"/>
+        <w:ind w:left="227"/>
+        <w:shd w:val="clear" w:fill="F2F2F2"/>
+      </w:pPr>
+      <w:r>
+        <w:rPr>
+          <w:rFonts w:ascii="Consolas" w:hAnsi="Consolas" w:eastAsia="宋体"/>
+          <w:b w:val="0"/>
+          <w:i w:val="0"/>
+          <w:sz w:val="18"/>
+        </w:rPr>
+        <w:t xml:space="preserve">      381 cells</w:t>
+      </w:r>
+    </w:p>
+    <w:p>
+      <w:pPr>
+        <w:spacing w:before="0" w:after="0" w:line="240" w:lineRule="auto"/>
+        <w:ind w:left="227"/>
+        <w:shd w:val="clear" w:fill="F2F2F2"/>
+      </w:pPr>
+      <w:r>
+        <w:rPr>
+          <w:rFonts w:ascii="Consolas" w:hAnsi="Consolas" w:eastAsia="宋体"/>
+          <w:b w:val="0"/>
+          <w:i w:val="0"/>
+          <w:sz w:val="18"/>
+        </w:rPr>
+        <w:t xml:space="preserve">       96   $_AND_</w:t>
+      </w:r>
+    </w:p>
+    <w:p>
+      <w:pPr>
+        <w:spacing w:before="0" w:after="0" w:line="240" w:lineRule="auto"/>
+        <w:ind w:left="227"/>
+        <w:shd w:val="clear" w:fill="F2F2F2"/>
+      </w:pPr>
+      <w:r>
+        <w:rPr>
+          <w:rFonts w:ascii="Consolas" w:hAnsi="Consolas" w:eastAsia="宋体"/>
+          <w:b w:val="0"/>
+          <w:i w:val="0"/>
+          <w:sz w:val="18"/>
+        </w:rPr>
+        <w:t xml:space="preserve">      144   $_NAND_</w:t>
+      </w:r>
+    </w:p>
+    <w:p>
+      <w:pPr>
+        <w:spacing w:before="0" w:after="120" w:line="240" w:lineRule="auto"/>
+        <w:ind w:left="227"/>
+        <w:shd w:val="clear" w:fill="F2F2F2"/>
+      </w:pPr>
+      <w:r>
+        <w:rPr>
+          <w:rFonts w:ascii="Consolas" w:hAnsi="Consolas" w:eastAsia="宋体"/>
+          <w:b w:val="0"/>
+          <w:i w:val="0"/>
+          <w:sz w:val="18"/>
+        </w:rPr>
+        <w:t>Longest topological path in MULT (length=28):</w:t>
+      </w:r>
+    </w:p>
+    <w:p>
+      <w:pPr>
+        <w:spacing w:before="80" w:after="80"/>
+        <w:ind w:left="425"/>
+        <w:pBdr>
+          <w:left w:val="single" w:sz="18" w:space="4" w:color="2E74B5"/>
+        </w:pBdr>
+      </w:pPr>
+      <w:r>
+        <w:rPr>
+          <w:rFonts w:ascii="Times New Roman" w:hAnsi="Times New Roman" w:eastAsia="宋体"/>
+          <w:b w:val="0"/>
+          <w:i w:val="0"/>
+          <w:sz w:val="20"/>
+        </w:rPr>
+        <w:t>不同版本工具链数值可能略有出入（±5% 以内可接受），但 Wallace「路径更短、单元略多」的相对结论必须成立。</w:t>
+      </w:r>
     </w:p>
     <w:p>
       <w:pPr>
@@ -6931,7 +10440,7 @@
           <w:color w:val="000000"/>
           <w:sz w:val="32"/>
         </w:rPr>
-        <w:t>实验三 全流水脉动阵列矩阵乘法器</w:t>
+        <w:t>第五部分 实验三：全流水脉动阵列矩阵乘法器</w:t>
       </w:r>
     </w:p>
     <w:p>
@@ -7553,7 +11062,7 @@
         <w:drawing>
           <wp:inline xmlns:a="http://schemas.openxmlformats.org/drawingml/2006/main" xmlns:pic="http://schemas.openxmlformats.org/drawingml/2006/picture">
             <wp:extent cx="4480560" cy="2444496"/>
-            <wp:docPr id="3" name="Picture 3"/>
+            <wp:docPr id="5" name="Picture 5"/>
             <wp:cNvGraphicFramePr>
               <a:graphicFrameLocks noChangeAspect="1"/>
             </wp:cNvGraphicFramePr>
@@ -7565,7 +11074,7 @@
                     <pic:cNvPicPr/>
                   </pic:nvPicPr>
                   <pic:blipFill>
-                    <a:blip r:embed="rId12"/>
+                    <a:blip r:embed="rId14"/>
                     <a:stretch>
                       <a:fillRect/>
                     </a:stretch>
@@ -7641,7 +11150,7 @@
         <w:drawing>
           <wp:inline xmlns:a="http://schemas.openxmlformats.org/drawingml/2006/main" xmlns:pic="http://schemas.openxmlformats.org/drawingml/2006/picture">
             <wp:extent cx="5220000" cy="3722791"/>
-            <wp:docPr id="4" name="Picture 4"/>
+            <wp:docPr id="6" name="Picture 6"/>
             <wp:cNvGraphicFramePr>
               <a:graphicFrameLocks noChangeAspect="1"/>
             </wp:cNvGraphicFramePr>
@@ -7653,7 +11162,7 @@
                     <pic:cNvPicPr/>
                   </pic:nvPicPr>
                   <pic:blipFill>
-                    <a:blip r:embed="rId13"/>
+                    <a:blip r:embed="rId15"/>
                     <a:stretch>
                       <a:fillRect/>
                     </a:stretch>
@@ -9062,7 +12571,7 @@
         <w:drawing>
           <wp:inline xmlns:a="http://schemas.openxmlformats.org/drawingml/2006/main" xmlns:pic="http://schemas.openxmlformats.org/drawingml/2006/picture">
             <wp:extent cx="5220000" cy="3253043"/>
-            <wp:docPr id="5" name="Picture 5"/>
+            <wp:docPr id="7" name="Picture 7"/>
             <wp:cNvGraphicFramePr>
               <a:graphicFrameLocks noChangeAspect="1"/>
             </wp:cNvGraphicFramePr>
@@ -9074,7 +12583,7 @@
                     <pic:cNvPicPr/>
                   </pic:nvPicPr>
                   <pic:blipFill>
-                    <a:blip r:embed="rId14"/>
+                    <a:blip r:embed="rId16"/>
                     <a:stretch>
                       <a:fillRect/>
                     </a:stretch>
@@ -10280,11 +13789,20 @@
       <w:r>
         <w:rPr>
           <w:rFonts w:ascii="Times New Roman" w:hAnsi="Times New Roman" w:eastAsia="宋体"/>
-          <w:b w:val="0"/>
+          <w:b/>
           <w:i w:val="0"/>
           <w:sz w:val="21"/>
         </w:rPr>
-        <w:t>参考运行结果：</w:t>
+        <w:t>预期终端输出</w:t>
+      </w:r>
+      <w:r>
+        <w:rPr>
+          <w:rFonts w:ascii="Times New Roman" w:hAnsi="Times New Roman" w:eastAsia="宋体"/>
+          <w:b w:val="0"/>
+          <w:i w:val="0"/>
+          <w:sz w:val="21"/>
+        </w:rPr>
+        <w:t>（自检基准，两版本输出完全一致，应逐字一致）：</w:t>
       </w:r>
     </w:p>
     <w:p>
@@ -10300,7 +13818,7 @@
           <w:i w:val="0"/>
           <w:sz w:val="18"/>
         </w:rPr>
-        <w:t>[CHECK m0] Y[0][0]=1 ... [CHECK m1] @t=14 ... [CHECK m2] Y=K2*X2</w:t>
+        <w:t>VCD info: dumpfile wave.vcd opened for output.</w:t>
       </w:r>
     </w:p>
     <w:p>
@@ -10316,7 +13834,103 @@
           <w:i w:val="0"/>
           <w:sz w:val="18"/>
         </w:rPr>
-        <w:t>Errors: 0</w:t>
+        <w:t>[CHECK] matrix m0: res correct at t=10</w:t>
+      </w:r>
+    </w:p>
+    <w:p>
+      <w:pPr>
+        <w:spacing w:before="0" w:after="0" w:line="240" w:lineRule="auto"/>
+        <w:ind w:left="227"/>
+        <w:shd w:val="clear" w:fill="F2F2F2"/>
+      </w:pPr>
+      <w:r>
+        <w:rPr>
+          <w:rFonts w:ascii="Consolas" w:hAnsi="Consolas" w:eastAsia="宋体"/>
+          <w:b w:val="0"/>
+          <w:i w:val="0"/>
+          <w:sz w:val="18"/>
+        </w:rPr>
+        <w:t>[CHECK] matrix m1: res correct at t=14</w:t>
+      </w:r>
+    </w:p>
+    <w:p>
+      <w:pPr>
+        <w:spacing w:before="0" w:after="0" w:line="240" w:lineRule="auto"/>
+        <w:ind w:left="227"/>
+        <w:shd w:val="clear" w:fill="F2F2F2"/>
+      </w:pPr>
+      <w:r>
+        <w:rPr>
+          <w:rFonts w:ascii="Consolas" w:hAnsi="Consolas" w:eastAsia="宋体"/>
+          <w:b w:val="0"/>
+          <w:i w:val="0"/>
+          <w:sz w:val="18"/>
+        </w:rPr>
+        <w:t>[CHECK] matrix m2: res correct at t=10</w:t>
+      </w:r>
+    </w:p>
+    <w:p>
+      <w:pPr>
+        <w:spacing w:before="0" w:after="0" w:line="240" w:lineRule="auto"/>
+        <w:ind w:left="227"/>
+        <w:shd w:val="clear" w:fill="F2F2F2"/>
+      </w:pPr>
+      <w:r>
+        <w:rPr>
+          <w:rFonts w:ascii="Consolas" w:hAnsi="Consolas" w:eastAsia="宋体"/>
+          <w:b w:val="0"/>
+          <w:i w:val="0"/>
+          <w:sz w:val="18"/>
+        </w:rPr>
+        <w:t>==============================================</w:t>
+      </w:r>
+    </w:p>
+    <w:p>
+      <w:pPr>
+        <w:spacing w:before="0" w:after="0" w:line="240" w:lineRule="auto"/>
+        <w:ind w:left="227"/>
+        <w:shd w:val="clear" w:fill="F2F2F2"/>
+      </w:pPr>
+      <w:r>
+        <w:rPr>
+          <w:rFonts w:ascii="Consolas" w:hAnsi="Consolas" w:eastAsia="宋体"/>
+          <w:b w:val="0"/>
+          <w:i w:val="0"/>
+          <w:sz w:val="18"/>
+        </w:rPr>
+        <w:t>Errors : 0</w:t>
+      </w:r>
+    </w:p>
+    <w:p>
+      <w:pPr>
+        <w:spacing w:before="0" w:after="0" w:line="240" w:lineRule="auto"/>
+        <w:ind w:left="227"/>
+        <w:shd w:val="clear" w:fill="F2F2F2"/>
+      </w:pPr>
+      <w:r>
+        <w:rPr>
+          <w:rFonts w:ascii="Consolas" w:hAnsi="Consolas" w:eastAsia="宋体"/>
+          <w:b w:val="0"/>
+          <w:i w:val="0"/>
+          <w:sz w:val="18"/>
+        </w:rPr>
+        <w:t>RESULT: PASS</w:t>
+      </w:r>
+    </w:p>
+    <w:p>
+      <w:pPr>
+        <w:spacing w:before="0" w:after="0" w:line="240" w:lineRule="auto"/>
+        <w:ind w:left="227"/>
+        <w:shd w:val="clear" w:fill="F2F2F2"/>
+      </w:pPr>
+      <w:r>
+        <w:rPr>
+          <w:rFonts w:ascii="Consolas" w:hAnsi="Consolas" w:eastAsia="宋体"/>
+          <w:b w:val="0"/>
+          <w:i w:val="0"/>
+          <w:sz w:val="18"/>
+        </w:rPr>
+        <w:t>==============================================</w:t>
       </w:r>
     </w:p>
     <w:p>
@@ -10332,7 +13946,170 @@
           <w:i w:val="0"/>
           <w:sz w:val="18"/>
         </w:rPr>
-        <w:t>RESULT: PASS</w:t>
+        <w:t>../tb/tb_MULT.v:199: $finish called at 306000 (1ps)</w:t>
+      </w:r>
+    </w:p>
+    <w:p>
+      <w:pPr>
+        <w:pStyle w:val="ListBullet"/>
+        <w:spacing w:after="40"/>
+      </w:pPr>
+      <w:r>
+        <w:rPr>
+          <w:rFonts w:ascii="Consolas" w:hAnsi="Consolas" w:eastAsia="宋体"/>
+          <w:b w:val="0"/>
+          <w:i w:val="0"/>
+          <w:color w:val="B03030"/>
+          <w:sz w:val="19"/>
+        </w:rPr>
+        <w:t>m0</w:t>
+      </w:r>
+      <w:r>
+        <w:rPr>
+          <w:rFonts w:ascii="Times New Roman" w:hAnsi="Times New Roman" w:eastAsia="宋体"/>
+          <w:b w:val="0"/>
+          <w:i w:val="0"/>
+          <w:sz w:val="21"/>
+        </w:rPr>
+        <w:t xml:space="preserve"> 于 </w:t>
+      </w:r>
+      <w:r>
+        <w:rPr>
+          <w:rFonts w:ascii="Times New Roman" w:hAnsi="Times New Roman" w:eastAsia="宋体"/>
+          <w:b/>
+          <w:i w:val="0"/>
+          <w:sz w:val="21"/>
+        </w:rPr>
+        <w:t>t=10</w:t>
+      </w:r>
+      <w:r>
+        <w:rPr>
+          <w:rFonts w:ascii="Times New Roman" w:hAnsi="Times New Roman" w:eastAsia="宋体"/>
+          <w:b w:val="0"/>
+          <w:i w:val="0"/>
+          <w:sz w:val="21"/>
+        </w:rPr>
+        <w:t xml:space="preserve"> 正确：验证延迟公式 t=4m+10</w:t>
+      </w:r>
+    </w:p>
+    <w:p>
+      <w:pPr>
+        <w:pStyle w:val="ListBullet"/>
+        <w:spacing w:after="40"/>
+      </w:pPr>
+      <w:r>
+        <w:rPr>
+          <w:rFonts w:ascii="Consolas" w:hAnsi="Consolas" w:eastAsia="宋体"/>
+          <w:b w:val="0"/>
+          <w:i w:val="0"/>
+          <w:color w:val="B03030"/>
+          <w:sz w:val="19"/>
+        </w:rPr>
+        <w:t>m1</w:t>
+      </w:r>
+      <w:r>
+        <w:rPr>
+          <w:rFonts w:ascii="Times New Roman" w:hAnsi="Times New Roman" w:eastAsia="宋体"/>
+          <w:b w:val="0"/>
+          <w:i w:val="0"/>
+          <w:sz w:val="21"/>
+        </w:rPr>
+        <w:t xml:space="preserve"> 于 </w:t>
+      </w:r>
+      <w:r>
+        <w:rPr>
+          <w:rFonts w:ascii="Times New Roman" w:hAnsi="Times New Roman" w:eastAsia="宋体"/>
+          <w:b/>
+          <w:i w:val="0"/>
+          <w:sz w:val="21"/>
+        </w:rPr>
+        <w:t>t=14</w:t>
+      </w:r>
+      <w:r>
+        <w:rPr>
+          <w:rFonts w:ascii="Times New Roman" w:hAnsi="Times New Roman" w:eastAsia="宋体"/>
+          <w:b w:val="0"/>
+          <w:i w:val="0"/>
+          <w:sz w:val="21"/>
+        </w:rPr>
+        <w:t xml:space="preserve"> 正确：验证 II=4 连续流水互不污染</w:t>
+      </w:r>
+    </w:p>
+    <w:p>
+      <w:pPr>
+        <w:pStyle w:val="ListBullet"/>
+        <w:spacing w:after="40"/>
+      </w:pPr>
+      <w:r>
+        <w:rPr>
+          <w:rFonts w:ascii="Consolas" w:hAnsi="Consolas" w:eastAsia="宋体"/>
+          <w:b w:val="0"/>
+          <w:i w:val="0"/>
+          <w:color w:val="B03030"/>
+          <w:sz w:val="19"/>
+        </w:rPr>
+        <w:t>m2</w:t>
+      </w:r>
+      <w:r>
+        <w:rPr>
+          <w:rFonts w:ascii="Times New Roman" w:hAnsi="Times New Roman" w:eastAsia="宋体"/>
+          <w:b w:val="0"/>
+          <w:i w:val="0"/>
+          <w:sz w:val="21"/>
+        </w:rPr>
+        <w:t xml:space="preserve"> 于 </w:t>
+      </w:r>
+      <w:r>
+        <w:rPr>
+          <w:rFonts w:ascii="Times New Roman" w:hAnsi="Times New Roman" w:eastAsia="宋体"/>
+          <w:b/>
+          <w:i w:val="0"/>
+          <w:sz w:val="21"/>
+        </w:rPr>
+        <w:t>t=10</w:t>
+      </w:r>
+      <w:r>
+        <w:rPr>
+          <w:rFonts w:ascii="Times New Roman" w:hAnsi="Times New Roman" w:eastAsia="宋体"/>
+          <w:b w:val="0"/>
+          <w:i w:val="0"/>
+          <w:sz w:val="21"/>
+        </w:rPr>
+        <w:t xml:space="preserve"> 正确：验证 load 清空流水、无旧值残留</w:t>
+      </w:r>
+    </w:p>
+    <w:p>
+      <w:pPr>
+        <w:pStyle w:val="ListBullet"/>
+        <w:spacing w:after="40"/>
+      </w:pPr>
+      <w:r>
+        <w:rPr>
+          <w:rFonts w:ascii="Times New Roman" w:hAnsi="Times New Roman" w:eastAsia="宋体"/>
+          <w:b w:val="0"/>
+          <w:i w:val="0"/>
+          <w:sz w:val="21"/>
+        </w:rPr>
+        <w:t xml:space="preserve">若出现 </w:t>
+      </w:r>
+      <w:r>
+        <w:rPr>
+          <w:rFonts w:ascii="Consolas" w:hAnsi="Consolas" w:eastAsia="宋体"/>
+          <w:b w:val="0"/>
+          <w:i w:val="0"/>
+          <w:color w:val="B03030"/>
+          <w:sz w:val="19"/>
+        </w:rPr>
+        <w:t>ERROR</w:t>
+      </w:r>
+      <w:r>
+        <w:rPr>
+          <w:rFonts w:ascii="Times New Roman" w:hAnsi="Times New Roman" w:eastAsia="宋体"/>
+          <w:b w:val="0"/>
+          <w:i w:val="0"/>
+          <w:sz w:val="21"/>
+        </w:rPr>
+        <w:t>，错误行打印期望/实际字段值，按字段索引 (i,j) 反查对应 PE 与延迟链</w:t>
       </w:r>
     </w:p>
     <w:p>
@@ -10358,7 +14135,7 @@
         <w:drawing>
           <wp:inline xmlns:a="http://schemas.openxmlformats.org/drawingml/2006/main" xmlns:pic="http://schemas.openxmlformats.org/drawingml/2006/picture">
             <wp:extent cx="5220000" cy="2955904"/>
-            <wp:docPr id="6" name="Picture 6"/>
+            <wp:docPr id="8" name="Picture 8"/>
             <wp:cNvGraphicFramePr>
               <a:graphicFrameLocks noChangeAspect="1"/>
             </wp:cNvGraphicFramePr>
@@ -10370,7 +14147,7 @@
                     <pic:cNvPicPr/>
                   </pic:nvPicPr>
                   <pic:blipFill>
-                    <a:blip r:embed="rId15"/>
+                    <a:blip r:embed="rId17"/>
                     <a:stretch>
                       <a:fillRect/>
                     </a:stretch>
@@ -10720,6 +14497,239 @@
       <w:pPr>
         <w:spacing w:after="0"/>
       </w:pPr>
+    </w:p>
+    <w:p>
+      <w:pPr>
+        <w:spacing w:line="360" w:lineRule="auto" w:after="60"/>
+        <w:ind w:firstLine="420"/>
+      </w:pPr>
+      <w:r>
+        <w:rPr>
+          <w:rFonts w:ascii="Times New Roman" w:hAnsi="Times New Roman" w:eastAsia="宋体"/>
+          <w:b w:val="0"/>
+          <w:i w:val="0"/>
+          <w:sz w:val="21"/>
+        </w:rPr>
+        <w:t xml:space="preserve">综合输出实样（复用版 </w:t>
+      </w:r>
+      <w:r>
+        <w:rPr>
+          <w:rFonts w:ascii="Consolas" w:hAnsi="Consolas" w:eastAsia="宋体"/>
+          <w:b w:val="0"/>
+          <w:i w:val="0"/>
+          <w:color w:val="B03030"/>
+          <w:sz w:val="19"/>
+        </w:rPr>
+        <w:t>systolic_stat.txt</w:t>
+      </w:r>
+      <w:r>
+        <w:rPr>
+          <w:rFonts w:ascii="Times New Roman" w:hAnsi="Times New Roman" w:eastAsia="宋体"/>
+          <w:b w:val="0"/>
+          <w:i w:val="0"/>
+          <w:sz w:val="21"/>
+        </w:rPr>
+        <w:t xml:space="preserve"> / </w:t>
+      </w:r>
+      <w:r>
+        <w:rPr>
+          <w:rFonts w:ascii="Consolas" w:hAnsi="Consolas" w:eastAsia="宋体"/>
+          <w:b w:val="0"/>
+          <w:i w:val="0"/>
+          <w:color w:val="B03030"/>
+          <w:sz w:val="19"/>
+        </w:rPr>
+        <w:t>systolic_ltp.txt</w:t>
+      </w:r>
+      <w:r>
+        <w:rPr>
+          <w:rFonts w:ascii="Times New Roman" w:hAnsi="Times New Roman" w:eastAsia="宋体"/>
+          <w:b w:val="0"/>
+          <w:i w:val="0"/>
+          <w:sz w:val="21"/>
+        </w:rPr>
+        <w:t xml:space="preserve"> 节选，逐字对照）：</w:t>
+      </w:r>
+    </w:p>
+    <w:p>
+      <w:pPr>
+        <w:spacing w:before="120" w:after="0" w:line="240" w:lineRule="auto"/>
+        <w:ind w:left="227"/>
+        <w:shd w:val="clear" w:fill="F2F2F2"/>
+      </w:pPr>
+      <w:r>
+        <w:rPr>
+          <w:rFonts w:ascii="Consolas" w:hAnsi="Consolas" w:eastAsia="宋体"/>
+          <w:b w:val="0"/>
+          <w:i w:val="0"/>
+          <w:sz w:val="18"/>
+        </w:rPr>
+        <w:t>=== MULT ===</w:t>
+      </w:r>
+    </w:p>
+    <w:p>
+      <w:pPr>
+        <w:spacing w:before="0" w:after="0" w:line="240" w:lineRule="auto"/>
+        <w:ind w:left="227"/>
+        <w:shd w:val="clear" w:fill="F2F2F2"/>
+      </w:pPr>
+      <w:r>
+        <w:rPr>
+          <w:rFonts w:ascii="Consolas" w:hAnsi="Consolas" w:eastAsia="宋体"/>
+          <w:b w:val="0"/>
+          <w:i w:val="0"/>
+          <w:sz w:val="18"/>
+        </w:rPr>
+        <w:t xml:space="preserve">     7922 wires</w:t>
+      </w:r>
+    </w:p>
+    <w:p>
+      <w:pPr>
+        <w:spacing w:before="0" w:after="0" w:line="240" w:lineRule="auto"/>
+        <w:ind w:left="227"/>
+        <w:shd w:val="clear" w:fill="F2F2F2"/>
+      </w:pPr>
+      <w:r>
+        <w:rPr>
+          <w:rFonts w:ascii="Consolas" w:hAnsi="Consolas" w:eastAsia="宋体"/>
+          <w:b w:val="0"/>
+          <w:i w:val="0"/>
+          <w:sz w:val="18"/>
+        </w:rPr>
+        <w:t xml:space="preserve">     8547 cells</w:t>
+      </w:r>
+    </w:p>
+    <w:p>
+      <w:pPr>
+        <w:spacing w:before="0" w:after="0" w:line="240" w:lineRule="auto"/>
+        <w:ind w:left="227"/>
+        <w:shd w:val="clear" w:fill="F2F2F2"/>
+      </w:pPr>
+      <w:r>
+        <w:rPr>
+          <w:rFonts w:ascii="Consolas" w:hAnsi="Consolas" w:eastAsia="宋体"/>
+          <w:b w:val="0"/>
+          <w:i w:val="0"/>
+          <w:sz w:val="18"/>
+        </w:rPr>
+        <w:t xml:space="preserve">      432   $_SDFFE_PN0P_</w:t>
+      </w:r>
+    </w:p>
+    <w:p>
+      <w:pPr>
+        <w:spacing w:before="0" w:after="0" w:line="240" w:lineRule="auto"/>
+        <w:ind w:left="227"/>
+        <w:shd w:val="clear" w:fill="F2F2F2"/>
+      </w:pPr>
+      <w:r>
+        <w:rPr>
+          <w:rFonts w:ascii="Consolas" w:hAnsi="Consolas" w:eastAsia="宋体"/>
+          <w:b w:val="0"/>
+          <w:i w:val="0"/>
+          <w:sz w:val="18"/>
+        </w:rPr>
+        <w:t xml:space="preserve">      720   $_SDFF_PP0_</w:t>
+      </w:r>
+    </w:p>
+    <w:p>
+      <w:pPr>
+        <w:spacing w:before="0" w:after="0" w:line="240" w:lineRule="auto"/>
+        <w:ind w:left="227"/>
+        <w:shd w:val="clear" w:fill="F2F2F2"/>
+      </w:pPr>
+      <w:r>
+        <w:rPr>
+          <w:rFonts w:ascii="Consolas" w:hAnsi="Consolas" w:eastAsia="宋体"/>
+          <w:b w:val="0"/>
+          <w:i w:val="0"/>
+          <w:sz w:val="18"/>
+        </w:rPr>
+        <w:t xml:space="preserve">     2068   $_AND_</w:t>
+      </w:r>
+    </w:p>
+    <w:p>
+      <w:pPr>
+        <w:spacing w:before="0" w:after="0" w:line="240" w:lineRule="auto"/>
+        <w:ind w:left="227"/>
+        <w:shd w:val="clear" w:fill="F2F2F2"/>
+      </w:pPr>
+      <w:r>
+        <w:rPr>
+          <w:rFonts w:ascii="Consolas" w:hAnsi="Consolas" w:eastAsia="宋体"/>
+          <w:b w:val="0"/>
+          <w:i w:val="0"/>
+          <w:sz w:val="18"/>
+        </w:rPr>
+        <w:t xml:space="preserve">     2276   $_NAND_</w:t>
+      </w:r>
+    </w:p>
+    <w:p>
+      <w:pPr>
+        <w:spacing w:before="0" w:after="120" w:line="240" w:lineRule="auto"/>
+        <w:ind w:left="227"/>
+        <w:shd w:val="clear" w:fill="F2F2F2"/>
+      </w:pPr>
+      <w:r>
+        <w:rPr>
+          <w:rFonts w:ascii="Consolas" w:hAnsi="Consolas" w:eastAsia="宋体"/>
+          <w:b w:val="0"/>
+          <w:i w:val="0"/>
+          <w:sz w:val="18"/>
+        </w:rPr>
+        <w:t>Longest topological path in MULT (length=37):</w:t>
+      </w:r>
+    </w:p>
+    <w:p>
+      <w:pPr>
+        <w:spacing w:line="360" w:lineRule="auto" w:after="60"/>
+        <w:ind w:firstLine="420"/>
+      </w:pPr>
+      <w:r>
+        <w:rPr>
+          <w:rFonts w:ascii="Times New Roman" w:hAnsi="Times New Roman" w:eastAsia="宋体"/>
+          <w:b w:val="0"/>
+          <w:i w:val="0"/>
+          <w:sz w:val="21"/>
+        </w:rPr>
+        <w:t>（</w:t>
+      </w:r>
+      <w:r>
+        <w:rPr>
+          <w:rFonts w:ascii="Consolas" w:hAnsi="Consolas" w:eastAsia="宋体"/>
+          <w:b w:val="0"/>
+          <w:i w:val="0"/>
+          <w:color w:val="B03030"/>
+          <w:sz w:val="19"/>
+        </w:rPr>
+        <w:t>$_SDFF*</w:t>
+      </w:r>
+      <w:r>
+        <w:rPr>
+          <w:rFonts w:ascii="Times New Roman" w:hAnsi="Times New Roman" w:eastAsia="宋体"/>
+          <w:b w:val="0"/>
+          <w:i w:val="0"/>
+          <w:sz w:val="21"/>
+        </w:rPr>
+        <w:t xml:space="preserve"> 即触发器单元，合计约 1150 个，是"约 1200 个触发器"的直接出处。）</w:t>
+      </w:r>
+    </w:p>
+    <w:p>
+      <w:pPr>
+        <w:spacing w:before="80" w:after="80"/>
+        <w:ind w:left="425"/>
+        <w:pBdr>
+          <w:left w:val="single" w:sz="18" w:space="4" w:color="2E74B5"/>
+        </w:pBdr>
+      </w:pPr>
+      <w:r>
+        <w:rPr>
+          <w:rFonts w:ascii="Times New Roman" w:hAnsi="Times New Roman" w:eastAsia="宋体"/>
+          <w:b w:val="0"/>
+          <w:i w:val="0"/>
+          <w:sz w:val="20"/>
+        </w:rPr>
+        <w:t>不同版本工具链数值可能略有出入（±5% 以内可接受），但「两版关键路径几乎相同、面积差约 3%」的相对结论必须成立。</w:t>
+      </w:r>
     </w:p>
     <w:p>
       <w:pPr>
@@ -11458,7 +15468,7 @@
         <w:drawing>
           <wp:inline xmlns:a="http://schemas.openxmlformats.org/drawingml/2006/main" xmlns:pic="http://schemas.openxmlformats.org/drawingml/2006/picture">
             <wp:extent cx="5220000" cy="2681715"/>
-            <wp:docPr id="7" name="Picture 7"/>
+            <wp:docPr id="9" name="Picture 9"/>
             <wp:cNvGraphicFramePr>
               <a:graphicFrameLocks noChangeAspect="1"/>
             </wp:cNvGraphicFramePr>
@@ -11470,7 +15480,7 @@
                     <pic:cNvPicPr/>
                   </pic:nvPicPr>
                   <pic:blipFill>
-                    <a:blip r:embed="rId16"/>
+                    <a:blip r:embed="rId18"/>
                     <a:stretch>
                       <a:fillRect/>
                     </a:stretch>
@@ -11528,7 +15538,7 @@
         <w:drawing>
           <wp:inline xmlns:a="http://schemas.openxmlformats.org/drawingml/2006/main" xmlns:pic="http://schemas.openxmlformats.org/drawingml/2006/picture">
             <wp:extent cx="3846576" cy="3377184"/>
-            <wp:docPr id="8" name="Picture 8"/>
+            <wp:docPr id="10" name="Picture 10"/>
             <wp:cNvGraphicFramePr>
               <a:graphicFrameLocks noChangeAspect="1"/>
             </wp:cNvGraphicFramePr>
@@ -11540,7 +15550,7 @@
                     <pic:cNvPicPr/>
                   </pic:nvPicPr>
                   <pic:blipFill>
-                    <a:blip r:embed="rId17"/>
+                    <a:blip r:embed="rId19"/>
                     <a:stretch>
                       <a:fillRect/>
                     </a:stretch>
@@ -11616,7 +15626,7 @@
         <w:drawing>
           <wp:inline xmlns:a="http://schemas.openxmlformats.org/drawingml/2006/main" xmlns:pic="http://schemas.openxmlformats.org/drawingml/2006/picture">
             <wp:extent cx="3041903" cy="2389631"/>
-            <wp:docPr id="9" name="Picture 9"/>
+            <wp:docPr id="11" name="Picture 11"/>
             <wp:cNvGraphicFramePr>
               <a:graphicFrameLocks noChangeAspect="1"/>
             </wp:cNvGraphicFramePr>
@@ -11628,7 +15638,7 @@
                     <pic:cNvPicPr/>
                   </pic:nvPicPr>
                   <pic:blipFill>
-                    <a:blip r:embed="rId18"/>
+                    <a:blip r:embed="rId20"/>
                     <a:stretch>
                       <a:fillRect/>
                     </a:stretch>
@@ -11720,7 +15730,7 @@
         <w:drawing>
           <wp:inline xmlns:a="http://schemas.openxmlformats.org/drawingml/2006/main" xmlns:pic="http://schemas.openxmlformats.org/drawingml/2006/picture">
             <wp:extent cx="5220000" cy="2890735"/>
-            <wp:docPr id="10" name="Picture 10"/>
+            <wp:docPr id="12" name="Picture 12"/>
             <wp:cNvGraphicFramePr>
               <a:graphicFrameLocks noChangeAspect="1"/>
             </wp:cNvGraphicFramePr>
@@ -11732,7 +15742,7 @@
                     <pic:cNvPicPr/>
                   </pic:nvPicPr>
                   <pic:blipFill>
-                    <a:blip r:embed="rId19"/>
+                    <a:blip r:embed="rId21"/>
                     <a:stretch>
                       <a:fillRect/>
                     </a:stretch>

</xml_diff>

<commit_message>
Add minimal env self-check case with full inline code to env guide and complete manual; remove dates from all repo docs and docx cover; rebuild docx
</commit_message>
<xml_diff>
--- a/Reference/manual/数字电路实验参考手册.docx
+++ b/Reference/manual/数字电路实验参考手册.docx
@@ -126,20 +126,6 @@
       </w:r>
     </w:p>
     <w:p>
-      <w:pPr>
-        <w:jc w:val="center"/>
-      </w:pPr>
-      <w:r>
-        <w:rPr>
-          <w:rFonts w:ascii="Times New Roman" w:hAnsi="Times New Roman" w:eastAsia="宋体"/>
-          <w:b w:val="0"/>
-          <w:i w:val="0"/>
-          <w:sz w:val="24"/>
-        </w:rPr>
-        <w:t>版本日期：2026 年 10 月</w:t>
-      </w:r>
-    </w:p>
-    <w:p>
       <w:r>
         <w:br w:type="page"/>
       </w:r>
@@ -299,7 +285,7 @@
           <w:i w:val="0"/>
           <w:sz w:val="21"/>
         </w:rPr>
-        <w:t>：文中所有仿真/综合数据均来自参考实现的真实运行结果（2026-10-12，Windows 11 + Icarus Verilog + Yosys，OSS CAD Suite 1.4.0）</w:t>
+        <w:t>：文中所有仿真/综合数据均来自参考实现的真实运行结果（Windows 11 + Icarus Verilog 14 + Yosys，OSS CAD Suite）</w:t>
       </w:r>
     </w:p>
     <w:p>
@@ -2412,7 +2398,7 @@
           <w:color w:val="000000"/>
           <w:sz w:val="28"/>
         </w:rPr>
-        <w:t>3. 全链路自检（4 位加法器示例）</w:t>
+        <w:t>3. 环境自检：极小示例</w:t>
       </w:r>
     </w:p>
     <w:p>
@@ -2427,8 +2413,32 @@
           <w:i w:val="0"/>
           <w:sz w:val="21"/>
         </w:rPr>
-        <w:t xml:space="preserve">用最小例子验证「编译 → 仿真 → 波形 → 综合」全链路。新建 </w:t>
-      </w:r>
+        <w:t>安装完成后，用一个</w:t>
+      </w:r>
+      <w:r>
+        <w:rPr>
+          <w:rFonts w:ascii="Times New Roman" w:hAnsi="Times New Roman" w:eastAsia="宋体"/>
+          <w:b/>
+          <w:i w:val="0"/>
+          <w:sz w:val="21"/>
+        </w:rPr>
+        <w:t>极小 case</w:t>
+      </w:r>
+      <w:r>
+        <w:rPr>
+          <w:rFonts w:ascii="Times New Roman" w:hAnsi="Times New Roman" w:eastAsia="宋体"/>
+          <w:b w:val="0"/>
+          <w:i w:val="0"/>
+          <w:sz w:val="21"/>
+        </w:rPr>
+        <w:t xml:space="preserve"> 自我检查「编译 → 仿真 → 波形 → 综合」全链路。新建以下两个文件：</w:t>
+      </w:r>
+    </w:p>
+    <w:p>
+      <w:pPr>
+        <w:spacing w:line="360" w:lineRule="auto" w:after="60"/>
+        <w:ind w:firstLine="420"/>
+      </w:pPr>
       <w:r>
         <w:rPr>
           <w:rFonts w:ascii="Consolas" w:hAnsi="Consolas" w:eastAsia="宋体"/>
@@ -2446,8 +2456,190 @@
           <w:i w:val="0"/>
           <w:sz w:val="21"/>
         </w:rPr>
-        <w:t xml:space="preserve">（4 位加法器）与 </w:t>
-      </w:r>
+        <w:t>（设计，完整内容）：</w:t>
+      </w:r>
+    </w:p>
+    <w:p>
+      <w:pPr>
+        <w:spacing w:before="120" w:after="0" w:line="240" w:lineRule="auto"/>
+        <w:ind w:left="227"/>
+        <w:shd w:val="clear" w:fill="F2F2F2"/>
+      </w:pPr>
+      <w:r>
+        <w:rPr>
+          <w:rFonts w:ascii="Consolas" w:hAnsi="Consolas" w:eastAsia="宋体"/>
+          <w:b w:val="0"/>
+          <w:i w:val="0"/>
+          <w:sz w:val="18"/>
+        </w:rPr>
+        <w:t>module adder4 (</w:t>
+      </w:r>
+    </w:p>
+    <w:p>
+      <w:pPr>
+        <w:spacing w:before="0" w:after="0" w:line="240" w:lineRule="auto"/>
+        <w:ind w:left="227"/>
+        <w:shd w:val="clear" w:fill="F2F2F2"/>
+      </w:pPr>
+      <w:r>
+        <w:rPr>
+          <w:rFonts w:ascii="Consolas" w:hAnsi="Consolas" w:eastAsia="宋体"/>
+          <w:b w:val="0"/>
+          <w:i w:val="0"/>
+          <w:sz w:val="18"/>
+        </w:rPr>
+        <w:t xml:space="preserve">    input  [3:0] a,</w:t>
+      </w:r>
+    </w:p>
+    <w:p>
+      <w:pPr>
+        <w:spacing w:before="0" w:after="0" w:line="240" w:lineRule="auto"/>
+        <w:ind w:left="227"/>
+        <w:shd w:val="clear" w:fill="F2F2F2"/>
+      </w:pPr>
+      <w:r>
+        <w:rPr>
+          <w:rFonts w:ascii="Consolas" w:hAnsi="Consolas" w:eastAsia="宋体"/>
+          <w:b w:val="0"/>
+          <w:i w:val="0"/>
+          <w:sz w:val="18"/>
+        </w:rPr>
+        <w:t xml:space="preserve">    input  [3:0] b,</w:t>
+      </w:r>
+    </w:p>
+    <w:p>
+      <w:pPr>
+        <w:spacing w:before="0" w:after="0" w:line="240" w:lineRule="auto"/>
+        <w:ind w:left="227"/>
+        <w:shd w:val="clear" w:fill="F2F2F2"/>
+      </w:pPr>
+      <w:r>
+        <w:rPr>
+          <w:rFonts w:ascii="Consolas" w:hAnsi="Consolas" w:eastAsia="宋体"/>
+          <w:b w:val="0"/>
+          <w:i w:val="0"/>
+          <w:sz w:val="18"/>
+        </w:rPr>
+        <w:t xml:space="preserve">    input        cin,</w:t>
+      </w:r>
+    </w:p>
+    <w:p>
+      <w:pPr>
+        <w:spacing w:before="0" w:after="0" w:line="240" w:lineRule="auto"/>
+        <w:ind w:left="227"/>
+        <w:shd w:val="clear" w:fill="F2F2F2"/>
+      </w:pPr>
+      <w:r>
+        <w:rPr>
+          <w:rFonts w:ascii="Consolas" w:hAnsi="Consolas" w:eastAsia="宋体"/>
+          <w:b w:val="0"/>
+          <w:i w:val="0"/>
+          <w:sz w:val="18"/>
+        </w:rPr>
+        <w:t xml:space="preserve">    output [3:0] sum,</w:t>
+      </w:r>
+    </w:p>
+    <w:p>
+      <w:pPr>
+        <w:spacing w:before="0" w:after="0" w:line="240" w:lineRule="auto"/>
+        <w:ind w:left="227"/>
+        <w:shd w:val="clear" w:fill="F2F2F2"/>
+      </w:pPr>
+      <w:r>
+        <w:rPr>
+          <w:rFonts w:ascii="Consolas" w:hAnsi="Consolas" w:eastAsia="宋体"/>
+          <w:b w:val="0"/>
+          <w:i w:val="0"/>
+          <w:sz w:val="18"/>
+        </w:rPr>
+        <w:t xml:space="preserve">    output       cout</w:t>
+      </w:r>
+    </w:p>
+    <w:p>
+      <w:pPr>
+        <w:spacing w:before="0" w:after="0" w:line="240" w:lineRule="auto"/>
+        <w:ind w:left="227"/>
+        <w:shd w:val="clear" w:fill="F2F2F2"/>
+      </w:pPr>
+      <w:r>
+        <w:rPr>
+          <w:rFonts w:ascii="Consolas" w:hAnsi="Consolas" w:eastAsia="宋体"/>
+          <w:b w:val="0"/>
+          <w:i w:val="0"/>
+          <w:sz w:val="18"/>
+        </w:rPr>
+        <w:t>);</w:t>
+      </w:r>
+    </w:p>
+    <w:p>
+      <w:pPr>
+        <w:spacing w:before="0" w:after="0" w:line="240" w:lineRule="auto"/>
+        <w:ind w:left="227"/>
+        <w:shd w:val="clear" w:fill="F2F2F2"/>
+      </w:pPr>
+      <w:r>
+        <w:rPr>
+          <w:rFonts w:ascii="Consolas" w:hAnsi="Consolas" w:eastAsia="宋体"/>
+          <w:b w:val="0"/>
+          <w:i w:val="0"/>
+          <w:sz w:val="18"/>
+        </w:rPr>
+        <w:t xml:space="preserve"> </w:t>
+      </w:r>
+    </w:p>
+    <w:p>
+      <w:pPr>
+        <w:spacing w:before="0" w:after="0" w:line="240" w:lineRule="auto"/>
+        <w:ind w:left="227"/>
+        <w:shd w:val="clear" w:fill="F2F2F2"/>
+      </w:pPr>
+      <w:r>
+        <w:rPr>
+          <w:rFonts w:ascii="Consolas" w:hAnsi="Consolas" w:eastAsia="宋体"/>
+          <w:b w:val="0"/>
+          <w:i w:val="0"/>
+          <w:sz w:val="18"/>
+        </w:rPr>
+        <w:t>assign {cout, sum} = a + b + cin;</w:t>
+      </w:r>
+    </w:p>
+    <w:p>
+      <w:pPr>
+        <w:spacing w:before="0" w:after="0" w:line="240" w:lineRule="auto"/>
+        <w:ind w:left="227"/>
+        <w:shd w:val="clear" w:fill="F2F2F2"/>
+      </w:pPr>
+      <w:r>
+        <w:rPr>
+          <w:rFonts w:ascii="Consolas" w:hAnsi="Consolas" w:eastAsia="宋体"/>
+          <w:b w:val="0"/>
+          <w:i w:val="0"/>
+          <w:sz w:val="18"/>
+        </w:rPr>
+        <w:t xml:space="preserve"> </w:t>
+      </w:r>
+    </w:p>
+    <w:p>
+      <w:pPr>
+        <w:spacing w:before="0" w:after="120" w:line="240" w:lineRule="auto"/>
+        <w:ind w:left="227"/>
+        <w:shd w:val="clear" w:fill="F2F2F2"/>
+      </w:pPr>
+      <w:r>
+        <w:rPr>
+          <w:rFonts w:ascii="Consolas" w:hAnsi="Consolas" w:eastAsia="宋体"/>
+          <w:b w:val="0"/>
+          <w:i w:val="0"/>
+          <w:sz w:val="18"/>
+        </w:rPr>
+        <w:t>endmodule</w:t>
+      </w:r>
+    </w:p>
+    <w:p>
+      <w:pPr>
+        <w:spacing w:line="360" w:lineRule="auto" w:after="60"/>
+        <w:ind w:firstLine="420"/>
+      </w:pPr>
       <w:r>
         <w:rPr>
           <w:rFonts w:ascii="Consolas" w:hAnsi="Consolas" w:eastAsia="宋体"/>
@@ -2465,26 +2657,7 @@
           <w:i w:val="0"/>
           <w:sz w:val="21"/>
         </w:rPr>
-        <w:t xml:space="preserve">（激励 + </w:t>
-      </w:r>
-      <w:r>
-        <w:rPr>
-          <w:rFonts w:ascii="Consolas" w:hAnsi="Consolas" w:eastAsia="宋体"/>
-          <w:b w:val="0"/>
-          <w:i w:val="0"/>
-          <w:color w:val="B03030"/>
-          <w:sz w:val="19"/>
-        </w:rPr>
-        <w:t>$dumpfile</w:t>
-      </w:r>
-      <w:r>
-        <w:rPr>
-          <w:rFonts w:ascii="Times New Roman" w:hAnsi="Times New Roman" w:eastAsia="宋体"/>
-          <w:b w:val="0"/>
-          <w:i w:val="0"/>
-          <w:sz w:val="21"/>
-        </w:rPr>
-        <w:t>），在工程目录执行：</w:t>
+        <w:t>（激励，完整内容；含波形输出）：</w:t>
       </w:r>
     </w:p>
     <w:p>
@@ -2500,39 +2673,375 @@
           <w:i w:val="0"/>
           <w:sz w:val="18"/>
         </w:rPr>
-        <w:t>iverilog -g2005 -o simv rtl/adder4.v tb/tb_adder4.v    # 第 1 步：编译</w:t>
-      </w:r>
-    </w:p>
-    <w:p>
-      <w:pPr>
-        <w:spacing w:before="0" w:after="0" w:line="240" w:lineRule="auto"/>
-        <w:ind w:left="227"/>
-        <w:shd w:val="clear" w:fill="F2F2F2"/>
-      </w:pPr>
-      <w:r>
-        <w:rPr>
-          <w:rFonts w:ascii="Consolas" w:hAnsi="Consolas" w:eastAsia="宋体"/>
-          <w:b w:val="0"/>
-          <w:i w:val="0"/>
-          <w:sz w:val="18"/>
-        </w:rPr>
-        <w:t>vvp simv                                                # 第 2 步：仿真</w:t>
-      </w:r>
-    </w:p>
-    <w:p>
-      <w:pPr>
-        <w:spacing w:before="0" w:after="0" w:line="240" w:lineRule="auto"/>
-        <w:ind w:left="227"/>
-        <w:shd w:val="clear" w:fill="F2F2F2"/>
-      </w:pPr>
-      <w:r>
-        <w:rPr>
-          <w:rFonts w:ascii="Consolas" w:hAnsi="Consolas" w:eastAsia="宋体"/>
-          <w:b w:val="0"/>
-          <w:i w:val="0"/>
-          <w:sz w:val="18"/>
-        </w:rPr>
-        <w:t>gtkwave wave.vcd                                        # 第 3 步：波形</w:t>
+        <w:t>`timescale 1ns/1ps</w:t>
+      </w:r>
+    </w:p>
+    <w:p>
+      <w:pPr>
+        <w:spacing w:before="0" w:after="0" w:line="240" w:lineRule="auto"/>
+        <w:ind w:left="227"/>
+        <w:shd w:val="clear" w:fill="F2F2F2"/>
+      </w:pPr>
+      <w:r>
+        <w:rPr>
+          <w:rFonts w:ascii="Consolas" w:hAnsi="Consolas" w:eastAsia="宋体"/>
+          <w:b w:val="0"/>
+          <w:i w:val="0"/>
+          <w:sz w:val="18"/>
+        </w:rPr>
+        <w:t>module tb_adder4;</w:t>
+      </w:r>
+    </w:p>
+    <w:p>
+      <w:pPr>
+        <w:spacing w:before="0" w:after="0" w:line="240" w:lineRule="auto"/>
+        <w:ind w:left="227"/>
+        <w:shd w:val="clear" w:fill="F2F2F2"/>
+      </w:pPr>
+      <w:r>
+        <w:rPr>
+          <w:rFonts w:ascii="Consolas" w:hAnsi="Consolas" w:eastAsia="宋体"/>
+          <w:b w:val="0"/>
+          <w:i w:val="0"/>
+          <w:sz w:val="18"/>
+        </w:rPr>
+        <w:t>reg  [3:0] a;  reg [3:0] b;  reg cin;</w:t>
+      </w:r>
+    </w:p>
+    <w:p>
+      <w:pPr>
+        <w:spacing w:before="0" w:after="0" w:line="240" w:lineRule="auto"/>
+        <w:ind w:left="227"/>
+        <w:shd w:val="clear" w:fill="F2F2F2"/>
+      </w:pPr>
+      <w:r>
+        <w:rPr>
+          <w:rFonts w:ascii="Consolas" w:hAnsi="Consolas" w:eastAsia="宋体"/>
+          <w:b w:val="0"/>
+          <w:i w:val="0"/>
+          <w:sz w:val="18"/>
+        </w:rPr>
+        <w:t>wire [3:0] sum;  wire cout;</w:t>
+      </w:r>
+    </w:p>
+    <w:p>
+      <w:pPr>
+        <w:spacing w:before="0" w:after="0" w:line="240" w:lineRule="auto"/>
+        <w:ind w:left="227"/>
+        <w:shd w:val="clear" w:fill="F2F2F2"/>
+      </w:pPr>
+      <w:r>
+        <w:rPr>
+          <w:rFonts w:ascii="Consolas" w:hAnsi="Consolas" w:eastAsia="宋体"/>
+          <w:b w:val="0"/>
+          <w:i w:val="0"/>
+          <w:sz w:val="18"/>
+        </w:rPr>
+        <w:t xml:space="preserve"> </w:t>
+      </w:r>
+    </w:p>
+    <w:p>
+      <w:pPr>
+        <w:spacing w:before="0" w:after="0" w:line="240" w:lineRule="auto"/>
+        <w:ind w:left="227"/>
+        <w:shd w:val="clear" w:fill="F2F2F2"/>
+      </w:pPr>
+      <w:r>
+        <w:rPr>
+          <w:rFonts w:ascii="Consolas" w:hAnsi="Consolas" w:eastAsia="宋体"/>
+          <w:b w:val="0"/>
+          <w:i w:val="0"/>
+          <w:sz w:val="18"/>
+        </w:rPr>
+        <w:t>adder4 u_adder4 (.a(a), .b(b), .cin(cin), .sum(sum), .cout(cout));</w:t>
+      </w:r>
+    </w:p>
+    <w:p>
+      <w:pPr>
+        <w:spacing w:before="0" w:after="0" w:line="240" w:lineRule="auto"/>
+        <w:ind w:left="227"/>
+        <w:shd w:val="clear" w:fill="F2F2F2"/>
+      </w:pPr>
+      <w:r>
+        <w:rPr>
+          <w:rFonts w:ascii="Consolas" w:hAnsi="Consolas" w:eastAsia="宋体"/>
+          <w:b w:val="0"/>
+          <w:i w:val="0"/>
+          <w:sz w:val="18"/>
+        </w:rPr>
+        <w:t xml:space="preserve"> </w:t>
+      </w:r>
+    </w:p>
+    <w:p>
+      <w:pPr>
+        <w:spacing w:before="0" w:after="0" w:line="240" w:lineRule="auto"/>
+        <w:ind w:left="227"/>
+        <w:shd w:val="clear" w:fill="F2F2F2"/>
+      </w:pPr>
+      <w:r>
+        <w:rPr>
+          <w:rFonts w:ascii="Consolas" w:hAnsi="Consolas" w:eastAsia="宋体"/>
+          <w:b w:val="0"/>
+          <w:i w:val="0"/>
+          <w:sz w:val="18"/>
+        </w:rPr>
+        <w:t>initial begin</w:t>
+      </w:r>
+    </w:p>
+    <w:p>
+      <w:pPr>
+        <w:spacing w:before="0" w:after="0" w:line="240" w:lineRule="auto"/>
+        <w:ind w:left="227"/>
+        <w:shd w:val="clear" w:fill="F2F2F2"/>
+      </w:pPr>
+      <w:r>
+        <w:rPr>
+          <w:rFonts w:ascii="Consolas" w:hAnsi="Consolas" w:eastAsia="宋体"/>
+          <w:b w:val="0"/>
+          <w:i w:val="0"/>
+          <w:sz w:val="18"/>
+        </w:rPr>
+        <w:t xml:space="preserve">    $dumpfile("wave.vcd");</w:t>
+      </w:r>
+    </w:p>
+    <w:p>
+      <w:pPr>
+        <w:spacing w:before="0" w:after="0" w:line="240" w:lineRule="auto"/>
+        <w:ind w:left="227"/>
+        <w:shd w:val="clear" w:fill="F2F2F2"/>
+      </w:pPr>
+      <w:r>
+        <w:rPr>
+          <w:rFonts w:ascii="Consolas" w:hAnsi="Consolas" w:eastAsia="宋体"/>
+          <w:b w:val="0"/>
+          <w:i w:val="0"/>
+          <w:sz w:val="18"/>
+        </w:rPr>
+        <w:t xml:space="preserve">    $dumpvars(0, tb_adder4);</w:t>
+      </w:r>
+    </w:p>
+    <w:p>
+      <w:pPr>
+        <w:spacing w:before="0" w:after="0" w:line="240" w:lineRule="auto"/>
+        <w:ind w:left="227"/>
+        <w:shd w:val="clear" w:fill="F2F2F2"/>
+      </w:pPr>
+      <w:r>
+        <w:rPr>
+          <w:rFonts w:ascii="Consolas" w:hAnsi="Consolas" w:eastAsia="宋体"/>
+          <w:b w:val="0"/>
+          <w:i w:val="0"/>
+          <w:sz w:val="18"/>
+        </w:rPr>
+        <w:t>end</w:t>
+      </w:r>
+    </w:p>
+    <w:p>
+      <w:pPr>
+        <w:spacing w:before="0" w:after="0" w:line="240" w:lineRule="auto"/>
+        <w:ind w:left="227"/>
+        <w:shd w:val="clear" w:fill="F2F2F2"/>
+      </w:pPr>
+      <w:r>
+        <w:rPr>
+          <w:rFonts w:ascii="Consolas" w:hAnsi="Consolas" w:eastAsia="宋体"/>
+          <w:b w:val="0"/>
+          <w:i w:val="0"/>
+          <w:sz w:val="18"/>
+        </w:rPr>
+        <w:t xml:space="preserve"> </w:t>
+      </w:r>
+    </w:p>
+    <w:p>
+      <w:pPr>
+        <w:spacing w:before="0" w:after="0" w:line="240" w:lineRule="auto"/>
+        <w:ind w:left="227"/>
+        <w:shd w:val="clear" w:fill="F2F2F2"/>
+      </w:pPr>
+      <w:r>
+        <w:rPr>
+          <w:rFonts w:ascii="Consolas" w:hAnsi="Consolas" w:eastAsia="宋体"/>
+          <w:b w:val="0"/>
+          <w:i w:val="0"/>
+          <w:sz w:val="18"/>
+        </w:rPr>
+        <w:t>initial begin</w:t>
+      </w:r>
+    </w:p>
+    <w:p>
+      <w:pPr>
+        <w:spacing w:before="0" w:after="0" w:line="240" w:lineRule="auto"/>
+        <w:ind w:left="227"/>
+        <w:shd w:val="clear" w:fill="F2F2F2"/>
+      </w:pPr>
+      <w:r>
+        <w:rPr>
+          <w:rFonts w:ascii="Consolas" w:hAnsi="Consolas" w:eastAsia="宋体"/>
+          <w:b w:val="0"/>
+          <w:i w:val="0"/>
+          <w:sz w:val="18"/>
+        </w:rPr>
+        <w:t xml:space="preserve">    a = 4'd0;  b = 4'd0;  cin = 1'b0;</w:t>
+      </w:r>
+    </w:p>
+    <w:p>
+      <w:pPr>
+        <w:spacing w:before="0" w:after="0" w:line="240" w:lineRule="auto"/>
+        <w:ind w:left="227"/>
+        <w:shd w:val="clear" w:fill="F2F2F2"/>
+      </w:pPr>
+      <w:r>
+        <w:rPr>
+          <w:rFonts w:ascii="Consolas" w:hAnsi="Consolas" w:eastAsia="宋体"/>
+          <w:b w:val="0"/>
+          <w:i w:val="0"/>
+          <w:sz w:val="18"/>
+        </w:rPr>
+        <w:t xml:space="preserve">    #10;</w:t>
+      </w:r>
+    </w:p>
+    <w:p>
+      <w:pPr>
+        <w:spacing w:before="0" w:after="0" w:line="240" w:lineRule="auto"/>
+        <w:ind w:left="227"/>
+        <w:shd w:val="clear" w:fill="F2F2F2"/>
+      </w:pPr>
+      <w:r>
+        <w:rPr>
+          <w:rFonts w:ascii="Consolas" w:hAnsi="Consolas" w:eastAsia="宋体"/>
+          <w:b w:val="0"/>
+          <w:i w:val="0"/>
+          <w:sz w:val="18"/>
+        </w:rPr>
+        <w:t xml:space="preserve">    a = 4'd3;  b = 4'd5;              // 预期 sum=8,  cout=0</w:t>
+      </w:r>
+    </w:p>
+    <w:p>
+      <w:pPr>
+        <w:spacing w:before="0" w:after="0" w:line="240" w:lineRule="auto"/>
+        <w:ind w:left="227"/>
+        <w:shd w:val="clear" w:fill="F2F2F2"/>
+      </w:pPr>
+      <w:r>
+        <w:rPr>
+          <w:rFonts w:ascii="Consolas" w:hAnsi="Consolas" w:eastAsia="宋体"/>
+          <w:b w:val="0"/>
+          <w:i w:val="0"/>
+          <w:sz w:val="18"/>
+        </w:rPr>
+        <w:t xml:space="preserve">    #10;</w:t>
+      </w:r>
+    </w:p>
+    <w:p>
+      <w:pPr>
+        <w:spacing w:before="0" w:after="0" w:line="240" w:lineRule="auto"/>
+        <w:ind w:left="227"/>
+        <w:shd w:val="clear" w:fill="F2F2F2"/>
+      </w:pPr>
+      <w:r>
+        <w:rPr>
+          <w:rFonts w:ascii="Consolas" w:hAnsi="Consolas" w:eastAsia="宋体"/>
+          <w:b w:val="0"/>
+          <w:i w:val="0"/>
+          <w:sz w:val="18"/>
+        </w:rPr>
+        <w:t xml:space="preserve">    a = 4'd15; b = 4'd1;              // 预期 sum=0,  cout=1</w:t>
+      </w:r>
+    </w:p>
+    <w:p>
+      <w:pPr>
+        <w:spacing w:before="0" w:after="0" w:line="240" w:lineRule="auto"/>
+        <w:ind w:left="227"/>
+        <w:shd w:val="clear" w:fill="F2F2F2"/>
+      </w:pPr>
+      <w:r>
+        <w:rPr>
+          <w:rFonts w:ascii="Consolas" w:hAnsi="Consolas" w:eastAsia="宋体"/>
+          <w:b w:val="0"/>
+          <w:i w:val="0"/>
+          <w:sz w:val="18"/>
+        </w:rPr>
+        <w:t xml:space="preserve">    #10;</w:t>
+      </w:r>
+    </w:p>
+    <w:p>
+      <w:pPr>
+        <w:spacing w:before="0" w:after="0" w:line="240" w:lineRule="auto"/>
+        <w:ind w:left="227"/>
+        <w:shd w:val="clear" w:fill="F2F2F2"/>
+      </w:pPr>
+      <w:r>
+        <w:rPr>
+          <w:rFonts w:ascii="Consolas" w:hAnsi="Consolas" w:eastAsia="宋体"/>
+          <w:b w:val="0"/>
+          <w:i w:val="0"/>
+          <w:sz w:val="18"/>
+        </w:rPr>
+        <w:t xml:space="preserve">    a = 4'd12; b = 4'd7;  cin = 1'b1; // 预期 sum=4,  cout=1</w:t>
+      </w:r>
+    </w:p>
+    <w:p>
+      <w:pPr>
+        <w:spacing w:before="0" w:after="0" w:line="240" w:lineRule="auto"/>
+        <w:ind w:left="227"/>
+        <w:shd w:val="clear" w:fill="F2F2F2"/>
+      </w:pPr>
+      <w:r>
+        <w:rPr>
+          <w:rFonts w:ascii="Consolas" w:hAnsi="Consolas" w:eastAsia="宋体"/>
+          <w:b w:val="0"/>
+          <w:i w:val="0"/>
+          <w:sz w:val="18"/>
+        </w:rPr>
+        <w:t xml:space="preserve">    #10;</w:t>
+      </w:r>
+    </w:p>
+    <w:p>
+      <w:pPr>
+        <w:spacing w:before="0" w:after="0" w:line="240" w:lineRule="auto"/>
+        <w:ind w:left="227"/>
+        <w:shd w:val="clear" w:fill="F2F2F2"/>
+      </w:pPr>
+      <w:r>
+        <w:rPr>
+          <w:rFonts w:ascii="Consolas" w:hAnsi="Consolas" w:eastAsia="宋体"/>
+          <w:b w:val="0"/>
+          <w:i w:val="0"/>
+          <w:sz w:val="18"/>
+        </w:rPr>
+        <w:t xml:space="preserve">    $display("Simulation finished, check waveform.");</w:t>
+      </w:r>
+    </w:p>
+    <w:p>
+      <w:pPr>
+        <w:spacing w:before="0" w:after="0" w:line="240" w:lineRule="auto"/>
+        <w:ind w:left="227"/>
+        <w:shd w:val="clear" w:fill="F2F2F2"/>
+      </w:pPr>
+      <w:r>
+        <w:rPr>
+          <w:rFonts w:ascii="Consolas" w:hAnsi="Consolas" w:eastAsia="宋体"/>
+          <w:b w:val="0"/>
+          <w:i w:val="0"/>
+          <w:sz w:val="18"/>
+        </w:rPr>
+        <w:t xml:space="preserve">    $finish;</w:t>
+      </w:r>
+    </w:p>
+    <w:p>
+      <w:pPr>
+        <w:spacing w:before="0" w:after="0" w:line="240" w:lineRule="auto"/>
+        <w:ind w:left="227"/>
+        <w:shd w:val="clear" w:fill="F2F2F2"/>
+      </w:pPr>
+      <w:r>
+        <w:rPr>
+          <w:rFonts w:ascii="Consolas" w:hAnsi="Consolas" w:eastAsia="宋体"/>
+          <w:b w:val="0"/>
+          <w:i w:val="0"/>
+          <w:sz w:val="18"/>
+        </w:rPr>
+        <w:t>end</w:t>
       </w:r>
     </w:p>
     <w:p>
@@ -2548,7 +3057,7 @@
           <w:i w:val="0"/>
           <w:sz w:val="18"/>
         </w:rPr>
-        <w:t>yosys -p "read_verilog rtl/adder4.v; synth; stat"       # 第 4 步：综合</w:t>
+        <w:t>endmodule</w:t>
       </w:r>
     </w:p>
     <w:p>
@@ -2559,6 +3068,85 @@
       <w:r>
         <w:rPr>
           <w:rFonts w:ascii="Times New Roman" w:hAnsi="Times New Roman" w:eastAsia="宋体"/>
+          <w:b w:val="0"/>
+          <w:i w:val="0"/>
+          <w:sz w:val="21"/>
+        </w:rPr>
+        <w:t>在工程目录执行：</w:t>
+      </w:r>
+    </w:p>
+    <w:p>
+      <w:pPr>
+        <w:spacing w:before="120" w:after="0" w:line="240" w:lineRule="auto"/>
+        <w:ind w:left="227"/>
+        <w:shd w:val="clear" w:fill="F2F2F2"/>
+      </w:pPr>
+      <w:r>
+        <w:rPr>
+          <w:rFonts w:ascii="Consolas" w:hAnsi="Consolas" w:eastAsia="宋体"/>
+          <w:b w:val="0"/>
+          <w:i w:val="0"/>
+          <w:sz w:val="18"/>
+        </w:rPr>
+        <w:t>iverilog -g2005 -o simv rtl/adder4.v tb/tb_adder4.v    # 第 1 步：编译</w:t>
+      </w:r>
+    </w:p>
+    <w:p>
+      <w:pPr>
+        <w:spacing w:before="0" w:after="0" w:line="240" w:lineRule="auto"/>
+        <w:ind w:left="227"/>
+        <w:shd w:val="clear" w:fill="F2F2F2"/>
+      </w:pPr>
+      <w:r>
+        <w:rPr>
+          <w:rFonts w:ascii="Consolas" w:hAnsi="Consolas" w:eastAsia="宋体"/>
+          <w:b w:val="0"/>
+          <w:i w:val="0"/>
+          <w:sz w:val="18"/>
+        </w:rPr>
+        <w:t>vvp simv                                                # 第 2 步：仿真</w:t>
+      </w:r>
+    </w:p>
+    <w:p>
+      <w:pPr>
+        <w:spacing w:before="0" w:after="0" w:line="240" w:lineRule="auto"/>
+        <w:ind w:left="227"/>
+        <w:shd w:val="clear" w:fill="F2F2F2"/>
+      </w:pPr>
+      <w:r>
+        <w:rPr>
+          <w:rFonts w:ascii="Consolas" w:hAnsi="Consolas" w:eastAsia="宋体"/>
+          <w:b w:val="0"/>
+          <w:i w:val="0"/>
+          <w:sz w:val="18"/>
+        </w:rPr>
+        <w:t>gtkwave wave.vcd                                        # 第 3 步：波形</w:t>
+      </w:r>
+    </w:p>
+    <w:p>
+      <w:pPr>
+        <w:spacing w:before="0" w:after="120" w:line="240" w:lineRule="auto"/>
+        <w:ind w:left="227"/>
+        <w:shd w:val="clear" w:fill="F2F2F2"/>
+      </w:pPr>
+      <w:r>
+        <w:rPr>
+          <w:rFonts w:ascii="Consolas" w:hAnsi="Consolas" w:eastAsia="宋体"/>
+          <w:b w:val="0"/>
+          <w:i w:val="0"/>
+          <w:sz w:val="18"/>
+        </w:rPr>
+        <w:t>yosys -p "read_verilog rtl/adder4.v; synth; stat"       # 第 4 步：综合</w:t>
+      </w:r>
+    </w:p>
+    <w:p>
+      <w:pPr>
+        <w:spacing w:line="360" w:lineRule="auto" w:after="60"/>
+        <w:ind w:firstLine="420"/>
+      </w:pPr>
+      <w:r>
+        <w:rPr>
+          <w:rFonts w:ascii="Times New Roman" w:hAnsi="Times New Roman" w:eastAsia="宋体"/>
           <w:b/>
           <w:i w:val="0"/>
           <w:sz w:val="21"/>
@@ -2634,7 +3222,7 @@
           <w:i w:val="0"/>
           <w:sz w:val="18"/>
         </w:rPr>
-        <w:t>Simulation finished check waveform.</w:t>
+        <w:t>Simulation finished, check waveform.</w:t>
       </w:r>
     </w:p>
     <w:p>

</xml_diff>